<commit_message>
Added function enabling program to show fractions when percentages too long
</commit_message>
<xml_diff>
--- a/docassemble/TODI/data/templates/todi_docassemble.docx
+++ b/docassemble/TODI/data/templates/todi_docassemble.docx
@@ -188,21 +188,8 @@
             <w:r>
               <w:t>{{users[0].</w:t>
             </w:r>
-            <w:proofErr w:type="spellStart"/>
-            <w:r>
-              <w:t>name_</w:t>
-            </w:r>
-            <w:proofErr w:type="gramStart"/>
-            <w:r>
-              <w:t>full</w:t>
-            </w:r>
-            <w:proofErr w:type="spellEnd"/>
-            <w:r>
-              <w:t>(</w:t>
-            </w:r>
-            <w:proofErr w:type="gramEnd"/>
-            <w:r>
-              <w:t>)</w:t>
+            <w:r>
+              <w:t>name_full()</w:t>
             </w:r>
             <w:r>
               <w:t>}}</w:t>
@@ -244,23 +231,7 @@
           </w:tcPr>
           <w:p>
             <w:r>
-              <w:t>{{users[0</w:t>
-            </w:r>
-            <w:proofErr w:type="gramStart"/>
-            <w:r>
-              <w:t>].</w:t>
-            </w:r>
-            <w:proofErr w:type="spellStart"/>
-            <w:r>
-              <w:t>address</w:t>
-            </w:r>
-            <w:proofErr w:type="gramEnd"/>
-            <w:r>
-              <w:t>.line_one</w:t>
-            </w:r>
-            <w:proofErr w:type="spellEnd"/>
-            <w:r>
-              <w:t>(bare=True)}}</w:t>
+              <w:t>{{users[0].address.line_one(bare=True)}}</w:t>
             </w:r>
           </w:p>
         </w:tc>
@@ -297,31 +268,7 @@
           </w:tcPr>
           <w:p>
             <w:r>
-              <w:t>{{users[0</w:t>
-            </w:r>
-            <w:proofErr w:type="gramStart"/>
-            <w:r>
-              <w:t>].</w:t>
-            </w:r>
-            <w:proofErr w:type="spellStart"/>
-            <w:r>
-              <w:t>address</w:t>
-            </w:r>
-            <w:proofErr w:type="gramEnd"/>
-            <w:r>
-              <w:t>.line_</w:t>
-            </w:r>
-            <w:proofErr w:type="gramStart"/>
-            <w:r>
-              <w:t>two</w:t>
-            </w:r>
-            <w:proofErr w:type="spellEnd"/>
-            <w:r>
-              <w:t>(</w:t>
-            </w:r>
-            <w:proofErr w:type="gramEnd"/>
-            <w:r>
-              <w:t>)}}</w:t>
+              <w:t>{{users[0].address.line_two()}}</w:t>
             </w:r>
           </w:p>
         </w:tc>
@@ -405,109 +352,49 @@
               <w:rPr>
                 <w:bCs/>
               </w:rPr>
-              <w:t xml:space="preserve">{% if </w:t>
-            </w:r>
-            <w:proofErr w:type="spellStart"/>
+              <w:t>{% if joint_language == True %}</w:t>
+            </w:r>
             <w:r>
               <w:rPr>
                 <w:bCs/>
               </w:rPr>
-              <w:t>joint_language</w:t>
-            </w:r>
-            <w:proofErr w:type="spellEnd"/>
+              <w:t>{{</w:t>
+            </w:r>
             <w:r>
               <w:rPr>
                 <w:bCs/>
               </w:rPr>
-              <w:t xml:space="preserve"> == True </w:t>
-            </w:r>
-            <w:proofErr w:type="gramStart"/>
+              <w:t>joint_owner</w:t>
+            </w:r>
             <w:r>
               <w:rPr>
                 <w:bCs/>
               </w:rPr>
-              <w:t>%}</w:t>
+              <w:t>.</w:t>
             </w:r>
             <w:r>
               <w:rPr>
                 <w:bCs/>
               </w:rPr>
-              <w:t>{</w:t>
-            </w:r>
-            <w:proofErr w:type="gramEnd"/>
+              <w:t xml:space="preserve"> </w:t>
+            </w:r>
             <w:r>
               <w:rPr>
                 <w:bCs/>
               </w:rPr>
-              <w:t>{</w:t>
-            </w:r>
-            <w:proofErr w:type="spellStart"/>
+              <w:t>name_full()</w:t>
+            </w:r>
             <w:r>
               <w:rPr>
                 <w:bCs/>
               </w:rPr>
-              <w:t>joint_owner</w:t>
-            </w:r>
-            <w:proofErr w:type="spellEnd"/>
+              <w:t>}}</w:t>
+            </w:r>
             <w:r>
               <w:rPr>
                 <w:bCs/>
               </w:rPr>
-              <w:t>.</w:t>
-            </w:r>
-            <w:r>
-              <w:rPr>
-                <w:bCs/>
-              </w:rPr>
-              <w:t xml:space="preserve"> </w:t>
-            </w:r>
-            <w:proofErr w:type="spellStart"/>
-            <w:r>
-              <w:rPr>
-                <w:bCs/>
-              </w:rPr>
-              <w:t>name_</w:t>
-            </w:r>
-            <w:proofErr w:type="gramStart"/>
-            <w:r>
-              <w:rPr>
-                <w:bCs/>
-              </w:rPr>
-              <w:t>full</w:t>
-            </w:r>
-            <w:proofErr w:type="spellEnd"/>
-            <w:r>
-              <w:rPr>
-                <w:bCs/>
-              </w:rPr>
-              <w:t>(</w:t>
-            </w:r>
-            <w:proofErr w:type="gramEnd"/>
-            <w:r>
-              <w:rPr>
-                <w:bCs/>
-              </w:rPr>
-              <w:t>)</w:t>
-            </w:r>
-            <w:proofErr w:type="gramStart"/>
-            <w:r>
-              <w:rPr>
-                <w:bCs/>
-              </w:rPr>
-              <w:t>}}</w:t>
-            </w:r>
-            <w:r>
-              <w:rPr>
-                <w:bCs/>
-              </w:rPr>
-              <w:t>{</w:t>
-            </w:r>
-            <w:proofErr w:type="gramEnd"/>
-            <w:r>
-              <w:rPr>
-                <w:bCs/>
-              </w:rPr>
-              <w:t>% endif %}</w:t>
+              <w:t>{% endif %}</w:t>
             </w:r>
           </w:p>
         </w:tc>
@@ -554,119 +441,61 @@
               <w:rPr>
                 <w:bCs/>
               </w:rPr>
-              <w:t xml:space="preserve">{% if </w:t>
-            </w:r>
-            <w:proofErr w:type="spellStart"/>
+              <w:t>{% if joint_language == True %}</w:t>
+            </w:r>
             <w:r>
               <w:rPr>
                 <w:bCs/>
               </w:rPr>
-              <w:t>joint_language</w:t>
-            </w:r>
-            <w:proofErr w:type="spellEnd"/>
+              <w:t>{{</w:t>
+            </w:r>
             <w:r>
               <w:rPr>
                 <w:bCs/>
               </w:rPr>
-              <w:t xml:space="preserve"> == True </w:t>
-            </w:r>
-            <w:proofErr w:type="gramStart"/>
+              <w:t>joint_owner</w:t>
+            </w:r>
             <w:r>
               <w:rPr>
                 <w:bCs/>
               </w:rPr>
-              <w:t>%}</w:t>
+              <w:t>.</w:t>
             </w:r>
             <w:r>
               <w:rPr>
                 <w:bCs/>
               </w:rPr>
-              <w:t>{</w:t>
-            </w:r>
-            <w:proofErr w:type="gramEnd"/>
+              <w:t>address.line_</w:t>
+            </w:r>
             <w:r>
               <w:rPr>
                 <w:bCs/>
               </w:rPr>
-              <w:t>{</w:t>
-            </w:r>
-            <w:proofErr w:type="spellStart"/>
+              <w:t>one</w:t>
+            </w:r>
             <w:r>
               <w:rPr>
                 <w:bCs/>
               </w:rPr>
-              <w:t>joint_</w:t>
-            </w:r>
-            <w:proofErr w:type="gramStart"/>
+              <w:t>(</w:t>
+            </w:r>
             <w:r>
               <w:rPr>
                 <w:bCs/>
               </w:rPr>
-              <w:t>owner</w:t>
+              <w:t>bare=True</w:t>
             </w:r>
             <w:r>
               <w:rPr>
                 <w:bCs/>
               </w:rPr>
-              <w:t>.</w:t>
+              <w:t>)}}</w:t>
             </w:r>
             <w:r>
               <w:rPr>
                 <w:bCs/>
               </w:rPr>
-              <w:t>address</w:t>
-            </w:r>
-            <w:proofErr w:type="gramEnd"/>
-            <w:r>
-              <w:rPr>
-                <w:bCs/>
-              </w:rPr>
-              <w:t>.line_</w:t>
-            </w:r>
-            <w:r>
-              <w:rPr>
-                <w:bCs/>
-              </w:rPr>
-              <w:t>one</w:t>
-            </w:r>
-            <w:proofErr w:type="spellEnd"/>
-            <w:r>
-              <w:rPr>
-                <w:bCs/>
-              </w:rPr>
-              <w:t>(</w:t>
-            </w:r>
-            <w:r>
-              <w:rPr>
-                <w:bCs/>
-              </w:rPr>
-              <w:t>bare=True</w:t>
-            </w:r>
-            <w:r>
-              <w:rPr>
-                <w:bCs/>
-              </w:rPr>
-              <w:t>)</w:t>
-            </w:r>
-            <w:proofErr w:type="gramStart"/>
-            <w:r>
-              <w:rPr>
-                <w:bCs/>
-              </w:rPr>
-              <w:t>}}</w:t>
-            </w:r>
-            <w:r>
-              <w:rPr>
-                <w:bCs/>
-              </w:rPr>
-              <w:t>{</w:t>
-            </w:r>
-            <w:proofErr w:type="gramEnd"/>
-            <w:r>
-              <w:rPr>
-                <w:bCs/>
-              </w:rPr>
-              <w:t>% endif %}</w:t>
+              <w:t>{% endif %}</w:t>
             </w:r>
           </w:p>
         </w:tc>
@@ -706,73 +535,19 @@
               <w:rPr>
                 <w:bCs/>
               </w:rPr>
-              <w:t xml:space="preserve">{% if </w:t>
-            </w:r>
-            <w:proofErr w:type="spellStart"/>
-            <w:r>
-              <w:rPr>
-                <w:bCs/>
-              </w:rPr>
-              <w:t>joint_language</w:t>
-            </w:r>
-            <w:proofErr w:type="spellEnd"/>
-            <w:r>
-              <w:rPr>
-                <w:bCs/>
-              </w:rPr>
-              <w:t xml:space="preserve"> == True </w:t>
-            </w:r>
-            <w:proofErr w:type="gramStart"/>
-            <w:r>
-              <w:rPr>
-                <w:bCs/>
-              </w:rPr>
-              <w:t>%}</w:t>
-            </w:r>
-            <w:r>
-              <w:t>{</w:t>
-            </w:r>
-            <w:proofErr w:type="gramEnd"/>
-            <w:r>
-              <w:t>{</w:t>
-            </w:r>
-            <w:proofErr w:type="spellStart"/>
-            <w:r>
-              <w:t>joint_</w:t>
-            </w:r>
-            <w:proofErr w:type="gramStart"/>
-            <w:r>
-              <w:t>owner</w:t>
-            </w:r>
-            <w:r>
-              <w:t>.address</w:t>
-            </w:r>
-            <w:proofErr w:type="gramEnd"/>
-            <w:r>
-              <w:t>.line_</w:t>
-            </w:r>
-            <w:proofErr w:type="gramStart"/>
-            <w:r>
-              <w:t>two</w:t>
-            </w:r>
-            <w:proofErr w:type="spellEnd"/>
-            <w:r>
-              <w:t>(</w:t>
-            </w:r>
-            <w:proofErr w:type="gramEnd"/>
-            <w:r>
-              <w:t>)</w:t>
-            </w:r>
-            <w:proofErr w:type="gramStart"/>
-            <w:r>
-              <w:t>}}</w:t>
-            </w:r>
-            <w:r>
-              <w:t>{</w:t>
-            </w:r>
-            <w:proofErr w:type="gramEnd"/>
-            <w:r>
-              <w:t>% endif %}</w:t>
+              <w:t>{% if joint_language == True %}</w:t>
+            </w:r>
+            <w:r>
+              <w:t>{{</w:t>
+            </w:r>
+            <w:r>
+              <w:t>joint_owner</w:t>
+            </w:r>
+            <w:r>
+              <w:t>.address.line_two()}}</w:t>
+            </w:r>
+            <w:r>
+              <w:t>{% endif %}</w:t>
             </w:r>
           </w:p>
         </w:tc>
@@ -866,13 +641,8 @@
       <w:r>
         <w:t xml:space="preserve"> {{users[0].</w:t>
       </w:r>
-      <w:proofErr w:type="spellStart"/>
-      <w:r>
-        <w:t>name_full</w:t>
-      </w:r>
-      <w:proofErr w:type="spellEnd"/>
-      <w:r>
-        <w:t>()</w:t>
+      <w:r>
+        <w:t>name_full()</w:t>
       </w:r>
       <w:r>
         <w:t>}</w:t>
@@ -884,36 +654,11 @@
         <w:t xml:space="preserve"> </w:t>
       </w:r>
       <w:r>
-        <w:t>({{users[0].</w:t>
-      </w:r>
-      <w:proofErr w:type="spellStart"/>
-      <w:r>
-        <w:t>marital_status</w:t>
-      </w:r>
-      <w:proofErr w:type="spellEnd"/>
-      <w:r>
-        <w:t>}}), residing at {{users[0].</w:t>
-      </w:r>
-      <w:proofErr w:type="spellStart"/>
-      <w:r>
-        <w:t>address.on_one_line</w:t>
-      </w:r>
-      <w:proofErr w:type="spellEnd"/>
-      <w:r>
-        <w:t>(bare=True)}},</w:t>
-      </w:r>
-      <w:r>
-        <w:t xml:space="preserve"> {% if </w:t>
-      </w:r>
-      <w:proofErr w:type="spellStart"/>
-      <w:r>
-        <w:t>joint_language</w:t>
-      </w:r>
-      <w:proofErr w:type="spellEnd"/>
-      <w:r>
-        <w:t xml:space="preserve"> == True %}and {{</w:t>
-      </w:r>
-      <w:proofErr w:type="spellStart"/>
+        <w:t>({{users[0].marital_status}}), residing at {{users[0].address.on_one_line(bare=True)}},</w:t>
+      </w:r>
+      <w:r>
+        <w:t xml:space="preserve"> {% if joint_language == True %}and {{</w:t>
+      </w:r>
       <w:r>
         <w:t>joint_owner</w:t>
       </w:r>
@@ -921,11 +666,7 @@
         <w:t>.</w:t>
       </w:r>
       <w:r>
-        <w:t>name_full</w:t>
-      </w:r>
-      <w:proofErr w:type="spellEnd"/>
-      <w:r>
-        <w:t>()</w:t>
+        <w:t>name_full()</w:t>
       </w:r>
       <w:r>
         <w:t>}</w:t>
@@ -936,27 +677,17 @@
       <w:r>
         <w:t>({{</w:t>
       </w:r>
-      <w:proofErr w:type="spellStart"/>
       <w:r>
         <w:t>joint_owner</w:t>
       </w:r>
       <w:r>
-        <w:t>.marital_status</w:t>
-      </w:r>
-      <w:proofErr w:type="spellEnd"/>
-      <w:r>
-        <w:t>}}), residing at {{</w:t>
-      </w:r>
-      <w:proofErr w:type="spellStart"/>
+        <w:t>.marital_status}}), residing at {{</w:t>
+      </w:r>
       <w:r>
         <w:t>joint_owner</w:t>
       </w:r>
       <w:r>
-        <w:t>.address.on_one_line</w:t>
-      </w:r>
-      <w:proofErr w:type="spellEnd"/>
-      <w:r>
-        <w:t>(bare=True)}}</w:t>
+        <w:t>.address.on_one_line(bare=True)}}</w:t>
       </w:r>
       <w:r>
         <w:t xml:space="preserve"> execute {% else %}executes {% endif %}</w:t>
@@ -964,29 +695,15 @@
       <w:r>
         <w:t>this transfer on death instrument. {{users[0].</w:t>
       </w:r>
-      <w:proofErr w:type="spellStart"/>
-      <w:r>
-        <w:t>name_full</w:t>
-      </w:r>
-      <w:proofErr w:type="spellEnd"/>
-      <w:r>
-        <w:t>()</w:t>
+      <w:r>
+        <w:t>name_full()</w:t>
       </w:r>
       <w:r>
         <w:t>}}</w:t>
       </w:r>
       <w:r>
-        <w:t xml:space="preserve"> {% if </w:t>
-      </w:r>
-      <w:proofErr w:type="spellStart"/>
-      <w:r>
-        <w:t>joint_language</w:t>
-      </w:r>
-      <w:proofErr w:type="spellEnd"/>
-      <w:r>
-        <w:t xml:space="preserve"> == True %}and {{</w:t>
-      </w:r>
-      <w:proofErr w:type="spellStart"/>
+        <w:t xml:space="preserve"> {% if joint_language == True %}and {{</w:t>
+      </w:r>
       <w:r>
         <w:t>joint_owner</w:t>
       </w:r>
@@ -994,11 +711,7 @@
         <w:t>.</w:t>
       </w:r>
       <w:r>
-        <w:t>name_full</w:t>
-      </w:r>
-      <w:proofErr w:type="spellEnd"/>
-      <w:r>
-        <w:t>()</w:t>
+        <w:t>name_full()</w:t>
       </w:r>
       <w:r>
         <w:t>}</w:t>
@@ -1007,65 +720,45 @@
         <w:t>}</w:t>
       </w:r>
       <w:r>
-        <w:t xml:space="preserve"> {% endif %}will transfer upon their {{</w:t>
-      </w:r>
-      <w:proofErr w:type="spellStart"/>
-      <w:r>
-        <w:t>death_or_deaths</w:t>
-      </w:r>
-      <w:proofErr w:type="spellEnd"/>
+        <w:t xml:space="preserve"> {% endif %}will transfer upon their {{death_or_deaths}}</w:t>
+      </w:r>
+      <w:r>
+        <w:t xml:space="preserve">{% if other_owners_check != </w:t>
+      </w:r>
+      <w:r>
+        <w:t>“</w:t>
+      </w:r>
+      <w:r>
+        <w:t>sole</w:t>
+      </w:r>
+      <w:r>
+        <w:t>”</w:t>
+      </w:r>
+      <w:r>
+        <w:t xml:space="preserve"> %}{% if </w:t>
+      </w:r>
+      <w:r>
+        <w:t>shared_owners_type</w:t>
+      </w:r>
+      <w:r>
+        <w:t xml:space="preserve"> == “</w:t>
+      </w:r>
+      <w:r>
+        <w:t>Tenancy in common</w:t>
+      </w:r>
+      <w:r>
+        <w:t xml:space="preserve">” %} their </w:t>
+      </w:r>
+      <w:r>
+        <w:t>{{</w:t>
+      </w:r>
+      <w:r>
+        <w:t>user_common_share</w:t>
+      </w:r>
       <w:r>
         <w:t>}}</w:t>
       </w:r>
       <w:r>
-        <w:t xml:space="preserve">{% if </w:t>
-      </w:r>
-      <w:proofErr w:type="spellStart"/>
-      <w:r>
-        <w:t>other_owners_check</w:t>
-      </w:r>
-      <w:proofErr w:type="spellEnd"/>
-      <w:r>
-        <w:t xml:space="preserve"> != </w:t>
-      </w:r>
-      <w:r>
-        <w:t>“</w:t>
-      </w:r>
-      <w:r>
-        <w:t>sole</w:t>
-      </w:r>
-      <w:r>
-        <w:t>”</w:t>
-      </w:r>
-      <w:r>
-        <w:t xml:space="preserve"> %}{% if </w:t>
-      </w:r>
-      <w:proofErr w:type="spellStart"/>
-      <w:r>
-        <w:t>shared_owners_type</w:t>
-      </w:r>
-      <w:proofErr w:type="spellEnd"/>
-      <w:r>
-        <w:t xml:space="preserve"> == “</w:t>
-      </w:r>
-      <w:r>
-        <w:t>Tenancy in common</w:t>
-      </w:r>
-      <w:r>
-        <w:t xml:space="preserve">” %} their </w:t>
-      </w:r>
-      <w:r>
-        <w:t>{{</w:t>
-      </w:r>
-      <w:proofErr w:type="spellStart"/>
-      <w:r>
-        <w:t>user_common_share</w:t>
-      </w:r>
-      <w:proofErr w:type="spellEnd"/>
-      <w:r>
-        <w:t>}}</w:t>
-      </w:r>
-      <w:r>
         <w:t>%</w:t>
       </w:r>
       <w:r>
@@ -1087,37 +780,13 @@
         <w:t>the following residential real estate</w:t>
       </w:r>
       <w:r>
-        <w:t xml:space="preserve">{% if </w:t>
-      </w:r>
-      <w:proofErr w:type="spellStart"/>
-      <w:r>
-        <w:t>other_owners_check</w:t>
-      </w:r>
-      <w:proofErr w:type="spellEnd"/>
-      <w:r>
-        <w:t xml:space="preserve"> == “sole” %}</w:t>
+        <w:t>{% if other_owners_check == “sole” %}</w:t>
       </w:r>
       <w:r>
         <w:t xml:space="preserve"> in its entirety</w:t>
       </w:r>
       <w:r>
-        <w:t xml:space="preserve">{% </w:t>
-      </w:r>
-      <w:proofErr w:type="spellStart"/>
-      <w:r>
-        <w:t>elif</w:t>
-      </w:r>
-      <w:proofErr w:type="spellEnd"/>
-      <w:r>
-        <w:t xml:space="preserve"> </w:t>
-      </w:r>
-      <w:proofErr w:type="spellStart"/>
-      <w:r>
-        <w:t>joint_language</w:t>
-      </w:r>
-      <w:proofErr w:type="spellEnd"/>
-      <w:r>
-        <w:t xml:space="preserve"> == True %} in its entirety{% endif %}: </w:t>
+        <w:t xml:space="preserve">{% elif joint_language == True %} in its entirety{% endif %}: </w:t>
       </w:r>
     </w:p>
     <w:p>
@@ -1133,24 +802,14 @@
         <w:t>{</w:t>
       </w:r>
       <w:r>
-        <w:t>{</w:t>
-      </w:r>
-      <w:proofErr w:type="spellStart"/>
-      <w:r>
-        <w:t>todi_</w:t>
-      </w:r>
-      <w:proofErr w:type="gramStart"/>
-      <w:r>
-        <w:t>property.</w:t>
+        <w:t>{todi_property.</w:t>
       </w:r>
       <w:r>
         <w:t>line</w:t>
       </w:r>
-      <w:proofErr w:type="gramEnd"/>
       <w:r>
         <w:t>_one</w:t>
       </w:r>
-      <w:proofErr w:type="spellEnd"/>
       <w:r>
         <w:t>(</w:t>
       </w:r>
@@ -1158,75 +817,28 @@
         <w:rPr>
           <w:bCs/>
         </w:rPr>
-        <w:t>bare=</w:t>
-      </w:r>
-      <w:proofErr w:type="gramStart"/>
-      <w:r>
-        <w:rPr>
-          <w:bCs/>
-        </w:rPr>
-        <w:t>True</w:t>
-      </w:r>
-      <w:r>
-        <w:t>)}}</w:t>
-      </w:r>
-      <w:proofErr w:type="gramEnd"/>
-      <w:r>
-        <w:t>, {{</w:t>
-      </w:r>
-      <w:proofErr w:type="spellStart"/>
-      <w:r>
-        <w:t>todi_</w:t>
-      </w:r>
-      <w:proofErr w:type="gramStart"/>
-      <w:r>
-        <w:t>property</w:t>
-      </w:r>
-      <w:r>
-        <w:t>.city</w:t>
-      </w:r>
-      <w:proofErr w:type="spellEnd"/>
-      <w:proofErr w:type="gramEnd"/>
-      <w:r>
-        <w:t>}},</w:t>
+        <w:t>bare=True</w:t>
+      </w:r>
+      <w:r>
+        <w:t>)}}, {{todi_property</w:t>
+      </w:r>
+      <w:r>
+        <w:t>.city}},</w:t>
       </w:r>
       <w:r>
         <w:t xml:space="preserve"> </w:t>
       </w:r>
       <w:r>
-        <w:t>{{</w:t>
-      </w:r>
-      <w:proofErr w:type="spellStart"/>
-      <w:r>
-        <w:t>todi_</w:t>
-      </w:r>
-      <w:proofErr w:type="gramStart"/>
-      <w:r>
-        <w:t>property</w:t>
+        <w:t>{{todi_property</w:t>
       </w:r>
       <w:r>
         <w:t>.county</w:t>
       </w:r>
-      <w:proofErr w:type="spellEnd"/>
-      <w:proofErr w:type="gramEnd"/>
       <w:r>
         <w:t>}}</w:t>
       </w:r>
       <w:r>
-        <w:t>, {{</w:t>
-      </w:r>
-      <w:proofErr w:type="spellStart"/>
-      <w:r>
-        <w:t>todi_</w:t>
-      </w:r>
-      <w:proofErr w:type="gramStart"/>
-      <w:r>
-        <w:t>property.state</w:t>
-      </w:r>
-      <w:proofErr w:type="spellEnd"/>
-      <w:proofErr w:type="gramEnd"/>
-      <w:r>
-        <w:t>}} {{todi_property</w:t>
+        <w:t>, {{todi_property.state}} {{todi_property</w:t>
       </w:r>
       <w:r>
         <w:t>.zip}}</w:t>
@@ -1240,15 +852,7 @@
         <w:t>Index</w:t>
       </w:r>
       <w:r>
-        <w:t xml:space="preserve"> Number (“PIN”): {{</w:t>
-      </w:r>
-      <w:proofErr w:type="spellStart"/>
-      <w:r>
-        <w:t>todi_property.pin</w:t>
-      </w:r>
-      <w:proofErr w:type="spellEnd"/>
-      <w:r>
-        <w:t>}}</w:t>
+        <w:t xml:space="preserve"> Number (“PIN”): {{todi_property.pin}}</w:t>
       </w:r>
     </w:p>
     <w:p>
@@ -1269,29 +873,7 @@
         <w:rPr>
           <w:bCs/>
         </w:rPr>
-        <w:t>{{</w:t>
-      </w:r>
-      <w:proofErr w:type="spellStart"/>
-      <w:r>
-        <w:rPr>
-          <w:bCs/>
-        </w:rPr>
-        <w:t>todi_</w:t>
-      </w:r>
-      <w:proofErr w:type="gramStart"/>
-      <w:r>
-        <w:rPr>
-          <w:bCs/>
-        </w:rPr>
-        <w:t>property.description</w:t>
-      </w:r>
-      <w:proofErr w:type="spellEnd"/>
-      <w:proofErr w:type="gramEnd"/>
-      <w:r>
-        <w:rPr>
-          <w:bCs/>
-        </w:rPr>
-        <w:t>}}</w:t>
+        <w:t>{{todi_property.description}}</w:t>
       </w:r>
     </w:p>
     <w:p>
@@ -1353,23 +935,7 @@
                 <w:b/>
                 <w:spacing w:val="-4"/>
               </w:rPr>
-              <w:t xml:space="preserve">Beneficiary </w:t>
-            </w:r>
-            <w:proofErr w:type="gramStart"/>
-            <w:r>
-              <w:rPr>
-                <w:b/>
-                <w:spacing w:val="-4"/>
-              </w:rPr>
-              <w:t>Name,  Relationship</w:t>
-            </w:r>
-            <w:proofErr w:type="gramEnd"/>
-            <w:r>
-              <w:rPr>
-                <w:b/>
-                <w:spacing w:val="-4"/>
-              </w:rPr>
-              <w:t xml:space="preserve"> to Owner</w:t>
+              <w:t>Beneficiary Name,  Relationship to Owner</w:t>
             </w:r>
           </w:p>
         </w:tc>
@@ -1411,7 +977,7 @@
                 <w:b/>
                 <w:spacing w:val="-4"/>
               </w:rPr>
-              <w:t>Share (%)</w:t>
+              <w:t>Share</w:t>
             </w:r>
           </w:p>
         </w:tc>
@@ -1419,13 +985,8 @@
     </w:tbl>
     <w:p>
       <w:r>
-        <w:t xml:space="preserve">{% for person in </w:t>
-      </w:r>
-      <w:proofErr w:type="gramStart"/>
-      <w:r>
-        <w:t>beneficiaries %}</w:t>
-      </w:r>
-      <w:proofErr w:type="gramEnd"/>
+        <w:t>{% for person in beneficiaries %}</w:t>
+      </w:r>
     </w:p>
     <w:tbl>
       <w:tblPr>
@@ -1449,31 +1010,14 @@
           </w:tcPr>
           <w:p>
             <w:r>
-              <w:t>{{</w:t>
-            </w:r>
-            <w:proofErr w:type="spellStart"/>
-            <w:r>
-              <w:t>person.</w:t>
-            </w:r>
-            <w:r>
-              <w:t>name_</w:t>
-            </w:r>
-            <w:proofErr w:type="gramStart"/>
-            <w:r>
-              <w:t>full</w:t>
-            </w:r>
-            <w:proofErr w:type="spellEnd"/>
-            <w:r>
-              <w:t>(</w:t>
-            </w:r>
-            <w:proofErr w:type="gramEnd"/>
-            <w:r>
-              <w:t>)</w:t>
+              <w:t>{{person.</w:t>
+            </w:r>
+            <w:r>
+              <w:t>name_full()</w:t>
             </w:r>
             <w:r>
               <w:t>}}</w:t>
             </w:r>
-            <w:proofErr w:type="gramStart"/>
             <w:r>
               <w:t>,</w:t>
             </w:r>
@@ -1481,72 +1025,19 @@
               <w:t xml:space="preserve"> </w:t>
             </w:r>
             <w:r>
-              <w:t>{%</w:t>
-            </w:r>
-            <w:proofErr w:type="gramEnd"/>
-            <w:r>
-              <w:t xml:space="preserve"> if </w:t>
-            </w:r>
-            <w:proofErr w:type="spellStart"/>
-            <w:r>
-              <w:t>joint_language</w:t>
-            </w:r>
-            <w:proofErr w:type="spellEnd"/>
-            <w:r>
-              <w:t xml:space="preserve"> == True </w:t>
-            </w:r>
-            <w:proofErr w:type="gramStart"/>
-            <w:r>
-              <w:t>%}</w:t>
-            </w:r>
-            <w:r>
-              <w:t>{</w:t>
-            </w:r>
-            <w:proofErr w:type="gramEnd"/>
-            <w:r>
-              <w:t>{</w:t>
-            </w:r>
-            <w:proofErr w:type="spellStart"/>
-            <w:proofErr w:type="gramStart"/>
-            <w:r>
-              <w:t>person.relationship</w:t>
-            </w:r>
-            <w:proofErr w:type="gramEnd"/>
+              <w:t>{% if joint_language == True %}</w:t>
+            </w:r>
+            <w:r>
+              <w:t>{{person.relationship</w:t>
+            </w:r>
             <w:r>
               <w:t>_info</w:t>
             </w:r>
-            <w:proofErr w:type="spellEnd"/>
-            <w:proofErr w:type="gramStart"/>
             <w:r>
               <w:t>}}</w:t>
             </w:r>
             <w:r>
-              <w:t>{</w:t>
-            </w:r>
-            <w:proofErr w:type="gramEnd"/>
-            <w:r>
-              <w:t xml:space="preserve">% else </w:t>
-            </w:r>
-            <w:proofErr w:type="gramStart"/>
-            <w:r>
-              <w:t>%}{</w:t>
-            </w:r>
-            <w:proofErr w:type="gramEnd"/>
-            <w:r>
-              <w:t>{</w:t>
-            </w:r>
-            <w:proofErr w:type="spellStart"/>
-            <w:proofErr w:type="gramStart"/>
-            <w:r>
-              <w:t>person.relationship</w:t>
-            </w:r>
-            <w:proofErr w:type="spellEnd"/>
-            <w:r>
-              <w:t>}}{</w:t>
-            </w:r>
-            <w:proofErr w:type="gramEnd"/>
-            <w:r>
-              <w:t>% endif %}</w:t>
+              <w:t>{% else %}{{person.relationship}}{% endif %}</w:t>
             </w:r>
           </w:p>
         </w:tc>
@@ -1556,126 +1047,61 @@
           </w:tcPr>
           <w:p>
             <w:r>
+              <w:t>{% if person.in_america == True %}</w:t>
+            </w:r>
+            <w:r>
+              <w:t>{{person.address.on_one_line(</w:t>
+            </w:r>
+            <w:r>
+              <w:rPr>
+                <w:bCs/>
+              </w:rPr>
+              <w:t>bare=True</w:t>
+            </w:r>
+            <w:r>
+              <w:t>)}}</w:t>
+            </w:r>
+            <w:r>
+              <w:t>{% else %}{{person.intl_address_1}}</w:t>
+            </w:r>
+            <w:r>
+              <w:t>,</w:t>
+            </w:r>
+            <w:r>
+              <w:t xml:space="preserve"> {{person.intl_address_2}}{% endif %}</w:t>
+            </w:r>
+          </w:p>
+        </w:tc>
+        <w:tc>
+          <w:tcPr>
+            <w:tcW w:w="1571" w:type="dxa"/>
+          </w:tcPr>
+          <w:p>
+            <w:r>
               <w:t xml:space="preserve">{% if </w:t>
             </w:r>
-            <w:proofErr w:type="spellStart"/>
-            <w:r>
-              <w:t>person.in_america</w:t>
-            </w:r>
-            <w:proofErr w:type="spellEnd"/>
-            <w:r>
-              <w:t xml:space="preserve"> == True </w:t>
-            </w:r>
-            <w:proofErr w:type="gramStart"/>
-            <w:r>
-              <w:t>%}</w:t>
-            </w:r>
-            <w:r>
-              <w:t>{</w:t>
-            </w:r>
-            <w:proofErr w:type="gramEnd"/>
-            <w:r>
-              <w:t>{</w:t>
-            </w:r>
-            <w:proofErr w:type="spellStart"/>
-            <w:proofErr w:type="gramStart"/>
-            <w:r>
-              <w:t>person.address</w:t>
-            </w:r>
-            <w:proofErr w:type="gramEnd"/>
-            <w:r>
-              <w:t>.on_one_line</w:t>
-            </w:r>
-            <w:proofErr w:type="spellEnd"/>
-            <w:r>
-              <w:t>(</w:t>
-            </w:r>
-            <w:r>
-              <w:rPr>
-                <w:bCs/>
-              </w:rPr>
-              <w:t>bare=True</w:t>
-            </w:r>
-            <w:r>
-              <w:t>)</w:t>
-            </w:r>
-            <w:proofErr w:type="gramStart"/>
-            <w:r>
-              <w:t>}}</w:t>
-            </w:r>
-            <w:r>
-              <w:t>{</w:t>
-            </w:r>
-            <w:proofErr w:type="gramEnd"/>
-            <w:r>
-              <w:t xml:space="preserve">% else </w:t>
-            </w:r>
-            <w:proofErr w:type="gramStart"/>
-            <w:r>
-              <w:t>%}{</w:t>
-            </w:r>
-            <w:proofErr w:type="gramEnd"/>
-            <w:r>
-              <w:t>{</w:t>
-            </w:r>
-            <w:proofErr w:type="gramStart"/>
-            <w:r>
-              <w:t>person.intl</w:t>
-            </w:r>
-            <w:proofErr w:type="gramEnd"/>
-            <w:r>
-              <w:t>_address_</w:t>
-            </w:r>
-            <w:proofErr w:type="gramStart"/>
-            <w:r>
-              <w:t>1}}</w:t>
-            </w:r>
-            <w:r>
-              <w:t>,</w:t>
-            </w:r>
-            <w:r>
-              <w:t xml:space="preserve"> {{person.intl</w:t>
-            </w:r>
-            <w:proofErr w:type="gramEnd"/>
-            <w:r>
-              <w:t>_address_2</w:t>
-            </w:r>
-            <w:proofErr w:type="gramStart"/>
-            <w:r>
-              <w:t>}}{</w:t>
-            </w:r>
-            <w:proofErr w:type="gramEnd"/>
-            <w:r>
-              <w:t>% endif %}</w:t>
-            </w:r>
-          </w:p>
-        </w:tc>
-        <w:tc>
-          <w:tcPr>
-            <w:tcW w:w="1571" w:type="dxa"/>
-          </w:tcPr>
-          <w:p>
-            <w:r>
-              <w:t>{{</w:t>
-            </w:r>
-            <w:proofErr w:type="spellStart"/>
-            <w:proofErr w:type="gramStart"/>
-            <w:r>
-              <w:t>person.percent</w:t>
-            </w:r>
-            <w:proofErr w:type="gramEnd"/>
-            <w:r>
-              <w:t>_share</w:t>
-            </w:r>
-            <w:proofErr w:type="spellEnd"/>
-            <w:proofErr w:type="gramStart"/>
-            <w:r>
-              <w:t>}}</w:t>
+            <w:r>
+              <w:t>percentage_short_enough</w:t>
+            </w:r>
+            <w:r>
+              <w:t>(person.percent_share) == False %}</w:t>
+            </w:r>
+            <w:r>
+              <w:t>1/{{beneficiaries.number_gathered()}}{% else %}</w:t>
+            </w:r>
+            <w:r>
+              <w:t>{{person.</w:t>
+            </w:r>
+            <w:r>
+              <w:lastRenderedPageBreak/>
+              <w:t>percent_share}}</w:t>
             </w:r>
             <w:r>
               <w:t>%</w:t>
             </w:r>
-            <w:proofErr w:type="gramEnd"/>
+            <w:r>
+              <w:t>{% endif %}</w:t>
+            </w:r>
           </w:p>
           <w:p>
             <w:pPr>
@@ -1689,15 +1115,8 @@
     </w:tbl>
     <w:p>
       <w:r>
-        <w:t xml:space="preserve">{% </w:t>
-      </w:r>
-      <w:proofErr w:type="spellStart"/>
-      <w:r>
-        <w:t>endfor</w:t>
-      </w:r>
-      <w:proofErr w:type="spellEnd"/>
-      <w:r>
-        <w:t xml:space="preserve"> %}</w:t>
+        <w:lastRenderedPageBreak/>
+        <w:t>{% endfor %}</w:t>
       </w:r>
     </w:p>
     <w:p>
@@ -1710,316 +1129,161 @@
     </w:p>
     <w:p>
       <w:r>
-        <w:t xml:space="preserve">{%p for person in </w:t>
-      </w:r>
-      <w:proofErr w:type="gramStart"/>
-      <w:r>
-        <w:t>beneficiaries %}</w:t>
-      </w:r>
-      <w:proofErr w:type="gramEnd"/>
+        <w:t>{%p for person in beneficiaries %}</w:t>
+      </w:r>
     </w:p>
     <w:p>
       <w:r>
-        <w:t xml:space="preserve">{%p if </w:t>
-      </w:r>
-      <w:proofErr w:type="spellStart"/>
-      <w:r>
-        <w:t>person.</w:t>
+        <w:t>{%p if person.</w:t>
       </w:r>
       <w:r>
         <w:t>has_successor</w:t>
       </w:r>
-      <w:proofErr w:type="spellEnd"/>
-      <w:r>
-        <w:t xml:space="preserve"> == </w:t>
-      </w:r>
-      <w:proofErr w:type="gramStart"/>
-      <w:r>
-        <w:t>True %}</w:t>
-      </w:r>
-      <w:proofErr w:type="gramEnd"/>
+      <w:r>
+        <w:t xml:space="preserve"> == True %}</w:t>
+      </w:r>
     </w:p>
     <w:p>
       <w:r>
         <w:t xml:space="preserve">If </w:t>
       </w:r>
       <w:r>
+        <w:t>{{person.</w:t>
+      </w:r>
+      <w:r>
+        <w:t>name_full()</w:t>
+      </w:r>
+      <w:r>
+        <w:t>}</w:t>
+      </w:r>
+      <w:r>
+        <w:t>}</w:t>
+      </w:r>
+      <w:r>
+        <w:t xml:space="preserve"> pre</w:t>
+      </w:r>
+      <w:r>
+        <w:t>d</w:t>
+      </w:r>
+      <w:r>
+        <w:t xml:space="preserve">eceases </w:t>
+      </w:r>
+      <w:r>
+        <w:t>{{ me_or_us}}</w:t>
+      </w:r>
+      <w:r>
+        <w:t>, then</w:t>
+      </w:r>
+      <w:r>
+        <w:t xml:space="preserve"> </w:t>
+      </w:r>
+      <w:r>
+        <w:t xml:space="preserve">{% if joint_language == False %}my </w:t>
+      </w:r>
+      <w:r>
+        <w:t>{{person.</w:t>
+      </w:r>
+      <w:r>
+        <w:t xml:space="preserve"> </w:t>
+      </w:r>
+      <w:r>
+        <w:t>successor_beneficiary.relationship</w:t>
+      </w:r>
+      <w:r>
+        <w:t>.lower()</w:t>
+      </w:r>
+      <w:r>
+        <w:t>}}</w:t>
+      </w:r>
+      <w:r>
+        <w:t xml:space="preserve"> </w:t>
+      </w:r>
+      <w:r>
+        <w:t>{{person.succes</w:t>
+      </w:r>
+      <w:r>
+        <w:t>s</w:t>
+      </w:r>
+      <w:r>
+        <w:t>or_beneficiary.</w:t>
+      </w:r>
+      <w:r>
+        <w:t>name_full()</w:t>
+      </w:r>
+      <w:r>
+        <w:t>}} of {{</w:t>
+      </w:r>
+      <w:r>
+        <w:t>person.successor_beneficiary.address.city</w:t>
+      </w:r>
+      <w:r>
+        <w:t xml:space="preserve">}}, </w:t>
+      </w:r>
+      <w:r>
+        <w:t>{% if person.successor_beneficiary.in_america == True %}</w:t>
+      </w:r>
+      <w:r>
         <w:t>{{</w:t>
       </w:r>
-      <w:proofErr w:type="spellStart"/>
-      <w:r>
-        <w:t>person.</w:t>
-      </w:r>
-      <w:r>
-        <w:t>name_</w:t>
-      </w:r>
-      <w:proofErr w:type="gramStart"/>
-      <w:r>
-        <w:t>full</w:t>
-      </w:r>
-      <w:proofErr w:type="spellEnd"/>
+      <w:r>
+        <w:t>person.successor_beneficiary.address.</w:t>
+      </w:r>
+      <w:r>
+        <w:t>state}}</w:t>
+      </w:r>
+      <w:r>
+        <w:t>{% else %}</w:t>
+      </w:r>
+      <w:r>
+        <w:t>{{person.successor_beneficiary.country}}{% endif %}</w:t>
+      </w:r>
+      <w:r>
+        <w:t>{% else %}{{person.successor_beneficiary.</w:t>
+      </w:r>
+      <w:r>
+        <w:t>name_full()</w:t>
+      </w:r>
+      <w:r>
+        <w:t xml:space="preserve">}} </w:t>
+      </w:r>
       <w:r>
         <w:t>(</w:t>
       </w:r>
-      <w:proofErr w:type="gramEnd"/>
+      <w:r>
+        <w:t>{{person.successor_beneficiary.relationship_info}}</w:t>
+      </w:r>
       <w:r>
         <w:t>)</w:t>
       </w:r>
       <w:r>
-        <w:t>}</w:t>
-      </w:r>
-      <w:r>
-        <w:t>}</w:t>
-      </w:r>
-      <w:r>
-        <w:t xml:space="preserve"> pre</w:t>
-      </w:r>
-      <w:r>
-        <w:t>d</w:t>
-      </w:r>
-      <w:r>
-        <w:t xml:space="preserve">eceases </w:t>
-      </w:r>
-      <w:proofErr w:type="gramStart"/>
-      <w:r>
-        <w:t xml:space="preserve">{{ </w:t>
-      </w:r>
-      <w:proofErr w:type="spellStart"/>
-      <w:r>
-        <w:t>me</w:t>
-      </w:r>
-      <w:proofErr w:type="gramEnd"/>
-      <w:r>
-        <w:t>_or_</w:t>
-      </w:r>
-      <w:proofErr w:type="gramStart"/>
-      <w:r>
-        <w:t>us</w:t>
-      </w:r>
-      <w:proofErr w:type="spellEnd"/>
-      <w:r>
-        <w:t>}}</w:t>
-      </w:r>
-      <w:r>
-        <w:t>,</w:t>
-      </w:r>
-      <w:proofErr w:type="gramEnd"/>
+        <w:t xml:space="preserve"> of</w:t>
+      </w:r>
       <w:r>
         <w:t xml:space="preserve"> </w:t>
       </w:r>
-      <w:proofErr w:type="gramStart"/>
-      <w:r>
-        <w:t>then</w:t>
-      </w:r>
-      <w:r>
-        <w:t xml:space="preserve"> </w:t>
-      </w:r>
-      <w:r>
-        <w:t>{%</w:t>
-      </w:r>
-      <w:proofErr w:type="gramEnd"/>
-      <w:r>
-        <w:t xml:space="preserve"> if </w:t>
-      </w:r>
-      <w:proofErr w:type="spellStart"/>
-      <w:r>
-        <w:t>joint_language</w:t>
-      </w:r>
-      <w:proofErr w:type="spellEnd"/>
-      <w:r>
-        <w:t xml:space="preserve"> == </w:t>
-      </w:r>
-      <w:proofErr w:type="gramStart"/>
-      <w:r>
-        <w:t>False %}</w:t>
-      </w:r>
-      <w:proofErr w:type="gramEnd"/>
-      <w:r>
-        <w:t xml:space="preserve">my </w:t>
-      </w:r>
-      <w:r>
-        <w:t>{{person.</w:t>
-      </w:r>
-      <w:r>
-        <w:t xml:space="preserve"> </w:t>
-      </w:r>
-      <w:proofErr w:type="spellStart"/>
-      <w:r>
-        <w:t>successor_beneficiary.relationship</w:t>
-      </w:r>
-      <w:r>
-        <w:t>.lower</w:t>
-      </w:r>
-      <w:proofErr w:type="spellEnd"/>
-      <w:r>
-        <w:t>()</w:t>
-      </w:r>
-      <w:r>
-        <w:t>}}</w:t>
-      </w:r>
-      <w:r>
-        <w:t xml:space="preserve"> </w:t>
-      </w:r>
       <w:r>
         <w:t>{{</w:t>
       </w:r>
-      <w:proofErr w:type="spellStart"/>
-      <w:r>
-        <w:t>person.succes</w:t>
-      </w:r>
-      <w:r>
-        <w:t>s</w:t>
-      </w:r>
-      <w:r>
-        <w:t>or_beneficiary.</w:t>
-      </w:r>
-      <w:r>
-        <w:t>name_full</w:t>
-      </w:r>
-      <w:proofErr w:type="spellEnd"/>
-      <w:r>
-        <w:t>()</w:t>
-      </w:r>
-      <w:r>
-        <w:t>}} of {{</w:t>
-      </w:r>
-      <w:proofErr w:type="spellStart"/>
       <w:r>
         <w:t>person.successor_beneficiary.address.city</w:t>
       </w:r>
-      <w:proofErr w:type="spellEnd"/>
       <w:r>
         <w:t xml:space="preserve">}}, </w:t>
       </w:r>
       <w:r>
-        <w:t xml:space="preserve">{% if </w:t>
-      </w:r>
-      <w:proofErr w:type="spellStart"/>
-      <w:r>
-        <w:t>person.successor_beneficiary.in_america</w:t>
-      </w:r>
-      <w:proofErr w:type="spellEnd"/>
-      <w:r>
-        <w:t xml:space="preserve"> == True %}</w:t>
-      </w:r>
-      <w:r>
-        <w:t>{{</w:t>
-      </w:r>
-      <w:proofErr w:type="spellStart"/>
+        <w:t>{% if person.successor_beneficiary.in_america == True %}{{</w:t>
+      </w:r>
       <w:r>
         <w:t>person.successor_beneficiary.address.</w:t>
       </w:r>
       <w:r>
-        <w:t>state</w:t>
-      </w:r>
-      <w:proofErr w:type="spellEnd"/>
-      <w:r>
-        <w:t>}}</w:t>
+        <w:t>state}}</w:t>
       </w:r>
       <w:r>
         <w:t>{% else %}</w:t>
       </w:r>
       <w:r>
-        <w:t>{{</w:t>
-      </w:r>
-      <w:proofErr w:type="spellStart"/>
-      <w:r>
-        <w:t>person.successor_beneficiary.country</w:t>
-      </w:r>
-      <w:proofErr w:type="spellEnd"/>
-      <w:r>
-        <w:t xml:space="preserve">}}{% </w:t>
-      </w:r>
-      <w:r>
-        <w:lastRenderedPageBreak/>
-        <w:t>endif %}</w:t>
-      </w:r>
-      <w:r>
-        <w:t>{% else %}{{</w:t>
-      </w:r>
-      <w:proofErr w:type="spellStart"/>
-      <w:r>
-        <w:t>person.successor_beneficiary.</w:t>
-      </w:r>
-      <w:r>
-        <w:t>name_full</w:t>
-      </w:r>
-      <w:proofErr w:type="spellEnd"/>
-      <w:r>
-        <w:t>()</w:t>
-      </w:r>
-      <w:r>
-        <w:t xml:space="preserve">}} </w:t>
-      </w:r>
-      <w:r>
-        <w:t>(</w:t>
-      </w:r>
-      <w:r>
-        <w:t>{{</w:t>
-      </w:r>
-      <w:proofErr w:type="spellStart"/>
-      <w:r>
-        <w:t>person.successor_beneficiary.relationship_info</w:t>
-      </w:r>
-      <w:proofErr w:type="spellEnd"/>
-      <w:r>
-        <w:t>}}</w:t>
-      </w:r>
-      <w:r>
-        <w:t>)</w:t>
-      </w:r>
-      <w:r>
-        <w:t xml:space="preserve"> of</w:t>
-      </w:r>
-      <w:r>
-        <w:t xml:space="preserve"> </w:t>
-      </w:r>
-      <w:r>
-        <w:t>{{</w:t>
-      </w:r>
-      <w:proofErr w:type="spellStart"/>
-      <w:r>
-        <w:t>person.successor_beneficiary.address.city</w:t>
-      </w:r>
-      <w:proofErr w:type="spellEnd"/>
-      <w:r>
-        <w:t xml:space="preserve">}}, </w:t>
-      </w:r>
-      <w:r>
-        <w:t xml:space="preserve">{% if </w:t>
-      </w:r>
-      <w:proofErr w:type="spellStart"/>
-      <w:r>
-        <w:t>person.successor_beneficiary.in_america</w:t>
-      </w:r>
-      <w:proofErr w:type="spellEnd"/>
-      <w:r>
-        <w:t xml:space="preserve"> == True %}{{</w:t>
-      </w:r>
-      <w:proofErr w:type="spellStart"/>
-      <w:r>
-        <w:t>person.successor_beneficiary.address.</w:t>
-      </w:r>
-      <w:r>
-        <w:t>state</w:t>
-      </w:r>
-      <w:proofErr w:type="spellEnd"/>
-      <w:r>
-        <w:t>}}</w:t>
-      </w:r>
-      <w:r>
-        <w:t>{% else %}</w:t>
-      </w:r>
-      <w:r>
-        <w:t>{{</w:t>
-      </w:r>
-      <w:proofErr w:type="spellStart"/>
-      <w:r>
-        <w:t>person.successor_beneficiary.country</w:t>
-      </w:r>
-      <w:proofErr w:type="spellEnd"/>
-      <w:r>
-        <w:t>}}{% endif %}</w:t>
+        <w:t>{{person.successor_beneficiary.country}}{% endif %}</w:t>
       </w:r>
       <w:r>
         <w:t xml:space="preserve">{% endif %} </w:t>
@@ -2028,15 +1292,7 @@
         <w:t xml:space="preserve">is </w:t>
       </w:r>
       <w:r>
-        <w:t>{{</w:t>
-      </w:r>
-      <w:proofErr w:type="spellStart"/>
-      <w:r>
-        <w:t>my_or_our</w:t>
-      </w:r>
-      <w:proofErr w:type="spellEnd"/>
-      <w:r>
-        <w:t>}}</w:t>
+        <w:t>{{my_or_our}}</w:t>
       </w:r>
       <w:r>
         <w:t xml:space="preserve"> successor beneficiary</w:t>
@@ -2055,28 +1311,13 @@
     </w:p>
     <w:p>
       <w:r>
-        <w:t xml:space="preserve">{%p </w:t>
-      </w:r>
-      <w:proofErr w:type="gramStart"/>
-      <w:r>
-        <w:t>endif %}</w:t>
-      </w:r>
-      <w:proofErr w:type="gramEnd"/>
+        <w:t>{%p endif %}</w:t>
+      </w:r>
     </w:p>
     <w:p>
       <w:r>
-        <w:t xml:space="preserve">{%p </w:t>
-      </w:r>
-      <w:proofErr w:type="spellStart"/>
-      <w:proofErr w:type="gramStart"/>
-      <w:r>
-        <w:t>endfor</w:t>
-      </w:r>
-      <w:proofErr w:type="spellEnd"/>
-      <w:r>
-        <w:t xml:space="preserve"> %}</w:t>
-      </w:r>
-      <w:proofErr w:type="gramEnd"/>
+        <w:t>{%p endfor %}</w:t>
+      </w:r>
     </w:p>
     <w:p>
       <w:pPr>
@@ -2091,13 +1332,8 @@
       <w:r>
         <w:t xml:space="preserve">{% if </w:t>
       </w:r>
-      <w:proofErr w:type="spellStart"/>
-      <w:r>
-        <w:t>beneficiaries.number</w:t>
-      </w:r>
-      <w:proofErr w:type="spellEnd"/>
-      <w:r>
-        <w:t>()</w:t>
+      <w:r>
+        <w:t>beneficiaries.number()</w:t>
       </w:r>
       <w:r>
         <w:t xml:space="preserve"> == 1 %}</w:t>
@@ -2106,54 +1342,22 @@
         <w:t xml:space="preserve">Upon </w:t>
       </w:r>
       <w:r>
-        <w:t>{{</w:t>
-      </w:r>
-      <w:proofErr w:type="spellStart"/>
-      <w:r>
-        <w:t>my_or_our</w:t>
-      </w:r>
-      <w:proofErr w:type="spellEnd"/>
-      <w:r>
-        <w:t xml:space="preserve">}} </w:t>
-      </w:r>
-      <w:r>
-        <w:t>{{</w:t>
-      </w:r>
-      <w:proofErr w:type="spellStart"/>
-      <w:r>
-        <w:t>death_or_deaths</w:t>
-      </w:r>
-      <w:proofErr w:type="spellEnd"/>
-      <w:r>
-        <w:t>}}</w:t>
+        <w:t xml:space="preserve">{{my_or_our}} </w:t>
+      </w:r>
+      <w:r>
+        <w:t>{{death_or_deaths}}</w:t>
       </w:r>
       <w:r>
         <w:t xml:space="preserve">, </w:t>
       </w:r>
       <w:r>
-        <w:t>{{</w:t>
-      </w:r>
-      <w:proofErr w:type="spellStart"/>
-      <w:r>
-        <w:t>i_or_we</w:t>
-      </w:r>
-      <w:proofErr w:type="spellEnd"/>
-      <w:r>
-        <w:t>}}</w:t>
+        <w:t>{{i_or_we}}</w:t>
       </w:r>
       <w:r>
         <w:t xml:space="preserve"> transfer </w:t>
       </w:r>
       <w:r>
-        <w:t>{{</w:t>
-      </w:r>
-      <w:proofErr w:type="spellStart"/>
-      <w:r>
-        <w:t>my_or_our</w:t>
-      </w:r>
-      <w:proofErr w:type="spellEnd"/>
-      <w:r>
-        <w:t xml:space="preserve">}} </w:t>
+        <w:t xml:space="preserve">{{my_or_our}} </w:t>
       </w:r>
       <w:r>
         <w:t>interest in the above described property to the beneficiary designated above.</w:t>
@@ -2165,68 +1369,28 @@
         <w:t xml:space="preserve">Upon </w:t>
       </w:r>
       <w:r>
-        <w:t>{{</w:t>
-      </w:r>
-      <w:proofErr w:type="spellStart"/>
-      <w:r>
-        <w:t>my_or_our</w:t>
-      </w:r>
-      <w:proofErr w:type="spellEnd"/>
-      <w:r>
-        <w:t xml:space="preserve">}} </w:t>
-      </w:r>
-      <w:r>
-        <w:t>{{</w:t>
-      </w:r>
-      <w:proofErr w:type="spellStart"/>
-      <w:r>
-        <w:t>death_or_deaths</w:t>
-      </w:r>
-      <w:proofErr w:type="spellEnd"/>
-      <w:r>
-        <w:t>}}</w:t>
+        <w:t xml:space="preserve">{{my_or_our}} </w:t>
+      </w:r>
+      <w:r>
+        <w:t>{{death_or_deaths}}</w:t>
       </w:r>
       <w:r>
         <w:t xml:space="preserve">, </w:t>
       </w:r>
       <w:r>
-        <w:t>{{</w:t>
-      </w:r>
-      <w:proofErr w:type="spellStart"/>
-      <w:r>
-        <w:t>i_or_we</w:t>
-      </w:r>
-      <w:proofErr w:type="spellEnd"/>
-      <w:r>
-        <w:t>}}</w:t>
+        <w:t>{{i_or_we}}</w:t>
       </w:r>
       <w:r>
         <w:t xml:space="preserve"> transfer </w:t>
       </w:r>
       <w:r>
-        <w:t>{{</w:t>
-      </w:r>
-      <w:proofErr w:type="spellStart"/>
-      <w:r>
-        <w:t>my_or_our</w:t>
-      </w:r>
-      <w:proofErr w:type="spellEnd"/>
-      <w:r>
-        <w:t xml:space="preserve">}} </w:t>
+        <w:t xml:space="preserve">{{my_or_our}} </w:t>
       </w:r>
       <w:r>
         <w:t xml:space="preserve">interest in the above described property to the beneficiaries designated above as </w:t>
       </w:r>
       <w:r>
-        <w:t>{{</w:t>
-      </w:r>
-      <w:proofErr w:type="spellStart"/>
-      <w:r>
-        <w:t>tenancy_type</w:t>
-      </w:r>
-      <w:proofErr w:type="spellEnd"/>
-      <w:r>
-        <w:t>}}</w:t>
+        <w:t>{{tenancy_type}}</w:t>
       </w:r>
       <w:r>
         <w:t>.</w:t>
@@ -2583,62 +1747,22 @@
         </mc:AlternateContent>
       </w:r>
       <w:r>
-        <w:t xml:space="preserve">This instrument revokes </w:t>
-      </w:r>
-      <w:proofErr w:type="gramStart"/>
-      <w:r>
-        <w:t>any and all</w:t>
-      </w:r>
-      <w:proofErr w:type="gramEnd"/>
-      <w:r>
-        <w:t xml:space="preserve"> prior transfer on death instruments made by the </w:t>
-      </w:r>
-      <w:proofErr w:type="gramStart"/>
-      <w:r>
-        <w:t>above mentioned</w:t>
-      </w:r>
-      <w:proofErr w:type="gramEnd"/>
-      <w:r>
-        <w:t xml:space="preserve"> owner for the above mentioned residential real estate. Before </w:t>
-      </w:r>
-      <w:r>
-        <w:t>{{</w:t>
-      </w:r>
-      <w:proofErr w:type="spellStart"/>
-      <w:r>
-        <w:t>my_or_our</w:t>
-      </w:r>
-      <w:proofErr w:type="spellEnd"/>
-      <w:r>
-        <w:t>}}</w:t>
+        <w:t xml:space="preserve">This instrument revokes any and all prior transfer on death instruments made by the above mentioned owner for the above mentioned residential real estate. Before </w:t>
+      </w:r>
+      <w:r>
+        <w:t>{{my_or_our}}</w:t>
       </w:r>
       <w:r>
         <w:t xml:space="preserve"> </w:t>
       </w:r>
       <w:r>
-        <w:t>{{</w:t>
-      </w:r>
-      <w:proofErr w:type="spellStart"/>
-      <w:r>
-        <w:t>death_or_deaths</w:t>
-      </w:r>
-      <w:proofErr w:type="spellEnd"/>
-      <w:r>
-        <w:t>}}</w:t>
+        <w:t>{{death_or_deaths}}</w:t>
       </w:r>
       <w:r>
         <w:t xml:space="preserve">, </w:t>
       </w:r>
       <w:r>
-        <w:t>{{</w:t>
-      </w:r>
-      <w:proofErr w:type="spellStart"/>
-      <w:r>
-        <w:t>i_or_we</w:t>
-      </w:r>
-      <w:proofErr w:type="spellEnd"/>
-      <w:r>
-        <w:t>}}</w:t>
+        <w:t>{{i_or_we}}</w:t>
       </w:r>
       <w:r>
         <w:t xml:space="preserve"> have the right to revoke this instrument.</w:t>
@@ -2664,11 +1788,9 @@
       <w:r>
         <w:t>{{</w:t>
       </w:r>
-      <w:proofErr w:type="spellStart"/>
       <w:r>
         <w:t>owners_apostrophe</w:t>
       </w:r>
-      <w:proofErr w:type="spellEnd"/>
       <w:r>
         <w:t>}}</w:t>
       </w:r>
@@ -2676,53 +1798,17 @@
         <w:t xml:space="preserve"> </w:t>
       </w:r>
       <w:r>
-        <w:t>{{</w:t>
-      </w:r>
-      <w:proofErr w:type="spellStart"/>
-      <w:r>
-        <w:t>death_or_deaths</w:t>
-      </w:r>
-      <w:proofErr w:type="spellEnd"/>
-      <w:r>
-        <w:t>}}</w:t>
-      </w:r>
-      <w:r>
-        <w:t xml:space="preserve"> in the public records in the office of the recorder of the county in which any part of the residential real estate is </w:t>
-      </w:r>
-      <w:proofErr w:type="gramStart"/>
-      <w:r>
-        <w:t>located.</w:t>
+        <w:t>{{death_or_deaths}}</w:t>
+      </w:r>
+      <w:r>
+        <w:t xml:space="preserve"> in the public records in the office of the recorder of the county in which any part of the residential real estate is located.</w:t>
       </w:r>
       <w:r>
         <w:rPr>
           <w:sz w:val="20"/>
           <w:szCs w:val="20"/>
         </w:rPr>
-        <w:t>{</w:t>
-      </w:r>
-      <w:proofErr w:type="gramEnd"/>
-      <w:r>
-        <w:rPr>
-          <w:sz w:val="20"/>
-          <w:szCs w:val="20"/>
-        </w:rPr>
-        <w:t xml:space="preserve">% if </w:t>
-      </w:r>
-      <w:proofErr w:type="spellStart"/>
-      <w:r>
-        <w:rPr>
-          <w:sz w:val="20"/>
-          <w:szCs w:val="20"/>
-        </w:rPr>
-        <w:t>joint_language</w:t>
-      </w:r>
-      <w:proofErr w:type="spellEnd"/>
-      <w:r>
-        <w:rPr>
-          <w:sz w:val="20"/>
-          <w:szCs w:val="20"/>
-        </w:rPr>
-        <w:t xml:space="preserve"> == False %}</w:t>
+        <w:t>{% if joint_language == False %}</w:t>
       </w:r>
     </w:p>
     <w:tbl>
@@ -2834,33 +1920,11 @@
               </w:rPr>
               <w:t>.</w:t>
             </w:r>
-            <w:proofErr w:type="spellStart"/>
             <w:r>
               <w:rPr>
                 <w:bCs/>
               </w:rPr>
-              <w:t>name_</w:t>
-            </w:r>
-            <w:proofErr w:type="gramStart"/>
-            <w:r>
-              <w:rPr>
-                <w:bCs/>
-              </w:rPr>
-              <w:t>full</w:t>
-            </w:r>
-            <w:proofErr w:type="spellEnd"/>
-            <w:r>
-              <w:rPr>
-                <w:bCs/>
-              </w:rPr>
-              <w:t>(</w:t>
-            </w:r>
-            <w:proofErr w:type="gramEnd"/>
-            <w:r>
-              <w:rPr>
-                <w:bCs/>
-              </w:rPr>
-              <w:t>)</w:t>
+              <w:t>name_full()</w:t>
             </w:r>
             <w:r>
               <w:rPr>
@@ -2905,33 +1969,15 @@
       <w:r>
         <w:t xml:space="preserve">{% </w:t>
       </w:r>
-      <w:proofErr w:type="spellStart"/>
       <w:r>
         <w:t>el</w:t>
       </w:r>
       <w:r>
-        <w:t>if</w:t>
-      </w:r>
-      <w:proofErr w:type="spellEnd"/>
-      <w:r>
-        <w:t xml:space="preserve"> </w:t>
-      </w:r>
-      <w:proofErr w:type="spellStart"/>
-      <w:r>
-        <w:t>joint_language</w:t>
-      </w:r>
-      <w:proofErr w:type="spellEnd"/>
-      <w:r>
-        <w:t xml:space="preserve"> == </w:t>
-      </w:r>
-      <w:proofErr w:type="gramStart"/>
-      <w:r>
-        <w:t>True</w:t>
+        <w:t>if joint_language == True</w:t>
       </w:r>
       <w:r>
         <w:t xml:space="preserve"> %}</w:t>
       </w:r>
-      <w:proofErr w:type="gramEnd"/>
     </w:p>
     <w:p>
       <w:pPr>
@@ -3029,21 +2075,8 @@
             <w:r>
               <w:t>{{users[0].</w:t>
             </w:r>
-            <w:proofErr w:type="spellStart"/>
-            <w:r>
-              <w:t>name_</w:t>
-            </w:r>
-            <w:proofErr w:type="gramStart"/>
-            <w:r>
-              <w:t>full</w:t>
-            </w:r>
-            <w:proofErr w:type="spellEnd"/>
-            <w:r>
-              <w:t>(</w:t>
-            </w:r>
-            <w:proofErr w:type="gramEnd"/>
-            <w:r>
-              <w:t>)</w:t>
+            <w:r>
+              <w:t>name_full()</w:t>
             </w:r>
             <w:r>
               <w:t>}</w:t>
@@ -3198,41 +2231,13 @@
               <w:rPr>
                 <w:bCs/>
               </w:rPr>
-              <w:t>{{</w:t>
-            </w:r>
-            <w:proofErr w:type="spellStart"/>
+              <w:t>{{joint_owner.</w:t>
+            </w:r>
             <w:r>
               <w:rPr>
                 <w:bCs/>
               </w:rPr>
-              <w:t>joint_owner.</w:t>
-            </w:r>
-            <w:r>
-              <w:rPr>
-                <w:bCs/>
-              </w:rPr>
-              <w:t>name_</w:t>
-            </w:r>
-            <w:proofErr w:type="gramStart"/>
-            <w:r>
-              <w:rPr>
-                <w:bCs/>
-              </w:rPr>
-              <w:t>full</w:t>
-            </w:r>
-            <w:proofErr w:type="spellEnd"/>
-            <w:r>
-              <w:rPr>
-                <w:bCs/>
-              </w:rPr>
-              <w:t>(</w:t>
-            </w:r>
-            <w:proofErr w:type="gramEnd"/>
-            <w:r>
-              <w:rPr>
-                <w:bCs/>
-              </w:rPr>
-              <w:t>)</w:t>
+              <w:t>name_full()</w:t>
             </w:r>
             <w:r>
               <w:rPr>
@@ -3281,18 +2286,10 @@
         </w:rPr>
       </w:pPr>
       <w:r>
-        <w:t xml:space="preserve">{% endif </w:t>
-      </w:r>
-      <w:proofErr w:type="gramStart"/>
-      <w:r>
-        <w:t>%}</w:t>
-      </w:r>
-      <w:r>
-        <w:t>{</w:t>
-      </w:r>
-      <w:proofErr w:type="gramEnd"/>
-      <w:r>
-        <w:t xml:space="preserve">% </w:t>
+        <w:t>{% endif %}</w:t>
+      </w:r>
+      <w:r>
+        <w:t xml:space="preserve">{% </w:t>
       </w:r>
       <w:r>
         <w:rPr>
@@ -3323,7 +2320,6 @@
       <w:r>
         <w:t xml:space="preserve">{% if </w:t>
       </w:r>
-      <w:proofErr w:type="spellStart"/>
       <w:r>
         <w:t>first_witness</w:t>
       </w:r>
@@ -3333,7 +2329,6 @@
       <w:r>
         <w:t>known</w:t>
       </w:r>
-      <w:proofErr w:type="spellEnd"/>
       <w:r>
         <w:t xml:space="preserve"> </w:t>
       </w:r>
@@ -3373,24 +2368,16 @@
         </w:rPr>
         <w:t>.</w:t>
       </w:r>
-      <w:proofErr w:type="spellStart"/>
       <w:r>
         <w:rPr>
           <w:noProof/>
         </w:rPr>
-        <w:t>name_full</w:t>
-      </w:r>
-      <w:proofErr w:type="spellEnd"/>
+        <w:t>name_full()</w:t>
+      </w:r>
       <w:r>
         <w:rPr>
           <w:noProof/>
         </w:rPr>
-        <w:t>()</w:t>
-      </w:r>
-      <w:r>
-        <w:rPr>
-          <w:noProof/>
-        </w:rPr>
         <w:t>}}{% endif %}</w:t>
       </w:r>
       <w:r>
@@ -3402,13 +2389,8 @@
       <w:r>
         <w:t>users[0].</w:t>
       </w:r>
-      <w:proofErr w:type="spellStart"/>
-      <w:r>
-        <w:t>name_full</w:t>
-      </w:r>
-      <w:proofErr w:type="spellEnd"/>
-      <w:r>
-        <w:t>()</w:t>
+      <w:r>
+        <w:t>name_full()</w:t>
       </w:r>
       <w:r>
         <w:t>}}</w:t>
@@ -3416,70 +2398,52 @@
       <w:r>
         <w:t xml:space="preserve">{% if </w:t>
       </w:r>
-      <w:proofErr w:type="spellStart"/>
-      <w:r>
-        <w:t>joint_language</w:t>
-      </w:r>
-      <w:proofErr w:type="spellEnd"/>
+      <w:r>
+        <w:t xml:space="preserve">joint_language </w:t>
+      </w:r>
+      <w:r>
+        <w:t>=</w:t>
+      </w:r>
+      <w:r>
+        <w:t xml:space="preserve">= </w:t>
+      </w:r>
+      <w:r>
+        <w:t>True %} and {{</w:t>
+      </w:r>
+      <w:r>
+        <w:t>joint_owner</w:t>
+      </w:r>
+      <w:r>
+        <w:t>.</w:t>
+      </w:r>
+      <w:r>
+        <w:t>name_full()</w:t>
+      </w:r>
+      <w:r>
+        <w:t>}}</w:t>
+      </w:r>
+      <w:r>
+        <w:t>{% endif %}</w:t>
+      </w:r>
+      <w:r>
+        <w:t xml:space="preserve">, </w:t>
+      </w:r>
+      <w:r>
+        <w:t xml:space="preserve">the </w:t>
+      </w:r>
+      <w:r>
+        <w:t>{{owner_or_owners}}</w:t>
+      </w:r>
+      <w:r>
+        <w:t xml:space="preserve"> of the </w:t>
+      </w:r>
+      <w:r>
+        <w:t>above mentioned property,</w:t>
+      </w:r>
       <w:r>
         <w:t xml:space="preserve"> </w:t>
       </w:r>
       <w:r>
-        <w:t>=</w:t>
-      </w:r>
-      <w:r>
-        <w:t xml:space="preserve">= </w:t>
-      </w:r>
-      <w:r>
-        <w:t>True %} and {{</w:t>
-      </w:r>
-      <w:proofErr w:type="spellStart"/>
-      <w:r>
-        <w:t>joint_owner</w:t>
-      </w:r>
-      <w:r>
-        <w:t>.</w:t>
-      </w:r>
-      <w:r>
-        <w:t>name_full</w:t>
-      </w:r>
-      <w:proofErr w:type="spellEnd"/>
-      <w:r>
-        <w:t>()</w:t>
-      </w:r>
-      <w:r>
-        <w:t>}}</w:t>
-      </w:r>
-      <w:r>
-        <w:t>{% endif %}</w:t>
-      </w:r>
-      <w:r>
-        <w:t xml:space="preserve">, </w:t>
-      </w:r>
-      <w:r>
-        <w:t xml:space="preserve">the </w:t>
-      </w:r>
-      <w:r>
-        <w:t>{{</w:t>
-      </w:r>
-      <w:proofErr w:type="spellStart"/>
-      <w:r>
-        <w:t>owner_or_owners</w:t>
-      </w:r>
-      <w:proofErr w:type="spellEnd"/>
-      <w:r>
-        <w:t>}}</w:t>
-      </w:r>
-      <w:r>
-        <w:t xml:space="preserve"> of the </w:t>
-      </w:r>
-      <w:r>
-        <w:t>above mentioned property,</w:t>
-      </w:r>
-      <w:r>
-        <w:t xml:space="preserve"> </w:t>
-      </w:r>
-      <w:r>
         <w:t>executed this Illinois Transfer on Death In</w:t>
       </w:r>
       <w:r>
@@ -3489,37 +2453,13 @@
         <w:t xml:space="preserve">. This instrument was executed as a free and voluntary act by the </w:t>
       </w:r>
       <w:r>
-        <w:t>{{</w:t>
-      </w:r>
-      <w:proofErr w:type="spellStart"/>
-      <w:r>
-        <w:t>owner_or_</w:t>
-      </w:r>
-      <w:proofErr w:type="gramStart"/>
-      <w:r>
-        <w:t>owners</w:t>
-      </w:r>
-      <w:proofErr w:type="spellEnd"/>
-      <w:r>
-        <w:t>}}</w:t>
-      </w:r>
-      <w:r>
-        <w:t>.</w:t>
-      </w:r>
-      <w:proofErr w:type="gramEnd"/>
-      <w:r>
-        <w:t xml:space="preserve"> At the time of the execution, I believe the </w:t>
-      </w:r>
-      <w:r>
-        <w:t>{{</w:t>
-      </w:r>
-      <w:proofErr w:type="spellStart"/>
-      <w:r>
-        <w:t>owner_or_owners</w:t>
-      </w:r>
-      <w:proofErr w:type="spellEnd"/>
-      <w:r>
-        <w:t>}}</w:t>
+        <w:t>{{owner_or_owners}}</w:t>
+      </w:r>
+      <w:r>
+        <w:t xml:space="preserve">. At the time of the execution, I believe the </w:t>
+      </w:r>
+      <w:r>
+        <w:t>{{owner_or_owners}}</w:t>
       </w:r>
       <w:r>
         <w:t xml:space="preserve"> to be of sound mind and memory.</w:t>
@@ -3692,7 +2632,6 @@
             <w:r>
               <w:t xml:space="preserve">{% if </w:t>
             </w:r>
-            <w:proofErr w:type="spellStart"/>
             <w:r>
               <w:t>first_witness</w:t>
             </w:r>
@@ -3700,24 +2639,11 @@
               <w:t>_</w:t>
             </w:r>
             <w:r>
-              <w:t>known</w:t>
-            </w:r>
-            <w:proofErr w:type="spellEnd"/>
-            <w:r>
-              <w:t xml:space="preserve"> == True </w:t>
-            </w:r>
-            <w:proofErr w:type="gramStart"/>
-            <w:r>
-              <w:t>%}</w:t>
-            </w:r>
-            <w:r>
-              <w:t>{</w:t>
-            </w:r>
-            <w:proofErr w:type="gramEnd"/>
-            <w:r>
-              <w:t xml:space="preserve">% if </w:t>
-            </w:r>
-            <w:proofErr w:type="spellStart"/>
+              <w:t>known == True %}</w:t>
+            </w:r>
+            <w:r>
+              <w:t xml:space="preserve">{% if </w:t>
+            </w:r>
             <w:r>
               <w:t>first_witness</w:t>
             </w:r>
@@ -3725,44 +2651,16 @@
               <w:t>_address</w:t>
             </w:r>
             <w:r>
-              <w:t>_known</w:t>
-            </w:r>
-            <w:proofErr w:type="spellEnd"/>
-            <w:r>
-              <w:t xml:space="preserve"> == True </w:t>
-            </w:r>
-            <w:proofErr w:type="gramStart"/>
-            <w:r>
-              <w:t>%}</w:t>
+              <w:t>_known == True %}</w:t>
             </w:r>
             <w:r>
               <w:t>{{</w:t>
             </w:r>
             <w:r>
-              <w:t xml:space="preserve"> witnesses</w:t>
-            </w:r>
-            <w:proofErr w:type="gramEnd"/>
-            <w:r>
-              <w:t>[0</w:t>
-            </w:r>
-            <w:proofErr w:type="gramStart"/>
-            <w:r>
-              <w:t>]</w:t>
-            </w:r>
-            <w:r>
-              <w:t>.</w:t>
-            </w:r>
-            <w:proofErr w:type="spellStart"/>
-            <w:r>
-              <w:t>address</w:t>
-            </w:r>
-            <w:proofErr w:type="gramEnd"/>
-            <w:r>
-              <w:t>.line_one</w:t>
-            </w:r>
-            <w:proofErr w:type="spellEnd"/>
-            <w:r>
-              <w:t>(</w:t>
+              <w:t xml:space="preserve"> witnesses[0]</w:t>
+            </w:r>
+            <w:r>
+              <w:t>.address.line_one(</w:t>
             </w:r>
             <w:r>
               <w:rPr>
@@ -3771,29 +2669,13 @@
               <w:t>bare=True</w:t>
             </w:r>
             <w:r>
-              <w:t>)</w:t>
-            </w:r>
-            <w:proofErr w:type="gramStart"/>
-            <w:r>
-              <w:t>}}</w:t>
-            </w:r>
-            <w:r>
-              <w:t>{</w:t>
-            </w:r>
-            <w:proofErr w:type="gramEnd"/>
-            <w:r>
-              <w:t xml:space="preserve">% </w:t>
-            </w:r>
-            <w:proofErr w:type="gramStart"/>
-            <w:r>
-              <w:t>endif %}</w:t>
-            </w:r>
-            <w:r>
-              <w:t xml:space="preserve"> {</w:t>
-            </w:r>
-            <w:proofErr w:type="gramEnd"/>
-            <w:r>
-              <w:t>% endif %}</w:t>
+              <w:t>)}}</w:t>
+            </w:r>
+            <w:r>
+              <w:t>{% endif %}</w:t>
+            </w:r>
+            <w:r>
+              <w:t xml:space="preserve"> {% endif %}</w:t>
             </w:r>
           </w:p>
         </w:tc>
@@ -3829,7 +2711,6 @@
             <w:r>
               <w:t xml:space="preserve">{% if </w:t>
             </w:r>
-            <w:proofErr w:type="spellStart"/>
             <w:r>
               <w:t>first_witness</w:t>
             </w:r>
@@ -3837,55 +2718,25 @@
               <w:t>_</w:t>
             </w:r>
             <w:r>
-              <w:t>known</w:t>
-            </w:r>
-            <w:proofErr w:type="spellEnd"/>
-            <w:r>
-              <w:t xml:space="preserve"> == True </w:t>
-            </w:r>
-            <w:proofErr w:type="gramStart"/>
-            <w:r>
-              <w:t>%}</w:t>
+              <w:t>known == True %}</w:t>
             </w:r>
             <w:r>
               <w:t>{{</w:t>
             </w:r>
             <w:r>
-              <w:t xml:space="preserve"> witnesses</w:t>
-            </w:r>
-            <w:proofErr w:type="gramEnd"/>
-            <w:r>
-              <w:t>[0]</w:t>
+              <w:t xml:space="preserve"> witnesses[0]</w:t>
             </w:r>
             <w:r>
               <w:t>.</w:t>
             </w:r>
-            <w:proofErr w:type="spellStart"/>
-            <w:r>
-              <w:t>name_</w:t>
-            </w:r>
-            <w:proofErr w:type="gramStart"/>
-            <w:r>
-              <w:t>full</w:t>
-            </w:r>
-            <w:proofErr w:type="spellEnd"/>
-            <w:r>
-              <w:t>(</w:t>
-            </w:r>
-            <w:proofErr w:type="gramEnd"/>
-            <w:r>
-              <w:t>)</w:t>
-            </w:r>
-            <w:proofErr w:type="gramStart"/>
+            <w:r>
+              <w:t>name_full()</w:t>
+            </w:r>
             <w:r>
               <w:t>}}</w:t>
             </w:r>
             <w:r>
-              <w:t>{</w:t>
-            </w:r>
-            <w:proofErr w:type="gramEnd"/>
-            <w:r>
-              <w:t>% endif %}</w:t>
+              <w:t>{% endif %}</w:t>
             </w:r>
           </w:p>
         </w:tc>
@@ -3916,7 +2767,6 @@
             <w:r>
               <w:t xml:space="preserve">{% if </w:t>
             </w:r>
-            <w:proofErr w:type="spellStart"/>
             <w:r>
               <w:t>first_witness</w:t>
             </w:r>
@@ -3924,24 +2774,11 @@
               <w:t>_</w:t>
             </w:r>
             <w:r>
-              <w:t>known</w:t>
-            </w:r>
-            <w:proofErr w:type="spellEnd"/>
-            <w:r>
-              <w:t xml:space="preserve"> == True </w:t>
-            </w:r>
-            <w:proofErr w:type="gramStart"/>
-            <w:r>
-              <w:t>%}</w:t>
-            </w:r>
-            <w:r>
-              <w:t>{</w:t>
-            </w:r>
-            <w:proofErr w:type="gramEnd"/>
-            <w:r>
-              <w:t xml:space="preserve">% if </w:t>
-            </w:r>
-            <w:proofErr w:type="spellStart"/>
+              <w:t>known == True %}</w:t>
+            </w:r>
+            <w:r>
+              <w:t xml:space="preserve">{% if </w:t>
+            </w:r>
             <w:r>
               <w:t>first_witness</w:t>
             </w:r>
@@ -3949,65 +2786,20 @@
               <w:t>_address</w:t>
             </w:r>
             <w:r>
-              <w:t>_known</w:t>
-            </w:r>
-            <w:proofErr w:type="spellEnd"/>
-            <w:r>
-              <w:t xml:space="preserve"> == True </w:t>
-            </w:r>
-            <w:proofErr w:type="gramStart"/>
-            <w:r>
-              <w:t>%}</w:t>
+              <w:t>_known == True %}</w:t>
             </w:r>
             <w:r>
               <w:t>{{</w:t>
             </w:r>
             <w:r>
-              <w:t xml:space="preserve"> witnesses</w:t>
-            </w:r>
-            <w:proofErr w:type="gramEnd"/>
-            <w:r>
-              <w:t>[0</w:t>
-            </w:r>
-            <w:proofErr w:type="gramStart"/>
-            <w:r>
-              <w:t>]</w:t>
-            </w:r>
-            <w:r>
-              <w:t>.</w:t>
-            </w:r>
-            <w:proofErr w:type="spellStart"/>
-            <w:r>
-              <w:t>address</w:t>
-            </w:r>
-            <w:proofErr w:type="gramEnd"/>
-            <w:r>
-              <w:t>.line_</w:t>
-            </w:r>
-            <w:proofErr w:type="gramStart"/>
-            <w:r>
-              <w:t>two</w:t>
-            </w:r>
-            <w:proofErr w:type="spellEnd"/>
-            <w:r>
-              <w:t>(</w:t>
-            </w:r>
-            <w:proofErr w:type="gramEnd"/>
-            <w:r>
-              <w:t>)</w:t>
-            </w:r>
-            <w:proofErr w:type="gramStart"/>
-            <w:r>
-              <w:t>}}</w:t>
-            </w:r>
-            <w:r>
-              <w:t>{</w:t>
-            </w:r>
-            <w:proofErr w:type="gramEnd"/>
-            <w:r>
-              <w:t xml:space="preserve">% endif </w:t>
-            </w:r>
-            <w:proofErr w:type="gramStart"/>
+              <w:t xml:space="preserve"> witnesses[0]</w:t>
+            </w:r>
+            <w:r>
+              <w:t>.address.line_two()}}</w:t>
+            </w:r>
+            <w:r>
+              <w:t xml:space="preserve">{% endif </w:t>
+            </w:r>
             <w:r>
               <w:t>%</w:t>
             </w:r>
@@ -4015,11 +2807,7 @@
               <w:t>}</w:t>
             </w:r>
             <w:r>
-              <w:t>{</w:t>
-            </w:r>
-            <w:proofErr w:type="gramEnd"/>
-            <w:r>
-              <w:t>% endif %}</w:t>
+              <w:t>{% endif %}</w:t>
             </w:r>
           </w:p>
         </w:tc>
@@ -4035,18 +2823,10 @@
     </w:p>
     <w:p>
       <w:r>
-        <w:t xml:space="preserve">I, {% if </w:t>
-      </w:r>
-      <w:proofErr w:type="spellStart"/>
-      <w:r>
-        <w:t>second_witness_</w:t>
-      </w:r>
-      <w:r>
-        <w:t>known</w:t>
-      </w:r>
-      <w:proofErr w:type="spellEnd"/>
-      <w:r>
-        <w:t>== False %}</w:t>
+        <w:t>I, {% if second_witness_</w:t>
+      </w:r>
+      <w:r>
+        <w:t>known== False %}</w:t>
       </w:r>
       <w:r>
         <w:t>____________________</w:t>
@@ -4075,24 +2855,16 @@
         </w:rPr>
         <w:t>.</w:t>
       </w:r>
-      <w:proofErr w:type="spellStart"/>
       <w:r>
         <w:rPr>
           <w:noProof/>
         </w:rPr>
-        <w:t>name_full</w:t>
-      </w:r>
-      <w:proofErr w:type="spellEnd"/>
+        <w:t>name_full()</w:t>
+      </w:r>
       <w:r>
         <w:rPr>
           <w:noProof/>
         </w:rPr>
-        <w:t>()</w:t>
-      </w:r>
-      <w:r>
-        <w:rPr>
-          <w:noProof/>
-        </w:rPr>
         <w:t>}}{% endif %}</w:t>
       </w:r>
       <w:r>
@@ -4104,13 +2876,8 @@
       <w:r>
         <w:t>users[0].</w:t>
       </w:r>
-      <w:proofErr w:type="spellStart"/>
-      <w:r>
-        <w:t>name_full</w:t>
-      </w:r>
-      <w:proofErr w:type="spellEnd"/>
-      <w:r>
-        <w:t>()</w:t>
+      <w:r>
+        <w:t>name_full()</w:t>
       </w:r>
       <w:r>
         <w:t>}}</w:t>
@@ -4118,13 +2885,8 @@
       <w:r>
         <w:t xml:space="preserve">{% if </w:t>
       </w:r>
-      <w:proofErr w:type="spellStart"/>
-      <w:r>
-        <w:t>joint_language</w:t>
-      </w:r>
-      <w:proofErr w:type="spellEnd"/>
-      <w:r>
-        <w:t xml:space="preserve"> </w:t>
+      <w:r>
+        <w:t xml:space="preserve">joint_language </w:t>
       </w:r>
       <w:r>
         <w:t>=</w:t>
@@ -4135,7 +2897,6 @@
       <w:r>
         <w:t>True %} and {{</w:t>
       </w:r>
-      <w:proofErr w:type="spellStart"/>
       <w:r>
         <w:t>joint_owner</w:t>
       </w:r>
@@ -4143,11 +2904,7 @@
         <w:t>.</w:t>
       </w:r>
       <w:r>
-        <w:t>name_full</w:t>
-      </w:r>
-      <w:proofErr w:type="spellEnd"/>
-      <w:r>
-        <w:t>()</w:t>
+        <w:t>name_full()</w:t>
       </w:r>
       <w:r>
         <w:t xml:space="preserve">}}{% endif %}, </w:t>
@@ -4156,15 +2913,7 @@
         <w:t xml:space="preserve">the </w:t>
       </w:r>
       <w:r>
-        <w:t>{{</w:t>
-      </w:r>
-      <w:proofErr w:type="spellStart"/>
-      <w:r>
-        <w:t>owner_or_owners</w:t>
-      </w:r>
-      <w:proofErr w:type="spellEnd"/>
-      <w:r>
-        <w:t>}}</w:t>
+        <w:t>{{owner_or_owners}}</w:t>
       </w:r>
       <w:r>
         <w:t xml:space="preserve"> of the </w:t>
@@ -4176,31 +2925,7 @@
         <w:t xml:space="preserve">, </w:t>
       </w:r>
       <w:r>
-        <w:t>executed this Illinois Transfer on Death Instrument in my presence on _________________. This instrument was executed as a free and voluntary act by the {{</w:t>
-      </w:r>
-      <w:proofErr w:type="spellStart"/>
-      <w:r>
-        <w:t>owner_or_</w:t>
-      </w:r>
-      <w:proofErr w:type="gramStart"/>
-      <w:r>
-        <w:t>owners</w:t>
-      </w:r>
-      <w:proofErr w:type="spellEnd"/>
-      <w:r>
-        <w:t>}}.</w:t>
-      </w:r>
-      <w:proofErr w:type="gramEnd"/>
-      <w:r>
-        <w:t xml:space="preserve"> At the time of the execution, I believe the {{</w:t>
-      </w:r>
-      <w:proofErr w:type="spellStart"/>
-      <w:r>
-        <w:t>owner_or_owners</w:t>
-      </w:r>
-      <w:proofErr w:type="spellEnd"/>
-      <w:r>
-        <w:t>}} to be of sound mind and memory</w:t>
+        <w:t>executed this Illinois Transfer on Death Instrument in my presence on _________________. This instrument was executed as a free and voluntary act by the {{owner_or_owners}}. At the time of the execution, I believe the {{owner_or_owners}} to be of sound mind and memory</w:t>
       </w:r>
       <w:r>
         <w:t>.</w:t>
@@ -4362,74 +3087,29 @@
               <w:contextualSpacing/>
             </w:pPr>
             <w:r>
-              <w:t xml:space="preserve">{% if </w:t>
-            </w:r>
-            <w:proofErr w:type="spellStart"/>
+              <w:t>{% if second</w:t>
+            </w:r>
+            <w:r>
+              <w:t>_witness_</w:t>
+            </w:r>
+            <w:r>
+              <w:t xml:space="preserve">known == True %}{% if </w:t>
+            </w:r>
             <w:r>
               <w:t>second</w:t>
             </w:r>
             <w:r>
-              <w:t>_witness_</w:t>
-            </w:r>
-            <w:r>
-              <w:t>known</w:t>
-            </w:r>
-            <w:proofErr w:type="spellEnd"/>
-            <w:r>
-              <w:t xml:space="preserve"> == True </w:t>
-            </w:r>
-            <w:proofErr w:type="gramStart"/>
-            <w:r>
-              <w:t>%}{</w:t>
-            </w:r>
-            <w:proofErr w:type="gramEnd"/>
-            <w:r>
-              <w:t xml:space="preserve">% if </w:t>
-            </w:r>
-            <w:proofErr w:type="spellStart"/>
-            <w:r>
-              <w:t>second</w:t>
-            </w:r>
-            <w:r>
               <w:t>_witness_address</w:t>
             </w:r>
             <w:r>
-              <w:t>_known</w:t>
-            </w:r>
-            <w:proofErr w:type="spellEnd"/>
-            <w:r>
-              <w:t xml:space="preserve"> == True </w:t>
-            </w:r>
-            <w:proofErr w:type="gramStart"/>
-            <w:r>
-              <w:t xml:space="preserve">%}{{ </w:t>
+              <w:t xml:space="preserve">_known == True %}{{ </w:t>
             </w:r>
             <w:r>
               <w:lastRenderedPageBreak/>
-              <w:t>witnesses</w:t>
-            </w:r>
-            <w:proofErr w:type="gramEnd"/>
-            <w:r>
-              <w:t>[1</w:t>
-            </w:r>
-            <w:proofErr w:type="gramStart"/>
-            <w:r>
-              <w:t>]</w:t>
-            </w:r>
-            <w:r>
-              <w:t>.</w:t>
-            </w:r>
-            <w:proofErr w:type="spellStart"/>
-            <w:r>
-              <w:t>address</w:t>
-            </w:r>
-            <w:proofErr w:type="gramEnd"/>
-            <w:r>
-              <w:t>.line_one</w:t>
-            </w:r>
-            <w:proofErr w:type="spellEnd"/>
-            <w:r>
-              <w:t>(</w:t>
+              <w:t>witnesses[1]</w:t>
+            </w:r>
+            <w:r>
+              <w:t>.address.line_one(</w:t>
             </w:r>
             <w:r>
               <w:rPr>
@@ -4438,15 +3118,7 @@
               <w:t>bare=True</w:t>
             </w:r>
             <w:r>
-              <w:t>)</w:t>
-            </w:r>
-            <w:proofErr w:type="gramStart"/>
-            <w:r>
-              <w:t>}}{</w:t>
-            </w:r>
-            <w:proofErr w:type="gramEnd"/>
-            <w:r>
-              <w:t>% endif %} {% endif %}</w:t>
+              <w:t>)}}{% endif %} {% endif %}</w:t>
             </w:r>
           </w:p>
         </w:tc>
@@ -4482,11 +3154,7 @@
               <w:contextualSpacing/>
             </w:pPr>
             <w:r>
-              <w:t xml:space="preserve">{% if </w:t>
-            </w:r>
-            <w:proofErr w:type="spellStart"/>
-            <w:r>
-              <w:t>second</w:t>
+              <w:t>{% if second</w:t>
             </w:r>
             <w:r>
               <w:t>_wi</w:t>
@@ -4495,49 +3163,19 @@
               <w:t>tness_</w:t>
             </w:r>
             <w:r>
-              <w:t>known</w:t>
-            </w:r>
-            <w:proofErr w:type="spellEnd"/>
-            <w:r>
-              <w:t xml:space="preserve"> == True </w:t>
-            </w:r>
-            <w:proofErr w:type="gramStart"/>
-            <w:r>
-              <w:t xml:space="preserve">%}{{ </w:t>
-            </w:r>
-            <w:r>
-              <w:t>witnesses</w:t>
-            </w:r>
-            <w:proofErr w:type="gramEnd"/>
-            <w:r>
-              <w:t>[1]</w:t>
+              <w:t xml:space="preserve">known == True %}{{ </w:t>
+            </w:r>
+            <w:r>
+              <w:t>witnesses[1]</w:t>
             </w:r>
             <w:r>
               <w:t>.</w:t>
             </w:r>
-            <w:proofErr w:type="spellStart"/>
-            <w:r>
-              <w:t>name_</w:t>
-            </w:r>
-            <w:proofErr w:type="gramStart"/>
-            <w:r>
-              <w:t>full</w:t>
-            </w:r>
-            <w:proofErr w:type="spellEnd"/>
-            <w:r>
-              <w:t>(</w:t>
-            </w:r>
-            <w:proofErr w:type="gramEnd"/>
-            <w:r>
-              <w:t>)</w:t>
-            </w:r>
-            <w:proofErr w:type="gramStart"/>
-            <w:r>
-              <w:t>}}{</w:t>
-            </w:r>
-            <w:proofErr w:type="gramEnd"/>
-            <w:r>
-              <w:t>% endif %}</w:t>
+            <w:r>
+              <w:t>name_full()</w:t>
+            </w:r>
+            <w:r>
+              <w:t>}}{% endif %}</w:t>
             </w:r>
           </w:p>
         </w:tc>
@@ -4566,97 +3204,28 @@
               <w:contextualSpacing/>
             </w:pPr>
             <w:r>
-              <w:t xml:space="preserve">{% if </w:t>
-            </w:r>
-            <w:proofErr w:type="spellStart"/>
-            <w:r>
-              <w:t>second</w:t>
+              <w:t>{% if second</w:t>
             </w:r>
             <w:r>
               <w:t>_witness_</w:t>
             </w:r>
             <w:r>
-              <w:t>known</w:t>
-            </w:r>
-            <w:proofErr w:type="spellEnd"/>
-            <w:r>
-              <w:t xml:space="preserve"> == True </w:t>
-            </w:r>
-            <w:proofErr w:type="gramStart"/>
-            <w:r>
-              <w:t>%}{</w:t>
-            </w:r>
-            <w:proofErr w:type="gramEnd"/>
-            <w:r>
-              <w:t xml:space="preserve">% if </w:t>
-            </w:r>
-            <w:proofErr w:type="spellStart"/>
-            <w:r>
-              <w:t>second</w:t>
+              <w:t xml:space="preserve">known == True </w:t>
+            </w:r>
+            <w:r>
+              <w:t>%}{% if second</w:t>
             </w:r>
             <w:r>
               <w:t>_witness_address</w:t>
             </w:r>
             <w:r>
-              <w:t>_known</w:t>
-            </w:r>
-            <w:proofErr w:type="spellEnd"/>
-            <w:r>
-              <w:t xml:space="preserve"> == True </w:t>
-            </w:r>
-            <w:proofErr w:type="gramStart"/>
-            <w:r>
-              <w:t xml:space="preserve">%}{{ </w:t>
-            </w:r>
-            <w:r>
-              <w:t>witnesses</w:t>
-            </w:r>
-            <w:proofErr w:type="gramEnd"/>
-            <w:r>
-              <w:t>[1</w:t>
-            </w:r>
-            <w:proofErr w:type="gramStart"/>
-            <w:r>
-              <w:t>]</w:t>
-            </w:r>
-            <w:r>
-              <w:t>.</w:t>
-            </w:r>
-            <w:proofErr w:type="spellStart"/>
-            <w:r>
-              <w:t>address</w:t>
-            </w:r>
-            <w:proofErr w:type="gramEnd"/>
-            <w:r>
-              <w:t>.line_</w:t>
-            </w:r>
-            <w:proofErr w:type="gramStart"/>
-            <w:r>
-              <w:t>two</w:t>
-            </w:r>
-            <w:proofErr w:type="spellEnd"/>
-            <w:r>
-              <w:t>(</w:t>
-            </w:r>
-            <w:proofErr w:type="gramEnd"/>
-            <w:r>
-              <w:t>)</w:t>
-            </w:r>
-            <w:proofErr w:type="gramStart"/>
-            <w:r>
-              <w:t>}}{</w:t>
-            </w:r>
-            <w:proofErr w:type="gramEnd"/>
-            <w:r>
-              <w:t xml:space="preserve">% endif </w:t>
-            </w:r>
-            <w:proofErr w:type="gramStart"/>
-            <w:r>
-              <w:t>%}{</w:t>
-            </w:r>
-            <w:proofErr w:type="gramEnd"/>
-            <w:r>
-              <w:t>% endif %}</w:t>
+              <w:t xml:space="preserve">_known == True %}{{ </w:t>
+            </w:r>
+            <w:r>
+              <w:t>witnesses[1]</w:t>
+            </w:r>
+            <w:r>
+              <w:t>.address.line_two()}}{% endif %}{% endif %}</w:t>
             </w:r>
           </w:p>
         </w:tc>
@@ -4726,198 +3295,142 @@
         </w:rPr>
         <w:t>users[0].</w:t>
       </w:r>
-      <w:proofErr w:type="spellStart"/>
       <w:r>
         <w:rPr>
           <w:bCs/>
         </w:rPr>
-        <w:t>name_full</w:t>
-      </w:r>
-      <w:proofErr w:type="spellEnd"/>
+        <w:t>name_full()</w:t>
+      </w:r>
       <w:r>
         <w:rPr>
           <w:bCs/>
         </w:rPr>
-        <w:t>()</w:t>
+        <w:t>}}</w:t>
       </w:r>
       <w:r>
         <w:rPr>
           <w:bCs/>
         </w:rPr>
+        <w:t>{</w:t>
+      </w:r>
+      <w:r>
+        <w:t xml:space="preserve">% if </w:t>
+      </w:r>
+      <w:r>
+        <w:t>joint_language =</w:t>
+      </w:r>
+      <w:r>
+        <w:t>=</w:t>
+      </w:r>
+      <w:r>
+        <w:t xml:space="preserve"> </w:t>
+      </w:r>
+      <w:r>
+        <w:t>True %} and {{</w:t>
+      </w:r>
+      <w:r>
+        <w:t>joint_owner</w:t>
+      </w:r>
+      <w:r>
+        <w:t>.</w:t>
+      </w:r>
+      <w:r>
+        <w:t>name_full()</w:t>
+      </w:r>
+      <w:r>
+        <w:t>}}{% endif %}</w:t>
+      </w:r>
+      <w:r>
+        <w:t>,</w:t>
+      </w:r>
+      <w:r>
+        <w:t xml:space="preserve"> known to me to be the same </w:t>
+      </w:r>
+      <w:r>
+        <w:t>{{person_or_persons}}</w:t>
+      </w:r>
+      <w:r>
+        <w:t xml:space="preserve"> whose </w:t>
+      </w:r>
+      <w:r>
+        <w:t>{{</w:t>
+      </w:r>
+      <w:r>
+        <w:t>name_is_or_names_are</w:t>
+      </w:r>
+      <w:r>
         <w:t>}}</w:t>
       </w:r>
       <w:r>
-        <w:rPr>
-          <w:bCs/>
-        </w:rPr>
-        <w:t>{</w:t>
-      </w:r>
-      <w:r>
-        <w:t xml:space="preserve">% if </w:t>
-      </w:r>
-      <w:proofErr w:type="spellStart"/>
-      <w:r>
-        <w:t>joint_language</w:t>
-      </w:r>
-      <w:proofErr w:type="spellEnd"/>
-      <w:r>
-        <w:t xml:space="preserve"> =</w:t>
-      </w:r>
-      <w:r>
-        <w:t>=</w:t>
+        <w:t xml:space="preserve"> subscribed as the </w:t>
+      </w:r>
+      <w:r>
+        <w:t>{{owner_or_owners}}</w:t>
+      </w:r>
+      <w:r>
+        <w:t xml:space="preserve"> of the residential real estate, appea</w:t>
+      </w:r>
+      <w:r>
+        <w:t xml:space="preserve">red before me and the witnesses {% if </w:t>
+      </w:r>
+      <w:r>
+        <w:t>second_witness_</w:t>
+      </w:r>
+      <w:r>
+        <w:t xml:space="preserve">known == True </w:t>
+      </w:r>
+      <w:r>
+        <w:t>%}{{</w:t>
       </w:r>
       <w:r>
         <w:t xml:space="preserve"> </w:t>
       </w:r>
       <w:r>
-        <w:t>True %} and {{</w:t>
-      </w:r>
-      <w:proofErr w:type="spellStart"/>
-      <w:r>
-        <w:t>joint_owner</w:t>
+        <w:t>witnesses[0]</w:t>
       </w:r>
       <w:r>
         <w:t>.</w:t>
       </w:r>
       <w:r>
-        <w:t>name_full</w:t>
-      </w:r>
-      <w:proofErr w:type="spellEnd"/>
-      <w:r>
-        <w:t>()</w:t>
-      </w:r>
-      <w:r>
-        <w:t>}}{% endif %}</w:t>
-      </w:r>
-      <w:r>
-        <w:t>,</w:t>
-      </w:r>
-      <w:r>
-        <w:t xml:space="preserve"> known to me to be the same </w:t>
+        <w:t>name_full()</w:t>
+      </w:r>
+      <w:r>
+        <w:t xml:space="preserve">}} and </w:t>
       </w:r>
       <w:r>
         <w:t>{{</w:t>
       </w:r>
-      <w:proofErr w:type="spellStart"/>
-      <w:r>
-        <w:t>person_or_persons</w:t>
-      </w:r>
-      <w:proofErr w:type="spellEnd"/>
+      <w:r>
+        <w:t xml:space="preserve"> </w:t>
+      </w:r>
+      <w:r>
+        <w:t>witnesses[1]</w:t>
+      </w:r>
+      <w:r>
+        <w:t>.</w:t>
+      </w:r>
+      <w:r>
+        <w:t>name_full()</w:t>
+      </w:r>
+      <w:r>
+        <w:t xml:space="preserve">}}{% else %} </w:t>
+      </w:r>
+      <w:r>
+        <w:t>{{</w:t>
+      </w:r>
+      <w:r>
+        <w:t>witnesses[0]</w:t>
+      </w:r>
+      <w:r>
+        <w:t>.</w:t>
+      </w:r>
+      <w:r>
+        <w:t>name_full()</w:t>
+      </w:r>
       <w:r>
         <w:t>}}</w:t>
       </w:r>
       <w:r>
-        <w:t xml:space="preserve"> whose </w:t>
-      </w:r>
-      <w:r>
-        <w:t>{{</w:t>
-      </w:r>
-      <w:proofErr w:type="spellStart"/>
-      <w:r>
-        <w:t>name_is_or_names_are</w:t>
-      </w:r>
-      <w:proofErr w:type="spellEnd"/>
-      <w:r>
-        <w:t>}}</w:t>
-      </w:r>
-      <w:r>
-        <w:t xml:space="preserve"> subscribed as the </w:t>
-      </w:r>
-      <w:r>
-        <w:t>{{</w:t>
-      </w:r>
-      <w:proofErr w:type="spellStart"/>
-      <w:r>
-        <w:t>owner_or_owners</w:t>
-      </w:r>
-      <w:proofErr w:type="spellEnd"/>
-      <w:r>
-        <w:t>}}</w:t>
-      </w:r>
-      <w:r>
-        <w:t xml:space="preserve"> of the residential real estate, appea</w:t>
-      </w:r>
-      <w:r>
-        <w:t xml:space="preserve">red before me and the witnesses {% if </w:t>
-      </w:r>
-      <w:proofErr w:type="spellStart"/>
-      <w:r>
-        <w:t>second_witness_</w:t>
-      </w:r>
-      <w:r>
-        <w:t>known</w:t>
-      </w:r>
-      <w:proofErr w:type="spellEnd"/>
-      <w:r>
-        <w:t xml:space="preserve"> == True </w:t>
-      </w:r>
-      <w:r>
-        <w:t>%}{{</w:t>
-      </w:r>
-      <w:r>
-        <w:t xml:space="preserve"> </w:t>
-      </w:r>
-      <w:r>
-        <w:t>witnesses[0]</w:t>
-      </w:r>
-      <w:r>
-        <w:t>.</w:t>
-      </w:r>
-      <w:proofErr w:type="spellStart"/>
-      <w:r>
-        <w:t>name_full</w:t>
-      </w:r>
-      <w:proofErr w:type="spellEnd"/>
-      <w:r>
-        <w:t>()</w:t>
-      </w:r>
-      <w:r>
-        <w:t xml:space="preserve">}} and </w:t>
-      </w:r>
-      <w:r>
-        <w:t>{{</w:t>
-      </w:r>
-      <w:r>
-        <w:t xml:space="preserve"> </w:t>
-      </w:r>
-      <w:r>
-        <w:t>witnesses[1]</w:t>
-      </w:r>
-      <w:r>
-        <w:t>.</w:t>
-      </w:r>
-      <w:proofErr w:type="spellStart"/>
-      <w:r>
-        <w:t>name_full</w:t>
-      </w:r>
-      <w:proofErr w:type="spellEnd"/>
-      <w:r>
-        <w:t>()</w:t>
-      </w:r>
-      <w:r>
-        <w:t xml:space="preserve">}}{% else %} </w:t>
-      </w:r>
-      <w:r>
-        <w:t>{{</w:t>
-      </w:r>
-      <w:r>
-        <w:t>witnesses[0]</w:t>
-      </w:r>
-      <w:r>
-        <w:t>.</w:t>
-      </w:r>
-      <w:proofErr w:type="spellStart"/>
-      <w:r>
-        <w:t>name_full</w:t>
-      </w:r>
-      <w:proofErr w:type="spellEnd"/>
-      <w:r>
-        <w:t>()</w:t>
-      </w:r>
-      <w:r>
-        <w:t>}}</w:t>
-      </w:r>
-      <w:r>
         <w:t xml:space="preserve"> and __________________________</w:t>
       </w:r>
       <w:r>
@@ -4927,15 +3440,7 @@
         <w:t xml:space="preserve">in person and acknowledged signing the instrument as the free and voluntary act of the </w:t>
       </w:r>
       <w:r>
-        <w:t>{{</w:t>
-      </w:r>
-      <w:proofErr w:type="spellStart"/>
-      <w:r>
-        <w:t>owner_or_owners</w:t>
-      </w:r>
-      <w:proofErr w:type="spellEnd"/>
-      <w:r>
-        <w:t>}}</w:t>
+        <w:t>{{owner_or_owners}}</w:t>
       </w:r>
       <w:r>
         <w:t xml:space="preserve"> who was acting of sound mind and memory for the uses and purposes therein set forth. </w:t>
@@ -4987,13 +3492,8 @@
       <w:r>
         <w:t>users[0].</w:t>
       </w:r>
-      <w:proofErr w:type="spellStart"/>
-      <w:r>
-        <w:t>name_full</w:t>
-      </w:r>
-      <w:proofErr w:type="spellEnd"/>
-      <w:r>
-        <w:t>()</w:t>
+      <w:r>
+        <w:t>name_full()</w:t>
       </w:r>
       <w:r>
         <w:t>}}</w:t>
@@ -5001,13 +3501,8 @@
       <w:r>
         <w:t xml:space="preserve">{% if </w:t>
       </w:r>
-      <w:proofErr w:type="spellStart"/>
-      <w:r>
-        <w:t>joint_language</w:t>
-      </w:r>
-      <w:proofErr w:type="spellEnd"/>
-      <w:r>
-        <w:t xml:space="preserve"> =</w:t>
+      <w:r>
+        <w:t>joint_language =</w:t>
       </w:r>
       <w:r>
         <w:t>=</w:t>
@@ -5016,18 +3511,10 @@
         <w:t xml:space="preserve"> </w:t>
       </w:r>
       <w:r>
-        <w:t>True %} and {{</w:t>
-      </w:r>
-      <w:proofErr w:type="spellStart"/>
-      <w:r>
-        <w:t>joint_owner.</w:t>
-      </w:r>
-      <w:r>
-        <w:t>name_full</w:t>
-      </w:r>
-      <w:proofErr w:type="spellEnd"/>
-      <w:r>
-        <w:t>()</w:t>
+        <w:t>True %} and {{joint_owner.</w:t>
+      </w:r>
+      <w:r>
+        <w:t>name_full()</w:t>
       </w:r>
       <w:r>
         <w:t xml:space="preserve">}}{% endif %}, </w:t>
@@ -5036,15 +3523,7 @@
         <w:t xml:space="preserve">the </w:t>
       </w:r>
       <w:r>
-        <w:t>{{</w:t>
-      </w:r>
-      <w:proofErr w:type="spellStart"/>
-      <w:r>
-        <w:t>owner_or_owners</w:t>
-      </w:r>
-      <w:proofErr w:type="spellEnd"/>
-      <w:r>
-        <w:t>}}</w:t>
+        <w:t>{{owner_or_owners}}</w:t>
       </w:r>
       <w:r>
         <w:t xml:space="preserve"> of the </w:t>
@@ -5074,31 +3553,7 @@
         <w:t xml:space="preserve">instrument was executed as a </w:t>
       </w:r>
       <w:r>
-        <w:t>free and voluntary act by the {{</w:t>
-      </w:r>
-      <w:proofErr w:type="spellStart"/>
-      <w:r>
-        <w:t>owner_or_</w:t>
-      </w:r>
-      <w:proofErr w:type="gramStart"/>
-      <w:r>
-        <w:t>owners</w:t>
-      </w:r>
-      <w:proofErr w:type="spellEnd"/>
-      <w:r>
-        <w:t>}}.</w:t>
-      </w:r>
-      <w:proofErr w:type="gramEnd"/>
-      <w:r>
-        <w:t xml:space="preserve"> At the time of the execution, I believe the {{</w:t>
-      </w:r>
-      <w:proofErr w:type="spellStart"/>
-      <w:r>
-        <w:t>owner_or_owners</w:t>
-      </w:r>
-      <w:proofErr w:type="spellEnd"/>
-      <w:r>
-        <w:t>}} to be of sound mind</w:t>
+        <w:t>free and voluntary act by the {{owner_or_owners}}. At the time of the execution, I believe the {{owner_or_owners}} to be of sound mind</w:t>
       </w:r>
       <w:r>
         <w:t xml:space="preserve"> and memory.</w:t>
@@ -5326,13 +3781,8 @@
       <w:r>
         <w:t>users[0].</w:t>
       </w:r>
-      <w:proofErr w:type="spellStart"/>
-      <w:r>
-        <w:t>name_full</w:t>
-      </w:r>
-      <w:proofErr w:type="spellEnd"/>
-      <w:r>
-        <w:t>()</w:t>
+      <w:r>
+        <w:t>name_full()</w:t>
       </w:r>
       <w:r>
         <w:t>}}</w:t>
@@ -5340,13 +3790,8 @@
       <w:r>
         <w:t xml:space="preserve">{% if </w:t>
       </w:r>
-      <w:proofErr w:type="spellStart"/>
-      <w:r>
-        <w:t>joint_language</w:t>
-      </w:r>
-      <w:proofErr w:type="spellEnd"/>
-      <w:r>
-        <w:t xml:space="preserve"> =</w:t>
+      <w:r>
+        <w:t>joint_language =</w:t>
       </w:r>
       <w:r>
         <w:t>=</w:t>
@@ -5355,18 +3800,10 @@
         <w:t xml:space="preserve"> </w:t>
       </w:r>
       <w:r>
-        <w:t>True %} and {{</w:t>
-      </w:r>
-      <w:proofErr w:type="spellStart"/>
-      <w:r>
-        <w:t>joint_owner.</w:t>
-      </w:r>
-      <w:r>
-        <w:t>name_full</w:t>
-      </w:r>
-      <w:proofErr w:type="spellEnd"/>
-      <w:r>
-        <w:t>()</w:t>
+        <w:t>True %} and {{joint_owner.</w:t>
+      </w:r>
+      <w:r>
+        <w:t>name_full()</w:t>
       </w:r>
       <w:r>
         <w:t xml:space="preserve">}}{% endif %}, </w:t>
@@ -5375,15 +3812,7 @@
         <w:t xml:space="preserve">the </w:t>
       </w:r>
       <w:r>
-        <w:t>{{</w:t>
-      </w:r>
-      <w:proofErr w:type="spellStart"/>
-      <w:r>
-        <w:t>owner_or_owners</w:t>
-      </w:r>
-      <w:proofErr w:type="spellEnd"/>
-      <w:r>
-        <w:t>}}</w:t>
+        <w:t>{{owner_or_owners}}</w:t>
       </w:r>
       <w:r>
         <w:t xml:space="preserve"> of the </w:t>
@@ -5413,31 +3842,7 @@
         <w:t xml:space="preserve">instrument was executed as a </w:t>
       </w:r>
       <w:r>
-        <w:t>free and voluntary act by the {{</w:t>
-      </w:r>
-      <w:proofErr w:type="spellStart"/>
-      <w:r>
-        <w:t>owner_or_</w:t>
-      </w:r>
-      <w:proofErr w:type="gramStart"/>
-      <w:r>
-        <w:t>owners</w:t>
-      </w:r>
-      <w:proofErr w:type="spellEnd"/>
-      <w:r>
-        <w:t>}}.</w:t>
-      </w:r>
-      <w:proofErr w:type="gramEnd"/>
-      <w:r>
-        <w:t xml:space="preserve"> At the time of the execution, I believe the {{</w:t>
-      </w:r>
-      <w:proofErr w:type="spellStart"/>
-      <w:r>
-        <w:t>owner_or_owners</w:t>
-      </w:r>
-      <w:proofErr w:type="spellEnd"/>
-      <w:r>
-        <w:t>}} to be of sound mind</w:t>
+        <w:t>free and voluntary act by the {{owner_or_owners}}. At the time of the execution, I believe the {{owner_or_owners}} to be of sound mind</w:t>
       </w:r>
       <w:r>
         <w:t xml:space="preserve"> and memory.</w:t>
@@ -5702,36 +4107,23 @@
         </w:rPr>
         <w:t>{{users[0].</w:t>
       </w:r>
-      <w:proofErr w:type="spellStart"/>
       <w:r>
         <w:rPr>
           <w:bCs/>
         </w:rPr>
-        <w:t>name_full</w:t>
-      </w:r>
-      <w:proofErr w:type="spellEnd"/>
+        <w:t>name_full()</w:t>
+      </w:r>
       <w:r>
         <w:rPr>
           <w:bCs/>
         </w:rPr>
-        <w:t>()</w:t>
-      </w:r>
-      <w:r>
-        <w:rPr>
-          <w:bCs/>
-        </w:rPr>
         <w:t>}}{</w:t>
       </w:r>
       <w:r>
         <w:t xml:space="preserve">% if </w:t>
       </w:r>
-      <w:proofErr w:type="spellStart"/>
-      <w:r>
-        <w:t>joint_language</w:t>
-      </w:r>
-      <w:proofErr w:type="spellEnd"/>
-      <w:r>
-        <w:t xml:space="preserve"> </w:t>
+      <w:r>
+        <w:t xml:space="preserve">joint_language </w:t>
       </w:r>
       <w:r>
         <w:t>=</w:t>
@@ -5742,7 +4134,6 @@
       <w:r>
         <w:t>True %} and {{</w:t>
       </w:r>
-      <w:proofErr w:type="spellStart"/>
       <w:r>
         <w:t>joint_owner</w:t>
       </w:r>
@@ -5750,11 +4141,7 @@
         <w:t>.</w:t>
       </w:r>
       <w:r>
-        <w:t>name_full</w:t>
-      </w:r>
-      <w:proofErr w:type="spellEnd"/>
-      <w:r>
-        <w:t>()</w:t>
+        <w:t>name_full()</w:t>
       </w:r>
       <w:r>
         <w:t>}}{% endif %}</w:t>
@@ -5763,45 +4150,19 @@
         <w:t>,</w:t>
       </w:r>
       <w:r>
-        <w:t xml:space="preserve"> known to me to be the same {{</w:t>
-      </w:r>
-      <w:proofErr w:type="spellStart"/>
-      <w:r>
-        <w:t>person_or_persons</w:t>
-      </w:r>
-      <w:proofErr w:type="spellEnd"/>
-      <w:r>
-        <w:t>}} whose {{</w:t>
-      </w:r>
-      <w:proofErr w:type="spellStart"/>
+        <w:t xml:space="preserve"> known to me to be the same {{person_or_persons}} whose {{</w:t>
+      </w:r>
       <w:r>
         <w:t>name_is_or_names_are</w:t>
       </w:r>
-      <w:proofErr w:type="spellEnd"/>
-      <w:r>
-        <w:t>}} subscribed as the {{</w:t>
-      </w:r>
-      <w:proofErr w:type="spellStart"/>
-      <w:r>
-        <w:t>owner_or_owners</w:t>
-      </w:r>
-      <w:proofErr w:type="spellEnd"/>
-      <w:r>
-        <w:t>}} of the residential</w:t>
+      <w:r>
+        <w:t>}} subscribed as the {{owner_or_owners}} of the residential</w:t>
       </w:r>
       <w:r>
         <w:t xml:space="preserve"> real estate, appeared before me and the witnesses and </w:t>
       </w:r>
       <w:r>
-        <w:t>in person and acknowledged signing the instrument as the free and voluntary act of the {{</w:t>
-      </w:r>
-      <w:proofErr w:type="spellStart"/>
-      <w:r>
-        <w:t>owner_or_owners</w:t>
-      </w:r>
-      <w:proofErr w:type="spellEnd"/>
-      <w:r>
-        <w:t>}} who was acting</w:t>
+        <w:t>in person and acknowledged signing the instrument as the free and voluntary act of the {{owner_or_owners}} who was acting</w:t>
       </w:r>
       <w:r>
         <w:t xml:space="preserve"> </w:t>
@@ -5837,11 +4198,7 @@
         <w:keepNext/>
       </w:pPr>
       <w:r>
-        <w:t xml:space="preserve">{% endif </w:t>
-      </w:r>
-      <w:proofErr w:type="gramStart"/>
-      <w:r>
-        <w:t>%}</w:t>
+        <w:t>{% endif %}</w:t>
       </w:r>
       <w:r>
         <w:rPr>
@@ -5849,16 +4206,15 @@
           <w:bCs/>
           <w:u w:val="single"/>
         </w:rPr>
-        <w:t>_</w:t>
-      </w:r>
-      <w:proofErr w:type="gramEnd"/>
+        <w:t>________________________________________</w:t>
+      </w:r>
       <w:r>
         <w:rPr>
           <w:b/>
           <w:bCs/>
           <w:u w:val="single"/>
         </w:rPr>
-        <w:t>_______________________________________</w:t>
+        <w:t>__________________</w:t>
       </w:r>
       <w:r>
         <w:rPr>
@@ -5866,14 +4222,6 @@
           <w:bCs/>
           <w:u w:val="single"/>
         </w:rPr>
-        <w:t>__________________</w:t>
-      </w:r>
-      <w:r>
-        <w:rPr>
-          <w:b/>
-          <w:bCs/>
-          <w:u w:val="single"/>
-        </w:rPr>
         <w:t>________________________________</w:t>
       </w:r>
     </w:p>
@@ -5915,23 +4263,21 @@
         </w:rPr>
         <w:t>users[0].</w:t>
       </w:r>
-      <w:proofErr w:type="spellStart"/>
       <w:r>
         <w:rPr>
           <w:bCs/>
           <w:sz w:val="20"/>
           <w:szCs w:val="20"/>
         </w:rPr>
-        <w:t>name_full</w:t>
-      </w:r>
-      <w:proofErr w:type="spellEnd"/>
+        <w:t>name_full()</w:t>
+      </w:r>
       <w:r>
         <w:rPr>
           <w:bCs/>
           <w:sz w:val="20"/>
           <w:szCs w:val="20"/>
         </w:rPr>
-        <w:t>()</w:t>
+        <w:t>}</w:t>
       </w:r>
       <w:r>
         <w:rPr>
@@ -5943,25 +4289,25 @@
       </w:r>
       <w:r>
         <w:rPr>
+          <w:sz w:val="20"/>
+          <w:szCs w:val="20"/>
+        </w:rPr>
+        <w:t>,</w:t>
+      </w:r>
+      <w:r>
+        <w:rPr>
+          <w:sz w:val="20"/>
+          <w:szCs w:val="20"/>
+        </w:rPr>
+        <w:t xml:space="preserve"> </w:t>
+      </w:r>
+      <w:r>
+        <w:rPr>
           <w:bCs/>
           <w:sz w:val="20"/>
           <w:szCs w:val="20"/>
         </w:rPr>
-        <w:t>}</w:t>
-      </w:r>
-      <w:r>
-        <w:rPr>
-          <w:sz w:val="20"/>
-          <w:szCs w:val="20"/>
-        </w:rPr>
-        <w:t>,</w:t>
-      </w:r>
-      <w:r>
-        <w:rPr>
-          <w:sz w:val="20"/>
-          <w:szCs w:val="20"/>
-        </w:rPr>
-        <w:t xml:space="preserve"> </w:t>
+        <w:t>{{</w:t>
       </w:r>
       <w:r>
         <w:rPr>
@@ -5969,7 +4315,7 @@
           <w:sz w:val="20"/>
           <w:szCs w:val="20"/>
         </w:rPr>
-        <w:t>{{</w:t>
+        <w:t>users[0].</w:t>
       </w:r>
       <w:r>
         <w:rPr>
@@ -5977,25 +4323,23 @@
           <w:sz w:val="20"/>
           <w:szCs w:val="20"/>
         </w:rPr>
-        <w:t>users[0].</w:t>
-      </w:r>
-      <w:proofErr w:type="spellStart"/>
+        <w:t>address.on_one_line</w:t>
+      </w:r>
       <w:r>
         <w:rPr>
           <w:bCs/>
           <w:sz w:val="20"/>
           <w:szCs w:val="20"/>
         </w:rPr>
-        <w:t>address.on_one_line</w:t>
-      </w:r>
-      <w:proofErr w:type="spellEnd"/>
+        <w:t>(</w:t>
+      </w:r>
       <w:r>
         <w:rPr>
           <w:bCs/>
           <w:sz w:val="20"/>
           <w:szCs w:val="20"/>
         </w:rPr>
-        <w:t>(</w:t>
+        <w:t>bare=True</w:t>
       </w:r>
       <w:r>
         <w:rPr>
@@ -6003,7 +4347,106 @@
           <w:sz w:val="20"/>
           <w:szCs w:val="20"/>
         </w:rPr>
-        <w:t>bare=True</w:t>
+        <w:t>)}}</w:t>
+      </w:r>
+      <w:r>
+        <w:rPr>
+          <w:sz w:val="20"/>
+          <w:szCs w:val="20"/>
+        </w:rPr>
+        <w:t xml:space="preserve">{% if </w:t>
+      </w:r>
+      <w:r>
+        <w:rPr>
+          <w:sz w:val="20"/>
+          <w:szCs w:val="20"/>
+        </w:rPr>
+        <w:t>users[0].</w:t>
+      </w:r>
+      <w:r>
+        <w:rPr>
+          <w:sz w:val="20"/>
+          <w:szCs w:val="20"/>
+        </w:rPr>
+        <w:t>include_phone == True %}, {{phone_number_formatted(</w:t>
+      </w:r>
+      <w:r>
+        <w:rPr>
+          <w:sz w:val="20"/>
+          <w:szCs w:val="20"/>
+        </w:rPr>
+        <w:t>users[0].</w:t>
+      </w:r>
+      <w:r>
+        <w:rPr>
+          <w:sz w:val="20"/>
+          <w:szCs w:val="20"/>
+        </w:rPr>
+        <w:t xml:space="preserve">phone_number)}}{% endif %}{% if </w:t>
+      </w:r>
+      <w:r>
+        <w:rPr>
+          <w:sz w:val="20"/>
+          <w:szCs w:val="20"/>
+        </w:rPr>
+        <w:t>users[0].</w:t>
+      </w:r>
+      <w:r>
+        <w:rPr>
+          <w:sz w:val="20"/>
+          <w:szCs w:val="20"/>
+        </w:rPr>
+        <w:t xml:space="preserve">include_email </w:t>
+      </w:r>
+      <w:r>
+        <w:rPr>
+          <w:sz w:val="20"/>
+          <w:szCs w:val="20"/>
+        </w:rPr>
+        <w:t xml:space="preserve">== True </w:t>
+      </w:r>
+      <w:r>
+        <w:rPr>
+          <w:sz w:val="20"/>
+          <w:szCs w:val="20"/>
+        </w:rPr>
+        <w:t>%}, {{</w:t>
+      </w:r>
+      <w:r>
+        <w:rPr>
+          <w:sz w:val="20"/>
+          <w:szCs w:val="20"/>
+        </w:rPr>
+        <w:t>users[0].</w:t>
+      </w:r>
+      <w:r>
+        <w:rPr>
+          <w:sz w:val="20"/>
+          <w:szCs w:val="20"/>
+        </w:rPr>
+        <w:t>email</w:t>
+      </w:r>
+      <w:r>
+        <w:rPr>
+          <w:sz w:val="20"/>
+          <w:szCs w:val="20"/>
+        </w:rPr>
+        <w:t>}}{% endif %}</w:t>
+      </w:r>
+    </w:p>
+    <w:p>
+      <w:pPr>
+        <w:rPr>
+          <w:sz w:val="20"/>
+          <w:szCs w:val="20"/>
+        </w:rPr>
+      </w:pPr>
+      <w:r>
+        <w:rPr>
+          <w:sz w:val="20"/>
+          <w:szCs w:val="20"/>
+        </w:rPr>
+        <w:t>{% if joint_language == True %}</w:t>
       </w:r>
       <w:r>
         <w:rPr>
@@ -6011,165 +4454,7 @@
           <w:sz w:val="20"/>
           <w:szCs w:val="20"/>
         </w:rPr>
-        <w:t>)}}</w:t>
-      </w:r>
-      <w:r>
-        <w:rPr>
-          <w:sz w:val="20"/>
-          <w:szCs w:val="20"/>
-        </w:rPr>
-        <w:t xml:space="preserve">{% if </w:t>
-      </w:r>
-      <w:r>
-        <w:rPr>
-          <w:sz w:val="20"/>
-          <w:szCs w:val="20"/>
-        </w:rPr>
-        <w:t>users[0].</w:t>
-      </w:r>
-      <w:proofErr w:type="spellStart"/>
-      <w:r>
-        <w:rPr>
-          <w:sz w:val="20"/>
-          <w:szCs w:val="20"/>
-        </w:rPr>
-        <w:t>include_phone</w:t>
-      </w:r>
-      <w:proofErr w:type="spellEnd"/>
-      <w:r>
-        <w:rPr>
-          <w:sz w:val="20"/>
-          <w:szCs w:val="20"/>
-        </w:rPr>
-        <w:t xml:space="preserve"> == True %}, {{</w:t>
-      </w:r>
-      <w:proofErr w:type="spellStart"/>
-      <w:r>
-        <w:rPr>
-          <w:sz w:val="20"/>
-          <w:szCs w:val="20"/>
-        </w:rPr>
-        <w:t>phone_number_formatted</w:t>
-      </w:r>
-      <w:proofErr w:type="spellEnd"/>
-      <w:r>
-        <w:rPr>
-          <w:sz w:val="20"/>
-          <w:szCs w:val="20"/>
-        </w:rPr>
-        <w:t>(</w:t>
-      </w:r>
-      <w:r>
-        <w:rPr>
-          <w:sz w:val="20"/>
-          <w:szCs w:val="20"/>
-        </w:rPr>
-        <w:t>users[0].</w:t>
-      </w:r>
-      <w:proofErr w:type="spellStart"/>
-      <w:r>
-        <w:rPr>
-          <w:sz w:val="20"/>
-          <w:szCs w:val="20"/>
-        </w:rPr>
-        <w:t>phone_number</w:t>
-      </w:r>
-      <w:proofErr w:type="spellEnd"/>
-      <w:r>
-        <w:rPr>
-          <w:sz w:val="20"/>
-          <w:szCs w:val="20"/>
-        </w:rPr>
-        <w:t xml:space="preserve">)}}{% endif %}{% if </w:t>
-      </w:r>
-      <w:r>
-        <w:rPr>
-          <w:sz w:val="20"/>
-          <w:szCs w:val="20"/>
-        </w:rPr>
-        <w:t>users[0].</w:t>
-      </w:r>
-      <w:proofErr w:type="spellStart"/>
-      <w:r>
-        <w:rPr>
-          <w:sz w:val="20"/>
-          <w:szCs w:val="20"/>
-        </w:rPr>
-        <w:t>include_email</w:t>
-      </w:r>
-      <w:proofErr w:type="spellEnd"/>
-      <w:r>
-        <w:rPr>
-          <w:sz w:val="20"/>
-          <w:szCs w:val="20"/>
-        </w:rPr>
-        <w:t xml:space="preserve"> </w:t>
-      </w:r>
-      <w:r>
-        <w:rPr>
-          <w:sz w:val="20"/>
-          <w:szCs w:val="20"/>
-        </w:rPr>
-        <w:t xml:space="preserve">== True </w:t>
-      </w:r>
-      <w:r>
-        <w:rPr>
-          <w:sz w:val="20"/>
-          <w:szCs w:val="20"/>
-        </w:rPr>
-        <w:t>%}, {{</w:t>
-      </w:r>
-      <w:r>
-        <w:rPr>
-          <w:sz w:val="20"/>
-          <w:szCs w:val="20"/>
-        </w:rPr>
-        <w:t>users[0].</w:t>
-      </w:r>
-      <w:r>
-        <w:rPr>
-          <w:sz w:val="20"/>
-          <w:szCs w:val="20"/>
-        </w:rPr>
-        <w:t>email</w:t>
-      </w:r>
-      <w:r>
-        <w:rPr>
-          <w:sz w:val="20"/>
-          <w:szCs w:val="20"/>
-        </w:rPr>
-        <w:t>}}{% endif %}</w:t>
-      </w:r>
-    </w:p>
-    <w:p>
-      <w:pPr>
-        <w:rPr>
-          <w:sz w:val="20"/>
-          <w:szCs w:val="20"/>
-        </w:rPr>
-      </w:pPr>
-      <w:r>
-        <w:rPr>
-          <w:sz w:val="20"/>
-          <w:szCs w:val="20"/>
-        </w:rPr>
-        <w:t xml:space="preserve">{% if </w:t>
-      </w:r>
-      <w:proofErr w:type="spellStart"/>
-      <w:r>
-        <w:rPr>
-          <w:sz w:val="20"/>
-          <w:szCs w:val="20"/>
-        </w:rPr>
-        <w:t>joint_language</w:t>
-      </w:r>
-      <w:proofErr w:type="spellEnd"/>
-      <w:r>
-        <w:rPr>
-          <w:sz w:val="20"/>
-          <w:szCs w:val="20"/>
-        </w:rPr>
-        <w:t xml:space="preserve"> == True %}</w:t>
+        <w:t>{{</w:t>
       </w:r>
       <w:r>
         <w:rPr>
@@ -6177,16 +4462,15 @@
           <w:sz w:val="20"/>
           <w:szCs w:val="20"/>
         </w:rPr>
-        <w:t>{{</w:t>
-      </w:r>
-      <w:proofErr w:type="spellStart"/>
+        <w:t>joint_owner</w:t>
+      </w:r>
       <w:r>
         <w:rPr>
           <w:bCs/>
           <w:sz w:val="20"/>
           <w:szCs w:val="20"/>
         </w:rPr>
-        <w:t>joint_owner</w:t>
+        <w:t>.</w:t>
       </w:r>
       <w:r>
         <w:rPr>
@@ -6194,7 +4478,7 @@
           <w:sz w:val="20"/>
           <w:szCs w:val="20"/>
         </w:rPr>
-        <w:t>.</w:t>
+        <w:t>name_full()</w:t>
       </w:r>
       <w:r>
         <w:rPr>
@@ -6202,16 +4486,22 @@
           <w:sz w:val="20"/>
           <w:szCs w:val="20"/>
         </w:rPr>
-        <w:t>name_full</w:t>
-      </w:r>
-      <w:proofErr w:type="spellEnd"/>
+        <w:t>}}</w:t>
+      </w:r>
       <w:r>
         <w:rPr>
           <w:bCs/>
           <w:sz w:val="20"/>
           <w:szCs w:val="20"/>
         </w:rPr>
-        <w:t>()</w:t>
+        <w:t>,</w:t>
+      </w:r>
+      <w:r>
+        <w:rPr>
+          <w:sz w:val="20"/>
+          <w:szCs w:val="20"/>
+        </w:rPr>
+        <w:t xml:space="preserve"> </w:t>
       </w:r>
       <w:r>
         <w:rPr>
@@ -6219,7 +4509,7 @@
           <w:sz w:val="20"/>
           <w:szCs w:val="20"/>
         </w:rPr>
-        <w:t>}}</w:t>
+        <w:t>{{</w:t>
       </w:r>
       <w:r>
         <w:rPr>
@@ -6227,14 +4517,7 @@
           <w:sz w:val="20"/>
           <w:szCs w:val="20"/>
         </w:rPr>
-        <w:t>,</w:t>
-      </w:r>
-      <w:r>
-        <w:rPr>
-          <w:sz w:val="20"/>
-          <w:szCs w:val="20"/>
-        </w:rPr>
-        <w:t xml:space="preserve"> </w:t>
+        <w:t>joint_owner</w:t>
       </w:r>
       <w:r>
         <w:rPr>
@@ -6242,148 +4525,70 @@
           <w:sz w:val="20"/>
           <w:szCs w:val="20"/>
         </w:rPr>
-        <w:t>{{</w:t>
-      </w:r>
-      <w:proofErr w:type="spellStart"/>
-      <w:r>
-        <w:rPr>
-          <w:bCs/>
+        <w:t>.address.on_one_line(bare=True)}}</w:t>
+      </w:r>
+      <w:r>
+        <w:rPr>
           <w:sz w:val="20"/>
           <w:szCs w:val="20"/>
         </w:rPr>
-        <w:t>joint_owner</w:t>
-      </w:r>
-      <w:r>
-        <w:rPr>
-          <w:bCs/>
+        <w:t xml:space="preserve">{% if </w:t>
+      </w:r>
+      <w:r>
+        <w:rPr>
           <w:sz w:val="20"/>
           <w:szCs w:val="20"/>
         </w:rPr>
-        <w:t>.address.on_one_line</w:t>
-      </w:r>
-      <w:proofErr w:type="spellEnd"/>
-      <w:r>
-        <w:rPr>
-          <w:bCs/>
+        <w:t>joint_owner</w:t>
+      </w:r>
+      <w:r>
+        <w:rPr>
           <w:sz w:val="20"/>
           <w:szCs w:val="20"/>
         </w:rPr>
-        <w:t>(bare=True)}}</w:t>
+        <w:t>.include_phone == True %}, {{phone_number_formatted(</w:t>
       </w:r>
       <w:r>
         <w:rPr>
           <w:sz w:val="20"/>
           <w:szCs w:val="20"/>
         </w:rPr>
-        <w:t xml:space="preserve">{% if </w:t>
-      </w:r>
-      <w:proofErr w:type="spellStart"/>
+        <w:t>joint_owner</w:t>
+      </w:r>
       <w:r>
         <w:rPr>
           <w:sz w:val="20"/>
           <w:szCs w:val="20"/>
         </w:rPr>
-        <w:t>joint_owner</w:t>
+        <w:t xml:space="preserve">.phone_number)}}{% endif %}{% if </w:t>
       </w:r>
       <w:r>
         <w:rPr>
           <w:sz w:val="20"/>
           <w:szCs w:val="20"/>
         </w:rPr>
-        <w:t>.include_phone</w:t>
-      </w:r>
-      <w:proofErr w:type="spellEnd"/>
+        <w:t>joint_owner</w:t>
+      </w:r>
       <w:r>
         <w:rPr>
           <w:sz w:val="20"/>
           <w:szCs w:val="20"/>
         </w:rPr>
-        <w:t xml:space="preserve"> == True %}, {{</w:t>
-      </w:r>
-      <w:proofErr w:type="spellStart"/>
+        <w:t>.include_email == True %}, {{</w:t>
+      </w:r>
       <w:r>
         <w:rPr>
           <w:sz w:val="20"/>
           <w:szCs w:val="20"/>
         </w:rPr>
-        <w:t>phone_number_formatted</w:t>
-      </w:r>
-      <w:proofErr w:type="spellEnd"/>
+        <w:t>joint_owner</w:t>
+      </w:r>
       <w:r>
         <w:rPr>
           <w:sz w:val="20"/>
           <w:szCs w:val="20"/>
         </w:rPr>
-        <w:t>(</w:t>
-      </w:r>
-      <w:proofErr w:type="spellStart"/>
-      <w:r>
-        <w:rPr>
-          <w:sz w:val="20"/>
-          <w:szCs w:val="20"/>
-        </w:rPr>
-        <w:t>joint_owner</w:t>
-      </w:r>
-      <w:r>
-        <w:rPr>
-          <w:sz w:val="20"/>
-          <w:szCs w:val="20"/>
-        </w:rPr>
-        <w:t>.phone_number</w:t>
-      </w:r>
-      <w:proofErr w:type="spellEnd"/>
-      <w:r>
-        <w:rPr>
-          <w:sz w:val="20"/>
-          <w:szCs w:val="20"/>
-        </w:rPr>
-        <w:t xml:space="preserve">)}}{% endif %}{% if </w:t>
-      </w:r>
-      <w:proofErr w:type="spellStart"/>
-      <w:r>
-        <w:rPr>
-          <w:sz w:val="20"/>
-          <w:szCs w:val="20"/>
-        </w:rPr>
-        <w:t>joint_owner</w:t>
-      </w:r>
-      <w:r>
-        <w:rPr>
-          <w:sz w:val="20"/>
-          <w:szCs w:val="20"/>
-        </w:rPr>
-        <w:t>.include_email</w:t>
-      </w:r>
-      <w:proofErr w:type="spellEnd"/>
-      <w:r>
-        <w:rPr>
-          <w:sz w:val="20"/>
-          <w:szCs w:val="20"/>
-        </w:rPr>
-        <w:t xml:space="preserve"> == True %}, {{</w:t>
-      </w:r>
-      <w:proofErr w:type="spellStart"/>
-      <w:r>
-        <w:rPr>
-          <w:sz w:val="20"/>
-          <w:szCs w:val="20"/>
-        </w:rPr>
-        <w:t>joint_owner</w:t>
-      </w:r>
-      <w:r>
-        <w:rPr>
-          <w:sz w:val="20"/>
-          <w:szCs w:val="20"/>
-        </w:rPr>
-        <w:t>.email</w:t>
-      </w:r>
-      <w:proofErr w:type="spellEnd"/>
-      <w:r>
-        <w:rPr>
-          <w:sz w:val="20"/>
-          <w:szCs w:val="20"/>
-        </w:rPr>
-        <w:t>}}{% endif %}{% endif %}</w:t>
+        <w:t>.email}}{% endif %}{% endif %}</w:t>
       </w:r>
     </w:p>
     <w:p>
@@ -6962,45 +5167,29 @@
         </w:rPr>
         <w:t>users[0].</w:t>
       </w:r>
-      <w:proofErr w:type="spellStart"/>
       <w:r>
         <w:rPr>
           <w:bCs/>
         </w:rPr>
-        <w:t>name_full</w:t>
-      </w:r>
-      <w:proofErr w:type="spellEnd"/>
+        <w:t>name_full()</w:t>
+      </w:r>
       <w:r>
         <w:rPr>
           <w:bCs/>
         </w:rPr>
-        <w:t>()</w:t>
+        <w:t>}} ({{</w:t>
       </w:r>
       <w:r>
         <w:rPr>
           <w:bCs/>
         </w:rPr>
-        <w:t>}} ({{</w:t>
+        <w:t>users[0].</w:t>
       </w:r>
       <w:r>
         <w:rPr>
           <w:bCs/>
         </w:rPr>
-        <w:t>users[0].</w:t>
-      </w:r>
-      <w:proofErr w:type="spellStart"/>
-      <w:r>
-        <w:rPr>
-          <w:bCs/>
-        </w:rPr>
-        <w:t>marital_status</w:t>
-      </w:r>
-      <w:proofErr w:type="spellEnd"/>
-      <w:r>
-        <w:rPr>
-          <w:bCs/>
-        </w:rPr>
-        <w:t>}}</w:t>
+        <w:t>marital_status}}</w:t>
       </w:r>
       <w:r>
         <w:rPr>
@@ -7025,17 +5214,8 @@
         <w:t>,</w:t>
       </w:r>
       <w:r>
-        <w:t xml:space="preserve">{% if </w:t>
-      </w:r>
-      <w:proofErr w:type="spellStart"/>
-      <w:r>
-        <w:t>joint_language</w:t>
-      </w:r>
-      <w:proofErr w:type="spellEnd"/>
-      <w:r>
-        <w:t xml:space="preserve"> == True %} and {{</w:t>
-      </w:r>
-      <w:proofErr w:type="spellStart"/>
+        <w:t>{% if joint_language == True %} and {{</w:t>
+      </w:r>
       <w:r>
         <w:t>joint_owner</w:t>
       </w:r>
@@ -7043,11 +5223,7 @@
         <w:t>.</w:t>
       </w:r>
       <w:r>
-        <w:t>name_full</w:t>
-      </w:r>
-      <w:proofErr w:type="spellEnd"/>
-      <w:r>
-        <w:t>()</w:t>
+        <w:t>name_full()</w:t>
       </w:r>
       <w:r>
         <w:t>}</w:t>
@@ -7061,14 +5237,12 @@
       <w:r>
         <w:t>({{</w:t>
       </w:r>
-      <w:proofErr w:type="spellStart"/>
       <w:r>
         <w:t>joint_owner</w:t>
       </w:r>
       <w:r>
         <w:t>.marital_status</w:t>
       </w:r>
-      <w:proofErr w:type="spellEnd"/>
       <w:r>
         <w:rPr>
           <w:bCs/>
@@ -7101,15 +5275,7 @@
         <w:t xml:space="preserve"> owning</w:t>
       </w:r>
       <w:r>
-        <w:t xml:space="preserve">{% if </w:t>
-      </w:r>
-      <w:proofErr w:type="spellStart"/>
-      <w:r>
-        <w:t>other_owners_check</w:t>
-      </w:r>
-      <w:proofErr w:type="spellEnd"/>
-      <w:r>
-        <w:t xml:space="preserve"> != “sole</w:t>
+        <w:t>{% if other_owners_check != “sole</w:t>
       </w:r>
       <w:r>
         <w:t>”</w:t>
@@ -7117,11 +5283,9 @@
       <w:r>
         <w:t xml:space="preserve"> %}{% if </w:t>
       </w:r>
-      <w:proofErr w:type="spellStart"/>
       <w:r>
         <w:t>shared_owners_type</w:t>
       </w:r>
-      <w:proofErr w:type="spellEnd"/>
       <w:r>
         <w:t xml:space="preserve"> == “</w:t>
       </w:r>
@@ -7134,11 +5298,9 @@
       <w:r>
         <w:t>{{</w:t>
       </w:r>
-      <w:proofErr w:type="spellStart"/>
       <w:r>
         <w:t>user_common_share</w:t>
       </w:r>
-      <w:proofErr w:type="spellEnd"/>
       <w:r>
         <w:t>}}</w:t>
       </w:r>
@@ -7165,20 +5327,7 @@
     </w:p>
     <w:p>
       <w:r>
-        <w:t>{{</w:t>
-      </w:r>
-      <w:proofErr w:type="spellStart"/>
-      <w:r>
-        <w:t>todi_</w:t>
-      </w:r>
-      <w:proofErr w:type="gramStart"/>
-      <w:r>
-        <w:t>property.description</w:t>
-      </w:r>
-      <w:proofErr w:type="spellEnd"/>
-      <w:proofErr w:type="gramEnd"/>
-      <w:r>
-        <w:t>}}</w:t>
+        <w:t>{{todi_property.description}}</w:t>
       </w:r>
     </w:p>
     <w:p/>
@@ -7187,44 +5336,20 @@
         <w:t xml:space="preserve">That the street address of the residential real estate is </w:t>
       </w:r>
       <w:r>
-        <w:t>{{</w:t>
-      </w:r>
-      <w:proofErr w:type="spellStart"/>
-      <w:r>
-        <w:t>todi_</w:t>
-      </w:r>
-      <w:proofErr w:type="gramStart"/>
-      <w:r>
-        <w:t>property</w:t>
-      </w:r>
-      <w:r>
-        <w:t>.on</w:t>
-      </w:r>
-      <w:proofErr w:type="gramEnd"/>
-      <w:r>
-        <w:t>_one_line</w:t>
-      </w:r>
-      <w:proofErr w:type="spellEnd"/>
-      <w:r>
-        <w:t>(</w:t>
+        <w:t>{{todi_property</w:t>
+      </w:r>
+      <w:r>
+        <w:t>.on_one_line(</w:t>
       </w:r>
       <w:r>
         <w:rPr>
           <w:bCs/>
         </w:rPr>
-        <w:t>bare=</w:t>
-      </w:r>
-      <w:proofErr w:type="gramStart"/>
-      <w:r>
-        <w:rPr>
-          <w:bCs/>
-        </w:rPr>
-        <w:t>True</w:t>
+        <w:t>bare=True</w:t>
       </w:r>
       <w:r>
         <w:t>)}}</w:t>
       </w:r>
-      <w:proofErr w:type="gramEnd"/>
       <w:r>
         <w:t xml:space="preserve"> and the property i</w:t>
       </w:r>
@@ -7235,15 +5360,7 @@
         <w:t xml:space="preserve"> number is </w:t>
       </w:r>
       <w:r>
-        <w:t>{{</w:t>
-      </w:r>
-      <w:proofErr w:type="spellStart"/>
-      <w:r>
-        <w:t>todi_property.pin</w:t>
-      </w:r>
-      <w:proofErr w:type="spellEnd"/>
-      <w:r>
-        <w:t>}}</w:t>
+        <w:t>{{todi_property.pin}}</w:t>
       </w:r>
       <w:r>
         <w:t>.</w:t>
@@ -7364,19 +5481,12 @@
             <w:r>
               <w:t>{{</w:t>
             </w:r>
-            <w:proofErr w:type="spellStart"/>
-            <w:r>
-              <w:t>todi_</w:t>
-            </w:r>
-            <w:proofErr w:type="gramStart"/>
-            <w:r>
-              <w:t>property.</w:t>
+            <w:r>
+              <w:t>todi_property.</w:t>
             </w:r>
             <w:r>
               <w:t>county</w:t>
             </w:r>
-            <w:proofErr w:type="spellEnd"/>
-            <w:proofErr w:type="gramEnd"/>
             <w:r>
               <w:t xml:space="preserve"> </w:t>
             </w:r>
@@ -7433,23 +5543,7 @@
                 <w:b/>
                 <w:spacing w:val="-4"/>
               </w:rPr>
-              <w:t xml:space="preserve">Beneficiary </w:t>
-            </w:r>
-            <w:proofErr w:type="gramStart"/>
-            <w:r>
-              <w:rPr>
-                <w:b/>
-                <w:spacing w:val="-4"/>
-              </w:rPr>
-              <w:t>Name,  Relationship</w:t>
-            </w:r>
-            <w:proofErr w:type="gramEnd"/>
-            <w:r>
-              <w:rPr>
-                <w:b/>
-                <w:spacing w:val="-4"/>
-              </w:rPr>
-              <w:t xml:space="preserve"> to Owner</w:t>
+              <w:t>Beneficiary Name,  Relationship to Owner</w:t>
             </w:r>
           </w:p>
         </w:tc>
@@ -7499,13 +5593,8 @@
     </w:tbl>
     <w:p>
       <w:r>
-        <w:t xml:space="preserve">{% for person in </w:t>
-      </w:r>
-      <w:proofErr w:type="gramStart"/>
-      <w:r>
-        <w:t>beneficiaries %}</w:t>
-      </w:r>
-      <w:proofErr w:type="gramEnd"/>
+        <w:t>{% for person in beneficiaries %}</w:t>
+      </w:r>
     </w:p>
     <w:tbl>
       <w:tblPr>
@@ -7619,55 +5708,26 @@
     </w:tbl>
     <w:p>
       <w:r>
-        <w:t xml:space="preserve">{% </w:t>
-      </w:r>
-      <w:proofErr w:type="spellStart"/>
-      <w:r>
-        <w:t>endfor</w:t>
-      </w:r>
-      <w:proofErr w:type="spellEnd"/>
-      <w:r>
-        <w:t xml:space="preserve"> %}</w:t>
+        <w:t>{% endfor %}</w:t>
       </w:r>
       <w:r>
         <w:br w:type="page"/>
       </w:r>
       <w:r>
         <w:lastRenderedPageBreak/>
-        <w:t>In witness whereof, the undersigned beneficiaries hereby accept the transfer of residential real estate under the transfer on death instrument this _______ day of ___________, _____</w:t>
-      </w:r>
-      <w:proofErr w:type="gramStart"/>
-      <w:r>
-        <w:t>_.</w:t>
-      </w:r>
-      <w:r>
-        <w:t>{</w:t>
-      </w:r>
-      <w:proofErr w:type="gramEnd"/>
-      <w:r>
-        <w:t xml:space="preserve">% for person in beneficiaries </w:t>
-      </w:r>
-      <w:proofErr w:type="gramStart"/>
-      <w:r>
-        <w:t>%}</w:t>
-      </w:r>
-      <w:r>
-        <w:t>{</w:t>
-      </w:r>
-      <w:proofErr w:type="gramEnd"/>
-      <w:r>
-        <w:t xml:space="preserve">% if </w:t>
+        <w:t>In witness whereof, the undersigned beneficiaries hereby accept the transfer of residential real estate under the transfer on death instrument this _______ day of ___________, ______.</w:t>
+      </w:r>
+      <w:r>
+        <w:t>{% for person in beneficiaries %}</w:t>
+      </w:r>
+      <w:r>
+        <w:t xml:space="preserve">{% if </w:t>
       </w:r>
       <w:r>
         <w:t>(</w:t>
       </w:r>
-      <w:proofErr w:type="gramStart"/>
-      <w:r>
-        <w:t>loop.index</w:t>
-      </w:r>
-      <w:proofErr w:type="gramEnd"/>
-      <w:r>
-        <w:t>0</w:t>
+      <w:r>
+        <w:t>loop.index0</w:t>
       </w:r>
       <w:r>
         <w:t xml:space="preserve"> % 2</w:t>
@@ -7854,26 +5914,8 @@
     </w:tbl>
     <w:p>
       <w:r>
-        <w:t xml:space="preserve">{% endif </w:t>
-      </w:r>
-      <w:proofErr w:type="gramStart"/>
-      <w:r>
-        <w:t>%}{</w:t>
-      </w:r>
-      <w:proofErr w:type="gramEnd"/>
-      <w:r>
-        <w:t xml:space="preserve">% </w:t>
-      </w:r>
-      <w:proofErr w:type="spellStart"/>
-      <w:proofErr w:type="gramStart"/>
-      <w:r>
-        <w:t>endfor</w:t>
-      </w:r>
-      <w:proofErr w:type="spellEnd"/>
-      <w:r>
-        <w:t xml:space="preserve"> %}</w:t>
-      </w:r>
-      <w:proofErr w:type="gramEnd"/>
+        <w:t>{% endif %}{% endfor %}</w:t>
+      </w:r>
     </w:p>
     <w:p>
       <w:r>
@@ -7904,24 +5946,13 @@
         <w:rPr>
           <w:bCs/>
         </w:rPr>
-        <w:t>_____________________________</w:t>
-      </w:r>
-      <w:proofErr w:type="gramStart"/>
-      <w:r>
-        <w:rPr>
-          <w:bCs/>
-        </w:rPr>
-        <w:t>_</w:t>
+        <w:t>______________________________</w:t>
       </w:r>
       <w:r>
         <w:t xml:space="preserve"> </w:t>
       </w:r>
       <w:r>
-        <w:t xml:space="preserve"> personally</w:t>
-      </w:r>
-      <w:proofErr w:type="gramEnd"/>
-      <w:r>
-        <w:t xml:space="preserve"> known to me to be the same person or persons whose name or names are subscribed to the foregoing instrument, appeared before me this day in person and swore on oath to the above foregoing affidavit. Signed and sworn to before me this ____ day of _________________, _______.</w:t>
+        <w:t xml:space="preserve"> personally known to me to be the same person or persons whose name or names are subscribed to the foregoing instrument, appeared before me this day in person and swore on oath to the above foregoing affidavit. Signed and sworn to before me this ____ day of _________________, _______.</w:t>
       </w:r>
     </w:p>
     <w:p/>

</xml_diff>

<commit_message>
Adjusted review screens & affidavit
</commit_message>
<xml_diff>
--- a/docassemble/TODI/data/templates/todi_docassemble.docx
+++ b/docassemble/TODI/data/templates/todi_docassemble.docx
@@ -5585,7 +5585,7 @@
                 <w:b/>
                 <w:spacing w:val="-4"/>
               </w:rPr>
-              <w:t>Share (%)</w:t>
+              <w:t xml:space="preserve">Share </w:t>
             </w:r>
           </w:p>
         </w:tc>
@@ -5700,7 +5700,16 @@
                 <w:sz w:val="28"/>
                 <w:szCs w:val="28"/>
               </w:rPr>
-              <w:t>_____%</w:t>
+              <w:t>_____</w:t>
+            </w:r>
+            <w:r>
+              <w:rPr>
+                <w:b w:val="0"/>
+                <w:bCs w:val="0"/>
+                <w:sz w:val="28"/>
+                <w:szCs w:val="28"/>
+              </w:rPr>
+              <w:t>__</w:t>
             </w:r>
           </w:p>
         </w:tc>

</xml_diff>

<commit_message>
added non residential collapse template, removed residential language from form
</commit_message>
<xml_diff>
--- a/docassemble/TODI/data/templates/todi_docassemble.docx
+++ b/docassemble/TODI/data/templates/todi_docassemble.docx
@@ -188,8 +188,21 @@
             <w:r>
               <w:t>{{users[0].</w:t>
             </w:r>
-            <w:r>
-              <w:t>name_full()</w:t>
+            <w:proofErr w:type="spellStart"/>
+            <w:r>
+              <w:t>name_</w:t>
+            </w:r>
+            <w:proofErr w:type="gramStart"/>
+            <w:r>
+              <w:t>full</w:t>
+            </w:r>
+            <w:proofErr w:type="spellEnd"/>
+            <w:r>
+              <w:t>(</w:t>
+            </w:r>
+            <w:proofErr w:type="gramEnd"/>
+            <w:r>
+              <w:t>)</w:t>
             </w:r>
             <w:r>
               <w:t>}}</w:t>
@@ -231,7 +244,23 @@
           </w:tcPr>
           <w:p>
             <w:r>
-              <w:t>{{users[0].address.line_one(bare=True)}}</w:t>
+              <w:t>{{users[0</w:t>
+            </w:r>
+            <w:proofErr w:type="gramStart"/>
+            <w:r>
+              <w:t>].</w:t>
+            </w:r>
+            <w:proofErr w:type="spellStart"/>
+            <w:r>
+              <w:t>address</w:t>
+            </w:r>
+            <w:proofErr w:type="gramEnd"/>
+            <w:r>
+              <w:t>.line_one</w:t>
+            </w:r>
+            <w:proofErr w:type="spellEnd"/>
+            <w:r>
+              <w:t>(bare=True)}}</w:t>
             </w:r>
           </w:p>
         </w:tc>
@@ -268,7 +297,31 @@
           </w:tcPr>
           <w:p>
             <w:r>
-              <w:t>{{users[0].address.line_two()}}</w:t>
+              <w:t>{{users[0</w:t>
+            </w:r>
+            <w:proofErr w:type="gramStart"/>
+            <w:r>
+              <w:t>].</w:t>
+            </w:r>
+            <w:proofErr w:type="spellStart"/>
+            <w:r>
+              <w:t>address</w:t>
+            </w:r>
+            <w:proofErr w:type="gramEnd"/>
+            <w:r>
+              <w:t>.line_</w:t>
+            </w:r>
+            <w:proofErr w:type="gramStart"/>
+            <w:r>
+              <w:t>two</w:t>
+            </w:r>
+            <w:proofErr w:type="spellEnd"/>
+            <w:r>
+              <w:t>(</w:t>
+            </w:r>
+            <w:proofErr w:type="gramEnd"/>
+            <w:r>
+              <w:t>)}}</w:t>
             </w:r>
           </w:p>
         </w:tc>
@@ -352,20 +405,50 @@
               <w:rPr>
                 <w:bCs/>
               </w:rPr>
-              <w:t>{% if joint_language == True %}</w:t>
-            </w:r>
-            <w:r>
-              <w:rPr>
-                <w:bCs/>
-              </w:rPr>
-              <w:t>{{</w:t>
-            </w:r>
+              <w:t xml:space="preserve">{% if </w:t>
+            </w:r>
+            <w:proofErr w:type="spellStart"/>
+            <w:r>
+              <w:rPr>
+                <w:bCs/>
+              </w:rPr>
+              <w:t>joint_language</w:t>
+            </w:r>
+            <w:proofErr w:type="spellEnd"/>
+            <w:r>
+              <w:rPr>
+                <w:bCs/>
+              </w:rPr>
+              <w:t xml:space="preserve"> == True </w:t>
+            </w:r>
+            <w:proofErr w:type="gramStart"/>
+            <w:r>
+              <w:rPr>
+                <w:bCs/>
+              </w:rPr>
+              <w:t>%}</w:t>
+            </w:r>
+            <w:r>
+              <w:rPr>
+                <w:bCs/>
+              </w:rPr>
+              <w:t>{</w:t>
+            </w:r>
+            <w:proofErr w:type="gramEnd"/>
+            <w:r>
+              <w:rPr>
+                <w:bCs/>
+              </w:rPr>
+              <w:t>{</w:t>
+            </w:r>
+            <w:proofErr w:type="spellStart"/>
             <w:r>
               <w:rPr>
                 <w:bCs/>
               </w:rPr>
               <w:t>joint_owner</w:t>
             </w:r>
+            <w:proofErr w:type="spellEnd"/>
             <w:r>
               <w:rPr>
                 <w:bCs/>
@@ -378,12 +461,35 @@
               </w:rPr>
               <w:t xml:space="preserve"> </w:t>
             </w:r>
-            <w:r>
-              <w:rPr>
-                <w:bCs/>
-              </w:rPr>
-              <w:t>name_full()</w:t>
-            </w:r>
+            <w:proofErr w:type="spellStart"/>
+            <w:r>
+              <w:rPr>
+                <w:bCs/>
+              </w:rPr>
+              <w:t>name_</w:t>
+            </w:r>
+            <w:proofErr w:type="gramStart"/>
+            <w:r>
+              <w:rPr>
+                <w:bCs/>
+              </w:rPr>
+              <w:t>full</w:t>
+            </w:r>
+            <w:proofErr w:type="spellEnd"/>
+            <w:r>
+              <w:rPr>
+                <w:bCs/>
+              </w:rPr>
+              <w:t>(</w:t>
+            </w:r>
+            <w:proofErr w:type="gramEnd"/>
+            <w:r>
+              <w:rPr>
+                <w:bCs/>
+              </w:rPr>
+              <w:t>)</w:t>
+            </w:r>
+            <w:proofErr w:type="gramStart"/>
             <w:r>
               <w:rPr>
                 <w:bCs/>
@@ -394,7 +500,14 @@
               <w:rPr>
                 <w:bCs/>
               </w:rPr>
-              <w:t>{% endif %}</w:t>
+              <w:t>{</w:t>
+            </w:r>
+            <w:proofErr w:type="gramEnd"/>
+            <w:r>
+              <w:rPr>
+                <w:bCs/>
+              </w:rPr>
+              <w:t>% endif %}</w:t>
             </w:r>
           </w:p>
         </w:tc>
@@ -441,19 +554,55 @@
               <w:rPr>
                 <w:bCs/>
               </w:rPr>
-              <w:t>{% if joint_language == True %}</w:t>
-            </w:r>
-            <w:r>
-              <w:rPr>
-                <w:bCs/>
-              </w:rPr>
-              <w:t>{{</w:t>
-            </w:r>
-            <w:r>
-              <w:rPr>
-                <w:bCs/>
-              </w:rPr>
-              <w:t>joint_owner</w:t>
+              <w:t xml:space="preserve">{% if </w:t>
+            </w:r>
+            <w:proofErr w:type="spellStart"/>
+            <w:r>
+              <w:rPr>
+                <w:bCs/>
+              </w:rPr>
+              <w:t>joint_language</w:t>
+            </w:r>
+            <w:proofErr w:type="spellEnd"/>
+            <w:r>
+              <w:rPr>
+                <w:bCs/>
+              </w:rPr>
+              <w:t xml:space="preserve"> == True </w:t>
+            </w:r>
+            <w:proofErr w:type="gramStart"/>
+            <w:r>
+              <w:rPr>
+                <w:bCs/>
+              </w:rPr>
+              <w:t>%}</w:t>
+            </w:r>
+            <w:r>
+              <w:rPr>
+                <w:bCs/>
+              </w:rPr>
+              <w:t>{</w:t>
+            </w:r>
+            <w:proofErr w:type="gramEnd"/>
+            <w:r>
+              <w:rPr>
+                <w:bCs/>
+              </w:rPr>
+              <w:t>{</w:t>
+            </w:r>
+            <w:proofErr w:type="spellStart"/>
+            <w:r>
+              <w:rPr>
+                <w:bCs/>
+              </w:rPr>
+              <w:t>joint_</w:t>
+            </w:r>
+            <w:proofErr w:type="gramStart"/>
+            <w:r>
+              <w:rPr>
+                <w:bCs/>
+              </w:rPr>
+              <w:t>owner</w:t>
             </w:r>
             <w:r>
               <w:rPr>
@@ -465,7 +614,14 @@
               <w:rPr>
                 <w:bCs/>
               </w:rPr>
-              <w:t>address.line_</w:t>
+              <w:t>address</w:t>
+            </w:r>
+            <w:proofErr w:type="gramEnd"/>
+            <w:r>
+              <w:rPr>
+                <w:bCs/>
+              </w:rPr>
+              <w:t>.line_</w:t>
             </w:r>
             <w:r>
               <w:rPr>
@@ -473,6 +629,7 @@
               </w:rPr>
               <w:t>one</w:t>
             </w:r>
+            <w:proofErr w:type="spellEnd"/>
             <w:r>
               <w:rPr>
                 <w:bCs/>
@@ -489,13 +646,27 @@
               <w:rPr>
                 <w:bCs/>
               </w:rPr>
-              <w:t>)}}</w:t>
-            </w:r>
-            <w:r>
-              <w:rPr>
-                <w:bCs/>
-              </w:rPr>
-              <w:t>{% endif %}</w:t>
+              <w:t>)</w:t>
+            </w:r>
+            <w:proofErr w:type="gramStart"/>
+            <w:r>
+              <w:rPr>
+                <w:bCs/>
+              </w:rPr>
+              <w:t>}}</w:t>
+            </w:r>
+            <w:r>
+              <w:rPr>
+                <w:bCs/>
+              </w:rPr>
+              <w:t>{</w:t>
+            </w:r>
+            <w:proofErr w:type="gramEnd"/>
+            <w:r>
+              <w:rPr>
+                <w:bCs/>
+              </w:rPr>
+              <w:t>% endif %}</w:t>
             </w:r>
           </w:p>
         </w:tc>
@@ -535,19 +706,73 @@
               <w:rPr>
                 <w:bCs/>
               </w:rPr>
-              <w:t>{% if joint_language == True %}</w:t>
-            </w:r>
-            <w:r>
-              <w:t>{{</w:t>
-            </w:r>
-            <w:r>
-              <w:t>joint_owner</w:t>
-            </w:r>
-            <w:r>
-              <w:t>.address.line_two()}}</w:t>
-            </w:r>
-            <w:r>
-              <w:t>{% endif %}</w:t>
+              <w:t xml:space="preserve">{% if </w:t>
+            </w:r>
+            <w:proofErr w:type="spellStart"/>
+            <w:r>
+              <w:rPr>
+                <w:bCs/>
+              </w:rPr>
+              <w:t>joint_language</w:t>
+            </w:r>
+            <w:proofErr w:type="spellEnd"/>
+            <w:r>
+              <w:rPr>
+                <w:bCs/>
+              </w:rPr>
+              <w:t xml:space="preserve"> == True </w:t>
+            </w:r>
+            <w:proofErr w:type="gramStart"/>
+            <w:r>
+              <w:rPr>
+                <w:bCs/>
+              </w:rPr>
+              <w:t>%}</w:t>
+            </w:r>
+            <w:r>
+              <w:t>{</w:t>
+            </w:r>
+            <w:proofErr w:type="gramEnd"/>
+            <w:r>
+              <w:t>{</w:t>
+            </w:r>
+            <w:proofErr w:type="spellStart"/>
+            <w:r>
+              <w:t>joint_</w:t>
+            </w:r>
+            <w:proofErr w:type="gramStart"/>
+            <w:r>
+              <w:t>owner</w:t>
+            </w:r>
+            <w:r>
+              <w:t>.address</w:t>
+            </w:r>
+            <w:proofErr w:type="gramEnd"/>
+            <w:r>
+              <w:t>.line_</w:t>
+            </w:r>
+            <w:proofErr w:type="gramStart"/>
+            <w:r>
+              <w:t>two</w:t>
+            </w:r>
+            <w:proofErr w:type="spellEnd"/>
+            <w:r>
+              <w:t>(</w:t>
+            </w:r>
+            <w:proofErr w:type="gramEnd"/>
+            <w:r>
+              <w:t>)</w:t>
+            </w:r>
+            <w:proofErr w:type="gramStart"/>
+            <w:r>
+              <w:t>}}</w:t>
+            </w:r>
+            <w:r>
+              <w:t>{</w:t>
+            </w:r>
+            <w:proofErr w:type="gramEnd"/>
+            <w:r>
+              <w:t>% endif %}</w:t>
             </w:r>
           </w:p>
         </w:tc>
@@ -641,8 +866,13 @@
       <w:r>
         <w:t xml:space="preserve"> {{users[0].</w:t>
       </w:r>
-      <w:r>
-        <w:t>name_full()</w:t>
+      <w:proofErr w:type="spellStart"/>
+      <w:r>
+        <w:t>name_full</w:t>
+      </w:r>
+      <w:proofErr w:type="spellEnd"/>
+      <w:r>
+        <w:t>()</w:t>
       </w:r>
       <w:r>
         <w:t>}</w:t>
@@ -654,11 +884,36 @@
         <w:t xml:space="preserve"> </w:t>
       </w:r>
       <w:r>
-        <w:t>({{users[0].marital_status}}), residing at {{users[0].address.on_one_line(bare=True)}},</w:t>
-      </w:r>
-      <w:r>
-        <w:t xml:space="preserve"> {% if joint_language == True %}and {{</w:t>
-      </w:r>
+        <w:t>({{users[0].</w:t>
+      </w:r>
+      <w:proofErr w:type="spellStart"/>
+      <w:r>
+        <w:t>marital_status</w:t>
+      </w:r>
+      <w:proofErr w:type="spellEnd"/>
+      <w:r>
+        <w:t>}}), residing at {{users[0].</w:t>
+      </w:r>
+      <w:proofErr w:type="spellStart"/>
+      <w:r>
+        <w:t>address.on_one_line</w:t>
+      </w:r>
+      <w:proofErr w:type="spellEnd"/>
+      <w:r>
+        <w:t>(bare=True)}},</w:t>
+      </w:r>
+      <w:r>
+        <w:t xml:space="preserve"> {% if </w:t>
+      </w:r>
+      <w:proofErr w:type="spellStart"/>
+      <w:r>
+        <w:t>joint_language</w:t>
+      </w:r>
+      <w:proofErr w:type="spellEnd"/>
+      <w:r>
+        <w:t xml:space="preserve"> == True %}and {{</w:t>
+      </w:r>
+      <w:proofErr w:type="spellStart"/>
       <w:r>
         <w:t>joint_owner</w:t>
       </w:r>
@@ -666,7 +921,11 @@
         <w:t>.</w:t>
       </w:r>
       <w:r>
-        <w:t>name_full()</w:t>
+        <w:t>name_full</w:t>
+      </w:r>
+      <w:proofErr w:type="spellEnd"/>
+      <w:r>
+        <w:t>()</w:t>
       </w:r>
       <w:r>
         <w:t>}</w:t>
@@ -677,17 +936,27 @@
       <w:r>
         <w:t>({{</w:t>
       </w:r>
+      <w:proofErr w:type="spellStart"/>
       <w:r>
         <w:t>joint_owner</w:t>
       </w:r>
       <w:r>
-        <w:t>.marital_status}}), residing at {{</w:t>
-      </w:r>
+        <w:t>.marital_status</w:t>
+      </w:r>
+      <w:proofErr w:type="spellEnd"/>
+      <w:r>
+        <w:t>}}), residing at {{</w:t>
+      </w:r>
+      <w:proofErr w:type="spellStart"/>
       <w:r>
         <w:t>joint_owner</w:t>
       </w:r>
       <w:r>
-        <w:t>.address.on_one_line(bare=True)}}</w:t>
+        <w:t>.address.on_one_line</w:t>
+      </w:r>
+      <w:proofErr w:type="spellEnd"/>
+      <w:r>
+        <w:t>(bare=True)}}</w:t>
       </w:r>
       <w:r>
         <w:t xml:space="preserve"> execute {% else %}executes {% endif %}</w:t>
@@ -695,15 +964,29 @@
       <w:r>
         <w:t>this transfer on death instrument. {{users[0].</w:t>
       </w:r>
-      <w:r>
-        <w:t>name_full()</w:t>
+      <w:proofErr w:type="spellStart"/>
+      <w:r>
+        <w:t>name_full</w:t>
+      </w:r>
+      <w:proofErr w:type="spellEnd"/>
+      <w:r>
+        <w:t>()</w:t>
       </w:r>
       <w:r>
         <w:t>}}</w:t>
       </w:r>
       <w:r>
-        <w:t xml:space="preserve"> {% if joint_language == True %}and {{</w:t>
-      </w:r>
+        <w:t xml:space="preserve"> {% if </w:t>
+      </w:r>
+      <w:proofErr w:type="spellStart"/>
+      <w:r>
+        <w:t>joint_language</w:t>
+      </w:r>
+      <w:proofErr w:type="spellEnd"/>
+      <w:r>
+        <w:t xml:space="preserve"> == True %}and {{</w:t>
+      </w:r>
+      <w:proofErr w:type="spellStart"/>
       <w:r>
         <w:t>joint_owner</w:t>
       </w:r>
@@ -711,7 +994,11 @@
         <w:t>.</w:t>
       </w:r>
       <w:r>
-        <w:t>name_full()</w:t>
+        <w:t>name_full</w:t>
+      </w:r>
+      <w:proofErr w:type="spellEnd"/>
+      <w:r>
+        <w:t>()</w:t>
       </w:r>
       <w:r>
         <w:t>}</w:t>
@@ -720,10 +1007,26 @@
         <w:t>}</w:t>
       </w:r>
       <w:r>
-        <w:t xml:space="preserve"> {% endif %}will transfer upon their {{death_or_deaths}}</w:t>
-      </w:r>
-      <w:r>
-        <w:t xml:space="preserve">{% if other_owners_check != </w:t>
+        <w:t xml:space="preserve"> {% endif %}will transfer upon their {{</w:t>
+      </w:r>
+      <w:proofErr w:type="spellStart"/>
+      <w:r>
+        <w:t>death_or_deaths</w:t>
+      </w:r>
+      <w:proofErr w:type="spellEnd"/>
+      <w:r>
+        <w:t>}}</w:t>
+      </w:r>
+      <w:r>
+        <w:t xml:space="preserve">{% if </w:t>
+      </w:r>
+      <w:proofErr w:type="spellStart"/>
+      <w:r>
+        <w:t>other_owners_check</w:t>
+      </w:r>
+      <w:proofErr w:type="spellEnd"/>
+      <w:r>
+        <w:t xml:space="preserve"> != </w:t>
       </w:r>
       <w:r>
         <w:t>“</w:t>
@@ -737,9 +1040,11 @@
       <w:r>
         <w:t xml:space="preserve"> %}{% if </w:t>
       </w:r>
+      <w:proofErr w:type="spellStart"/>
       <w:r>
         <w:t>shared_owners_type</w:t>
       </w:r>
+      <w:proofErr w:type="spellEnd"/>
       <w:r>
         <w:t xml:space="preserve"> == “</w:t>
       </w:r>
@@ -752,9 +1057,11 @@
       <w:r>
         <w:t>{{</w:t>
       </w:r>
+      <w:proofErr w:type="spellStart"/>
       <w:r>
         <w:t>user_common_share</w:t>
       </w:r>
+      <w:proofErr w:type="spellEnd"/>
       <w:r>
         <w:t>}}</w:t>
       </w:r>
@@ -777,16 +1084,40 @@
         <w:t xml:space="preserve"> </w:t>
       </w:r>
       <w:r>
-        <w:t>the following residential real estate</w:t>
-      </w:r>
-      <w:r>
-        <w:t>{% if other_owners_check == “sole” %}</w:t>
+        <w:t>the following real estate</w:t>
+      </w:r>
+      <w:r>
+        <w:t xml:space="preserve">{% if </w:t>
+      </w:r>
+      <w:proofErr w:type="spellStart"/>
+      <w:r>
+        <w:t>other_owners_check</w:t>
+      </w:r>
+      <w:proofErr w:type="spellEnd"/>
+      <w:r>
+        <w:t xml:space="preserve"> == “sole” %}</w:t>
       </w:r>
       <w:r>
         <w:t xml:space="preserve"> in its entirety</w:t>
       </w:r>
       <w:r>
-        <w:t xml:space="preserve">{% elif joint_language == True %} in its entirety{% endif %}: </w:t>
+        <w:t xml:space="preserve">{% </w:t>
+      </w:r>
+      <w:proofErr w:type="spellStart"/>
+      <w:r>
+        <w:t>elif</w:t>
+      </w:r>
+      <w:proofErr w:type="spellEnd"/>
+      <w:r>
+        <w:t xml:space="preserve"> </w:t>
+      </w:r>
+      <w:proofErr w:type="spellStart"/>
+      <w:r>
+        <w:t>joint_language</w:t>
+      </w:r>
+      <w:proofErr w:type="spellEnd"/>
+      <w:r>
+        <w:t xml:space="preserve"> == True %} in its entirety{% endif %}: </w:t>
       </w:r>
     </w:p>
     <w:p>
@@ -802,14 +1133,24 @@
         <w:t>{</w:t>
       </w:r>
       <w:r>
-        <w:t>{todi_property.</w:t>
+        <w:t>{</w:t>
+      </w:r>
+      <w:proofErr w:type="spellStart"/>
+      <w:r>
+        <w:t>todi_</w:t>
+      </w:r>
+      <w:proofErr w:type="gramStart"/>
+      <w:r>
+        <w:t>property.</w:t>
       </w:r>
       <w:r>
         <w:t>line</w:t>
       </w:r>
+      <w:proofErr w:type="gramEnd"/>
       <w:r>
         <w:t>_one</w:t>
       </w:r>
+      <w:proofErr w:type="spellEnd"/>
       <w:r>
         <w:t>(</w:t>
       </w:r>
@@ -817,28 +1158,75 @@
         <w:rPr>
           <w:bCs/>
         </w:rPr>
-        <w:t>bare=True</w:t>
-      </w:r>
-      <w:r>
-        <w:t>)}}, {{todi_property</w:t>
-      </w:r>
-      <w:r>
-        <w:t>.city}},</w:t>
+        <w:t>bare=</w:t>
+      </w:r>
+      <w:proofErr w:type="gramStart"/>
+      <w:r>
+        <w:rPr>
+          <w:bCs/>
+        </w:rPr>
+        <w:t>True</w:t>
+      </w:r>
+      <w:r>
+        <w:t>)}}</w:t>
+      </w:r>
+      <w:proofErr w:type="gramEnd"/>
+      <w:r>
+        <w:t>, {{</w:t>
+      </w:r>
+      <w:proofErr w:type="spellStart"/>
+      <w:r>
+        <w:t>todi_</w:t>
+      </w:r>
+      <w:proofErr w:type="gramStart"/>
+      <w:r>
+        <w:t>property</w:t>
+      </w:r>
+      <w:r>
+        <w:t>.city</w:t>
+      </w:r>
+      <w:proofErr w:type="spellEnd"/>
+      <w:proofErr w:type="gramEnd"/>
+      <w:r>
+        <w:t>}},</w:t>
       </w:r>
       <w:r>
         <w:t xml:space="preserve"> </w:t>
       </w:r>
       <w:r>
-        <w:t>{{todi_property</w:t>
+        <w:t>{{</w:t>
+      </w:r>
+      <w:proofErr w:type="spellStart"/>
+      <w:r>
+        <w:t>todi_</w:t>
+      </w:r>
+      <w:proofErr w:type="gramStart"/>
+      <w:r>
+        <w:t>property</w:t>
       </w:r>
       <w:r>
         <w:t>.county</w:t>
       </w:r>
+      <w:proofErr w:type="spellEnd"/>
+      <w:proofErr w:type="gramEnd"/>
       <w:r>
         <w:t>}}</w:t>
       </w:r>
       <w:r>
-        <w:t>, {{todi_property.state}} {{todi_property</w:t>
+        <w:t>, {{</w:t>
+      </w:r>
+      <w:proofErr w:type="spellStart"/>
+      <w:r>
+        <w:t>todi_</w:t>
+      </w:r>
+      <w:proofErr w:type="gramStart"/>
+      <w:r>
+        <w:t>property.state</w:t>
+      </w:r>
+      <w:proofErr w:type="spellEnd"/>
+      <w:proofErr w:type="gramEnd"/>
+      <w:r>
+        <w:t>}} {{todi_property</w:t>
       </w:r>
       <w:r>
         <w:t>.zip}}</w:t>
@@ -852,7 +1240,15 @@
         <w:t>Index</w:t>
       </w:r>
       <w:r>
-        <w:t xml:space="preserve"> Number (“PIN”): {{todi_property.pin}}</w:t>
+        <w:t xml:space="preserve"> Number (“PIN”): {{</w:t>
+      </w:r>
+      <w:proofErr w:type="spellStart"/>
+      <w:r>
+        <w:t>todi_property.pin</w:t>
+      </w:r>
+      <w:proofErr w:type="spellEnd"/>
+      <w:r>
+        <w:t>}}</w:t>
       </w:r>
     </w:p>
     <w:p>
@@ -873,7 +1269,29 @@
         <w:rPr>
           <w:bCs/>
         </w:rPr>
-        <w:t>{{todi_property.description}}</w:t>
+        <w:t>{{</w:t>
+      </w:r>
+      <w:proofErr w:type="spellStart"/>
+      <w:r>
+        <w:rPr>
+          <w:bCs/>
+        </w:rPr>
+        <w:t>todi_</w:t>
+      </w:r>
+      <w:proofErr w:type="gramStart"/>
+      <w:r>
+        <w:rPr>
+          <w:bCs/>
+        </w:rPr>
+        <w:t>property.description</w:t>
+      </w:r>
+      <w:proofErr w:type="spellEnd"/>
+      <w:proofErr w:type="gramEnd"/>
+      <w:r>
+        <w:rPr>
+          <w:bCs/>
+        </w:rPr>
+        <w:t>}}</w:t>
       </w:r>
     </w:p>
     <w:p>
@@ -935,7 +1353,23 @@
                 <w:b/>
                 <w:spacing w:val="-4"/>
               </w:rPr>
-              <w:t>Beneficiary Name,  Relationship to Owner</w:t>
+              <w:t xml:space="preserve">Beneficiary </w:t>
+            </w:r>
+            <w:proofErr w:type="gramStart"/>
+            <w:r>
+              <w:rPr>
+                <w:b/>
+                <w:spacing w:val="-4"/>
+              </w:rPr>
+              <w:t>Name,  Relationship</w:t>
+            </w:r>
+            <w:proofErr w:type="gramEnd"/>
+            <w:r>
+              <w:rPr>
+                <w:b/>
+                <w:spacing w:val="-4"/>
+              </w:rPr>
+              <w:t xml:space="preserve"> to Owner</w:t>
             </w:r>
           </w:p>
         </w:tc>
@@ -985,8 +1419,13 @@
     </w:tbl>
     <w:p>
       <w:r>
-        <w:t>{% for person in beneficiaries %}</w:t>
-      </w:r>
+        <w:t xml:space="preserve">{% for person in </w:t>
+      </w:r>
+      <w:proofErr w:type="gramStart"/>
+      <w:r>
+        <w:t>beneficiaries %}</w:t>
+      </w:r>
+      <w:proofErr w:type="gramEnd"/>
     </w:p>
     <w:tbl>
       <w:tblPr>
@@ -1010,14 +1449,31 @@
           </w:tcPr>
           <w:p>
             <w:r>
-              <w:t>{{person.</w:t>
-            </w:r>
-            <w:r>
-              <w:t>name_full()</w:t>
+              <w:t>{{</w:t>
+            </w:r>
+            <w:proofErr w:type="spellStart"/>
+            <w:r>
+              <w:t>person.</w:t>
+            </w:r>
+            <w:r>
+              <w:t>name_</w:t>
+            </w:r>
+            <w:proofErr w:type="gramStart"/>
+            <w:r>
+              <w:t>full</w:t>
+            </w:r>
+            <w:proofErr w:type="spellEnd"/>
+            <w:r>
+              <w:t>(</w:t>
+            </w:r>
+            <w:proofErr w:type="gramEnd"/>
+            <w:r>
+              <w:t>)</w:t>
             </w:r>
             <w:r>
               <w:t>}}</w:t>
             </w:r>
+            <w:proofErr w:type="gramStart"/>
             <w:r>
               <w:t>,</w:t>
             </w:r>
@@ -1025,19 +1481,72 @@
               <w:t xml:space="preserve"> </w:t>
             </w:r>
             <w:r>
-              <w:t>{% if joint_language == True %}</w:t>
-            </w:r>
-            <w:r>
-              <w:t>{{person.relationship</w:t>
-            </w:r>
+              <w:t>{%</w:t>
+            </w:r>
+            <w:proofErr w:type="gramEnd"/>
+            <w:r>
+              <w:t xml:space="preserve"> if </w:t>
+            </w:r>
+            <w:proofErr w:type="spellStart"/>
+            <w:r>
+              <w:t>joint_language</w:t>
+            </w:r>
+            <w:proofErr w:type="spellEnd"/>
+            <w:r>
+              <w:t xml:space="preserve"> == True </w:t>
+            </w:r>
+            <w:proofErr w:type="gramStart"/>
+            <w:r>
+              <w:t>%}</w:t>
+            </w:r>
+            <w:r>
+              <w:t>{</w:t>
+            </w:r>
+            <w:proofErr w:type="gramEnd"/>
+            <w:r>
+              <w:t>{</w:t>
+            </w:r>
+            <w:proofErr w:type="spellStart"/>
+            <w:proofErr w:type="gramStart"/>
+            <w:r>
+              <w:t>person.relationship</w:t>
+            </w:r>
+            <w:proofErr w:type="gramEnd"/>
             <w:r>
               <w:t>_info</w:t>
             </w:r>
+            <w:proofErr w:type="spellEnd"/>
+            <w:proofErr w:type="gramStart"/>
             <w:r>
               <w:t>}}</w:t>
             </w:r>
             <w:r>
-              <w:t>{% else %}{{person.relationship}}{% endif %}</w:t>
+              <w:t>{</w:t>
+            </w:r>
+            <w:proofErr w:type="gramEnd"/>
+            <w:r>
+              <w:t xml:space="preserve">% else </w:t>
+            </w:r>
+            <w:proofErr w:type="gramStart"/>
+            <w:r>
+              <w:t>%}{</w:t>
+            </w:r>
+            <w:proofErr w:type="gramEnd"/>
+            <w:r>
+              <w:t>{</w:t>
+            </w:r>
+            <w:proofErr w:type="spellStart"/>
+            <w:proofErr w:type="gramStart"/>
+            <w:r>
+              <w:t>person.relationship</w:t>
+            </w:r>
+            <w:proofErr w:type="spellEnd"/>
+            <w:r>
+              <w:t>}}{</w:t>
+            </w:r>
+            <w:proofErr w:type="gramEnd"/>
+            <w:r>
+              <w:t>% endif %}</w:t>
             </w:r>
           </w:p>
         </w:tc>
@@ -1047,10 +1556,39 @@
           </w:tcPr>
           <w:p>
             <w:r>
-              <w:t>{% if person.in_america == True %}</w:t>
-            </w:r>
-            <w:r>
-              <w:t>{{person.address.on_one_line(</w:t>
+              <w:t xml:space="preserve">{% if </w:t>
+            </w:r>
+            <w:proofErr w:type="spellStart"/>
+            <w:r>
+              <w:t>person.in_america</w:t>
+            </w:r>
+            <w:proofErr w:type="spellEnd"/>
+            <w:r>
+              <w:t xml:space="preserve"> == True </w:t>
+            </w:r>
+            <w:proofErr w:type="gramStart"/>
+            <w:r>
+              <w:t>%}</w:t>
+            </w:r>
+            <w:r>
+              <w:t>{</w:t>
+            </w:r>
+            <w:proofErr w:type="gramEnd"/>
+            <w:r>
+              <w:t>{</w:t>
+            </w:r>
+            <w:proofErr w:type="spellStart"/>
+            <w:proofErr w:type="gramStart"/>
+            <w:r>
+              <w:t>person.address</w:t>
+            </w:r>
+            <w:proofErr w:type="gramEnd"/>
+            <w:r>
+              <w:t>.on_one_line</w:t>
+            </w:r>
+            <w:proofErr w:type="spellEnd"/>
+            <w:r>
+              <w:t>(</w:t>
             </w:r>
             <w:r>
               <w:rPr>
@@ -1059,16 +1597,56 @@
               <w:t>bare=True</w:t>
             </w:r>
             <w:r>
-              <w:t>)}}</w:t>
-            </w:r>
-            <w:r>
-              <w:t>{% else %}{{person.intl_address_1}}</w:t>
+              <w:t>)</w:t>
+            </w:r>
+            <w:proofErr w:type="gramStart"/>
+            <w:r>
+              <w:t>}}</w:t>
+            </w:r>
+            <w:r>
+              <w:t>{</w:t>
+            </w:r>
+            <w:proofErr w:type="gramEnd"/>
+            <w:r>
+              <w:t xml:space="preserve">% else </w:t>
+            </w:r>
+            <w:proofErr w:type="gramStart"/>
+            <w:r>
+              <w:t>%}{</w:t>
+            </w:r>
+            <w:proofErr w:type="gramEnd"/>
+            <w:r>
+              <w:t>{</w:t>
+            </w:r>
+            <w:proofErr w:type="gramStart"/>
+            <w:r>
+              <w:t>person.intl</w:t>
+            </w:r>
+            <w:proofErr w:type="gramEnd"/>
+            <w:r>
+              <w:t>_address_</w:t>
+            </w:r>
+            <w:proofErr w:type="gramStart"/>
+            <w:r>
+              <w:t>1}}</w:t>
             </w:r>
             <w:r>
               <w:t>,</w:t>
             </w:r>
             <w:r>
-              <w:t xml:space="preserve"> {{person.intl_address_2}}{% endif %}</w:t>
+              <w:t xml:space="preserve"> {{person.intl</w:t>
+            </w:r>
+            <w:proofErr w:type="gramEnd"/>
+            <w:r>
+              <w:t>_address_2</w:t>
+            </w:r>
+            <w:proofErr w:type="gramStart"/>
+            <w:r>
+              <w:t>}}{</w:t>
+            </w:r>
+            <w:proofErr w:type="gramEnd"/>
+            <w:r>
+              <w:t>% endif %}</w:t>
             </w:r>
           </w:p>
         </w:tc>
@@ -1080,25 +1658,92 @@
             <w:r>
               <w:t xml:space="preserve">{% if </w:t>
             </w:r>
+            <w:proofErr w:type="spellStart"/>
             <w:r>
               <w:t>percentage_short_enough</w:t>
             </w:r>
-            <w:r>
-              <w:t>(person.percent_share) == False %}</w:t>
-            </w:r>
-            <w:r>
-              <w:t>1/{{beneficiaries.number_gathered()}}{% else %}</w:t>
-            </w:r>
-            <w:r>
-              <w:t>{{person.</w:t>
+            <w:proofErr w:type="spellEnd"/>
+            <w:r>
+              <w:t>(</w:t>
+            </w:r>
+            <w:proofErr w:type="spellStart"/>
+            <w:proofErr w:type="gramStart"/>
+            <w:r>
+              <w:t>person.percent</w:t>
+            </w:r>
+            <w:proofErr w:type="gramEnd"/>
+            <w:r>
+              <w:t>_share</w:t>
+            </w:r>
+            <w:proofErr w:type="spellEnd"/>
+            <w:r>
+              <w:t>) == False %}</w:t>
+            </w:r>
+            <w:r>
+              <w:t>1/{{</w:t>
+            </w:r>
+            <w:proofErr w:type="spellStart"/>
+            <w:proofErr w:type="gramStart"/>
+            <w:r>
+              <w:t>beneficiaries.number</w:t>
+            </w:r>
+            <w:proofErr w:type="gramEnd"/>
+            <w:r>
+              <w:t>_</w:t>
+            </w:r>
+            <w:proofErr w:type="gramStart"/>
+            <w:r>
+              <w:t>gathered</w:t>
+            </w:r>
+            <w:proofErr w:type="spellEnd"/>
+            <w:r>
+              <w:t>(</w:t>
+            </w:r>
+            <w:proofErr w:type="gramEnd"/>
+            <w:r>
+              <w:t>)</w:t>
+            </w:r>
+            <w:proofErr w:type="gramStart"/>
+            <w:r>
+              <w:t>}}{</w:t>
+            </w:r>
+            <w:proofErr w:type="gramEnd"/>
+            <w:r>
+              <w:t xml:space="preserve">% else </w:t>
+            </w:r>
+            <w:proofErr w:type="gramStart"/>
+            <w:r>
+              <w:t>%}</w:t>
+            </w:r>
+            <w:r>
+              <w:t>{</w:t>
+            </w:r>
+            <w:proofErr w:type="gramEnd"/>
+            <w:r>
+              <w:t>{</w:t>
+            </w:r>
+            <w:proofErr w:type="spellStart"/>
+            <w:proofErr w:type="gramStart"/>
+            <w:r>
+              <w:t>person.</w:t>
             </w:r>
             <w:r>
               <w:lastRenderedPageBreak/>
-              <w:t>percent_share}}</w:t>
+              <w:t>percent</w:t>
+            </w:r>
+            <w:proofErr w:type="gramEnd"/>
+            <w:r>
+              <w:t>_share</w:t>
+            </w:r>
+            <w:proofErr w:type="spellEnd"/>
+            <w:proofErr w:type="gramStart"/>
+            <w:r>
+              <w:t>}}</w:t>
             </w:r>
             <w:r>
               <w:t>%</w:t>
             </w:r>
+            <w:proofErr w:type="gramEnd"/>
             <w:r>
               <w:t>{% endif %}</w:t>
             </w:r>
@@ -1116,7 +1761,15 @@
     <w:p>
       <w:r>
         <w:lastRenderedPageBreak/>
-        <w:t>{% endfor %}</w:t>
+        <w:t xml:space="preserve">{% </w:t>
+      </w:r>
+      <w:proofErr w:type="spellStart"/>
+      <w:r>
+        <w:t>endfor</w:t>
+      </w:r>
+      <w:proofErr w:type="spellEnd"/>
+      <w:r>
+        <w:t xml:space="preserve"> %}</w:t>
       </w:r>
     </w:p>
     <w:p>
@@ -1129,170 +1782,329 @@
     </w:p>
     <w:p>
       <w:r>
-        <w:t>{%p for person in beneficiaries %}</w:t>
-      </w:r>
+        <w:t xml:space="preserve">{%p for person in </w:t>
+      </w:r>
+      <w:proofErr w:type="gramStart"/>
+      <w:r>
+        <w:t>beneficiaries %}</w:t>
+      </w:r>
+      <w:proofErr w:type="gramEnd"/>
     </w:p>
     <w:p>
       <w:r>
-        <w:t>{%p if person.</w:t>
+        <w:t xml:space="preserve">{%p if </w:t>
+      </w:r>
+      <w:proofErr w:type="spellStart"/>
+      <w:r>
+        <w:t>person.</w:t>
       </w:r>
       <w:r>
         <w:t>has_successor</w:t>
       </w:r>
-      <w:r>
-        <w:t xml:space="preserve"> == True %}</w:t>
-      </w:r>
+      <w:proofErr w:type="spellEnd"/>
+      <w:r>
+        <w:t xml:space="preserve"> == </w:t>
+      </w:r>
+      <w:proofErr w:type="gramStart"/>
+      <w:r>
+        <w:t>True %}</w:t>
+      </w:r>
+      <w:proofErr w:type="gramEnd"/>
     </w:p>
     <w:p>
       <w:r>
         <w:t xml:space="preserve">If </w:t>
       </w:r>
       <w:r>
+        <w:t>{{</w:t>
+      </w:r>
+      <w:proofErr w:type="spellStart"/>
+      <w:r>
+        <w:t>person.</w:t>
+      </w:r>
+      <w:r>
+        <w:t>name_</w:t>
+      </w:r>
+      <w:proofErr w:type="gramStart"/>
+      <w:r>
+        <w:t>full</w:t>
+      </w:r>
+      <w:proofErr w:type="spellEnd"/>
+      <w:r>
+        <w:t>(</w:t>
+      </w:r>
+      <w:proofErr w:type="gramEnd"/>
+      <w:r>
+        <w:t>)</w:t>
+      </w:r>
+      <w:r>
+        <w:t>}</w:t>
+      </w:r>
+      <w:r>
+        <w:t>}</w:t>
+      </w:r>
+      <w:r>
+        <w:t xml:space="preserve"> pre</w:t>
+      </w:r>
+      <w:r>
+        <w:t>d</w:t>
+      </w:r>
+      <w:r>
+        <w:t xml:space="preserve">eceases </w:t>
+      </w:r>
+      <w:proofErr w:type="gramStart"/>
+      <w:r>
+        <w:t xml:space="preserve">{{ </w:t>
+      </w:r>
+      <w:proofErr w:type="spellStart"/>
+      <w:r>
+        <w:t>me</w:t>
+      </w:r>
+      <w:proofErr w:type="gramEnd"/>
+      <w:r>
+        <w:t>_or_</w:t>
+      </w:r>
+      <w:proofErr w:type="gramStart"/>
+      <w:r>
+        <w:t>us</w:t>
+      </w:r>
+      <w:proofErr w:type="spellEnd"/>
+      <w:r>
+        <w:t>}}</w:t>
+      </w:r>
+      <w:r>
+        <w:t>,</w:t>
+      </w:r>
+      <w:proofErr w:type="gramEnd"/>
+      <w:r>
+        <w:t xml:space="preserve"> </w:t>
+      </w:r>
+      <w:proofErr w:type="gramStart"/>
+      <w:r>
+        <w:t>then</w:t>
+      </w:r>
+      <w:r>
+        <w:t xml:space="preserve"> </w:t>
+      </w:r>
+      <w:r>
+        <w:t>{%</w:t>
+      </w:r>
+      <w:proofErr w:type="gramEnd"/>
+      <w:r>
+        <w:t xml:space="preserve"> if </w:t>
+      </w:r>
+      <w:proofErr w:type="spellStart"/>
+      <w:r>
+        <w:t>joint_language</w:t>
+      </w:r>
+      <w:proofErr w:type="spellEnd"/>
+      <w:r>
+        <w:t xml:space="preserve"> == </w:t>
+      </w:r>
+      <w:proofErr w:type="gramStart"/>
+      <w:r>
+        <w:t>False %}</w:t>
+      </w:r>
+      <w:proofErr w:type="gramEnd"/>
+      <w:r>
+        <w:t xml:space="preserve">my </w:t>
+      </w:r>
+      <w:r>
         <w:t>{{person.</w:t>
       </w:r>
       <w:r>
-        <w:t>name_full()</w:t>
-      </w:r>
-      <w:r>
-        <w:t>}</w:t>
-      </w:r>
-      <w:r>
-        <w:t>}</w:t>
-      </w:r>
-      <w:r>
-        <w:t xml:space="preserve"> pre</w:t>
-      </w:r>
-      <w:r>
-        <w:t>d</w:t>
-      </w:r>
-      <w:r>
-        <w:t xml:space="preserve">eceases </w:t>
-      </w:r>
-      <w:r>
-        <w:t>{{ me_or_us}}</w:t>
-      </w:r>
-      <w:r>
-        <w:t>, then</w:t>
-      </w:r>
-      <w:r>
         <w:t xml:space="preserve"> </w:t>
       </w:r>
-      <w:r>
-        <w:t xml:space="preserve">{% if joint_language == False %}my </w:t>
-      </w:r>
-      <w:r>
-        <w:t>{{person.</w:t>
+      <w:proofErr w:type="spellStart"/>
+      <w:r>
+        <w:t>successor_beneficiary.relationship</w:t>
+      </w:r>
+      <w:r>
+        <w:t>.lower</w:t>
+      </w:r>
+      <w:proofErr w:type="spellEnd"/>
+      <w:r>
+        <w:t>()</w:t>
+      </w:r>
+      <w:r>
+        <w:t>}}</w:t>
       </w:r>
       <w:r>
         <w:t xml:space="preserve"> </w:t>
       </w:r>
       <w:r>
-        <w:t>successor_beneficiary.relationship</w:t>
-      </w:r>
-      <w:r>
-        <w:t>.lower()</w:t>
-      </w:r>
+        <w:t>{{</w:t>
+      </w:r>
+      <w:proofErr w:type="spellStart"/>
+      <w:r>
+        <w:t>person.succes</w:t>
+      </w:r>
+      <w:r>
+        <w:t>s</w:t>
+      </w:r>
+      <w:r>
+        <w:t>or_beneficiary.</w:t>
+      </w:r>
+      <w:r>
+        <w:t>name_full</w:t>
+      </w:r>
+      <w:proofErr w:type="spellEnd"/>
+      <w:r>
+        <w:t>()</w:t>
+      </w:r>
+      <w:r>
+        <w:t>}} of {{</w:t>
+      </w:r>
+      <w:proofErr w:type="spellStart"/>
+      <w:r>
+        <w:t>person.successor_beneficiary.address.city</w:t>
+      </w:r>
+      <w:proofErr w:type="spellEnd"/>
+      <w:r>
+        <w:t xml:space="preserve">}}, </w:t>
+      </w:r>
+      <w:r>
+        <w:t xml:space="preserve">{% if </w:t>
+      </w:r>
+      <w:proofErr w:type="spellStart"/>
+      <w:r>
+        <w:t>person.successor_beneficiary.in_america</w:t>
+      </w:r>
+      <w:proofErr w:type="spellEnd"/>
+      <w:r>
+        <w:t xml:space="preserve"> == True %}</w:t>
+      </w:r>
+      <w:r>
+        <w:t>{{</w:t>
+      </w:r>
+      <w:proofErr w:type="spellStart"/>
+      <w:r>
+        <w:t>person.successor_beneficiary.address.</w:t>
+      </w:r>
+      <w:r>
+        <w:t>state</w:t>
+      </w:r>
+      <w:proofErr w:type="spellEnd"/>
       <w:r>
         <w:t>}}</w:t>
       </w:r>
       <w:r>
+        <w:t>{% else %}</w:t>
+      </w:r>
+      <w:r>
+        <w:t>{{</w:t>
+      </w:r>
+      <w:proofErr w:type="spellStart"/>
+      <w:r>
+        <w:t>person.successor_beneficiary.country</w:t>
+      </w:r>
+      <w:proofErr w:type="spellEnd"/>
+      <w:r>
+        <w:t>}}{% endif %}</w:t>
+      </w:r>
+      <w:r>
+        <w:t>{% else %}{{</w:t>
+      </w:r>
+      <w:proofErr w:type="spellStart"/>
+      <w:r>
+        <w:t>person.successor_beneficiary.</w:t>
+      </w:r>
+      <w:r>
+        <w:t>name_full</w:t>
+      </w:r>
+      <w:proofErr w:type="spellEnd"/>
+      <w:r>
+        <w:t>()</w:t>
+      </w:r>
+      <w:r>
+        <w:t xml:space="preserve">}} </w:t>
+      </w:r>
+      <w:r>
+        <w:t>(</w:t>
+      </w:r>
+      <w:r>
+        <w:t>{{</w:t>
+      </w:r>
+      <w:proofErr w:type="spellStart"/>
+      <w:r>
+        <w:t>person.successor_beneficiary.relationship_info</w:t>
+      </w:r>
+      <w:proofErr w:type="spellEnd"/>
+      <w:r>
+        <w:t>}}</w:t>
+      </w:r>
+      <w:r>
+        <w:t>)</w:t>
+      </w:r>
+      <w:r>
+        <w:t xml:space="preserve"> of</w:t>
+      </w:r>
+      <w:r>
         <w:t xml:space="preserve"> </w:t>
       </w:r>
       <w:r>
-        <w:t>{{person.succes</w:t>
-      </w:r>
-      <w:r>
-        <w:t>s</w:t>
-      </w:r>
-      <w:r>
-        <w:t>or_beneficiary.</w:t>
-      </w:r>
-      <w:r>
-        <w:t>name_full()</w:t>
-      </w:r>
-      <w:r>
-        <w:t>}} of {{</w:t>
-      </w:r>
+        <w:t>{{</w:t>
+      </w:r>
+      <w:proofErr w:type="spellStart"/>
       <w:r>
         <w:t>person.successor_beneficiary.address.city</w:t>
       </w:r>
+      <w:proofErr w:type="spellEnd"/>
       <w:r>
         <w:t xml:space="preserve">}}, </w:t>
       </w:r>
       <w:r>
-        <w:t>{% if person.successor_beneficiary.in_america == True %}</w:t>
+        <w:t xml:space="preserve">{% if </w:t>
+      </w:r>
+      <w:proofErr w:type="spellStart"/>
+      <w:r>
+        <w:t>person.successor_beneficiary.in_america</w:t>
+      </w:r>
+      <w:proofErr w:type="spellEnd"/>
+      <w:r>
+        <w:t xml:space="preserve"> == True %}{{</w:t>
+      </w:r>
+      <w:proofErr w:type="spellStart"/>
+      <w:r>
+        <w:t>person.successor_beneficiary.address.</w:t>
+      </w:r>
+      <w:r>
+        <w:t>state</w:t>
+      </w:r>
+      <w:proofErr w:type="spellEnd"/>
+      <w:r>
+        <w:t>}}</w:t>
+      </w:r>
+      <w:r>
+        <w:t>{% else %}</w:t>
       </w:r>
       <w:r>
         <w:t>{{</w:t>
       </w:r>
-      <w:r>
-        <w:t>person.successor_beneficiary.address.</w:t>
-      </w:r>
-      <w:r>
-        <w:t>state}}</w:t>
-      </w:r>
-      <w:r>
-        <w:t>{% else %}</w:t>
-      </w:r>
-      <w:r>
-        <w:t>{{person.successor_beneficiary.country}}{% endif %}</w:t>
-      </w:r>
-      <w:r>
-        <w:t>{% else %}{{person.successor_beneficiary.</w:t>
-      </w:r>
-      <w:r>
-        <w:t>name_full()</w:t>
-      </w:r>
-      <w:r>
-        <w:t xml:space="preserve">}} </w:t>
-      </w:r>
-      <w:r>
-        <w:t>(</w:t>
-      </w:r>
-      <w:r>
-        <w:t>{{person.successor_beneficiary.relationship_info}}</w:t>
-      </w:r>
-      <w:r>
-        <w:t>)</w:t>
-      </w:r>
-      <w:r>
-        <w:t xml:space="preserve"> of</w:t>
-      </w:r>
-      <w:r>
-        <w:t xml:space="preserve"> </w:t>
+      <w:proofErr w:type="spellStart"/>
+      <w:r>
+        <w:t>person.successor_beneficiary.country</w:t>
+      </w:r>
+      <w:proofErr w:type="spellEnd"/>
+      <w:r>
+        <w:t>}}{% endif %}</w:t>
+      </w:r>
+      <w:r>
+        <w:t xml:space="preserve">{% endif %} </w:t>
+      </w:r>
+      <w:r>
+        <w:t xml:space="preserve">is </w:t>
       </w:r>
       <w:r>
         <w:t>{{</w:t>
       </w:r>
-      <w:r>
-        <w:t>person.successor_beneficiary.address.city</w:t>
-      </w:r>
-      <w:r>
-        <w:t xml:space="preserve">}}, </w:t>
-      </w:r>
-      <w:r>
-        <w:t>{% if person.successor_beneficiary.in_america == True %}{{</w:t>
-      </w:r>
-      <w:r>
-        <w:t>person.successor_beneficiary.address.</w:t>
-      </w:r>
-      <w:r>
-        <w:t>state}}</w:t>
-      </w:r>
-      <w:r>
-        <w:t>{% else %}</w:t>
-      </w:r>
-      <w:r>
-        <w:t>{{person.successor_beneficiary.country}}{% endif %}</w:t>
-      </w:r>
-      <w:r>
-        <w:t xml:space="preserve">{% endif %} </w:t>
-      </w:r>
-      <w:r>
-        <w:t xml:space="preserve">is </w:t>
-      </w:r>
-      <w:r>
-        <w:t>{{my_or_our}}</w:t>
+      <w:proofErr w:type="spellStart"/>
+      <w:r>
+        <w:t>my_or_our</w:t>
+      </w:r>
+      <w:proofErr w:type="spellEnd"/>
+      <w:r>
+        <w:t>}}</w:t>
       </w:r>
       <w:r>
         <w:t xml:space="preserve"> successor beneficiary</w:t>
@@ -1311,13 +2123,28 @@
     </w:p>
     <w:p>
       <w:r>
-        <w:t>{%p endif %}</w:t>
-      </w:r>
+        <w:t xml:space="preserve">{%p </w:t>
+      </w:r>
+      <w:proofErr w:type="gramStart"/>
+      <w:r>
+        <w:t>endif %}</w:t>
+      </w:r>
+      <w:proofErr w:type="gramEnd"/>
     </w:p>
     <w:p>
       <w:r>
-        <w:t>{%p endfor %}</w:t>
-      </w:r>
+        <w:t xml:space="preserve">{%p </w:t>
+      </w:r>
+      <w:proofErr w:type="spellStart"/>
+      <w:proofErr w:type="gramStart"/>
+      <w:r>
+        <w:t>endfor</w:t>
+      </w:r>
+      <w:proofErr w:type="spellEnd"/>
+      <w:r>
+        <w:t xml:space="preserve"> %}</w:t>
+      </w:r>
+      <w:proofErr w:type="gramEnd"/>
     </w:p>
     <w:p>
       <w:pPr>
@@ -1332,8 +2159,13 @@
       <w:r>
         <w:t xml:space="preserve">{% if </w:t>
       </w:r>
-      <w:r>
-        <w:t>beneficiaries.number()</w:t>
+      <w:proofErr w:type="spellStart"/>
+      <w:r>
+        <w:t>beneficiaries.number</w:t>
+      </w:r>
+      <w:proofErr w:type="spellEnd"/>
+      <w:r>
+        <w:t>()</w:t>
       </w:r>
       <w:r>
         <w:t xml:space="preserve"> == 1 %}</w:t>
@@ -1342,22 +2174,54 @@
         <w:t xml:space="preserve">Upon </w:t>
       </w:r>
       <w:r>
-        <w:t xml:space="preserve">{{my_or_our}} </w:t>
-      </w:r>
-      <w:r>
-        <w:t>{{death_or_deaths}}</w:t>
+        <w:t>{{</w:t>
+      </w:r>
+      <w:proofErr w:type="spellStart"/>
+      <w:r>
+        <w:t>my_or_our</w:t>
+      </w:r>
+      <w:proofErr w:type="spellEnd"/>
+      <w:r>
+        <w:t xml:space="preserve">}} </w:t>
+      </w:r>
+      <w:r>
+        <w:t>{{</w:t>
+      </w:r>
+      <w:proofErr w:type="spellStart"/>
+      <w:r>
+        <w:t>death_or_deaths</w:t>
+      </w:r>
+      <w:proofErr w:type="spellEnd"/>
+      <w:r>
+        <w:t>}}</w:t>
       </w:r>
       <w:r>
         <w:t xml:space="preserve">, </w:t>
       </w:r>
       <w:r>
-        <w:t>{{i_or_we}}</w:t>
+        <w:t>{{</w:t>
+      </w:r>
+      <w:proofErr w:type="spellStart"/>
+      <w:r>
+        <w:t>i_or_we</w:t>
+      </w:r>
+      <w:proofErr w:type="spellEnd"/>
+      <w:r>
+        <w:t>}}</w:t>
       </w:r>
       <w:r>
         <w:t xml:space="preserve"> transfer </w:t>
       </w:r>
       <w:r>
-        <w:t xml:space="preserve">{{my_or_our}} </w:t>
+        <w:t>{{</w:t>
+      </w:r>
+      <w:proofErr w:type="spellStart"/>
+      <w:r>
+        <w:t>my_or_our</w:t>
+      </w:r>
+      <w:proofErr w:type="spellEnd"/>
+      <w:r>
+        <w:t xml:space="preserve">}} </w:t>
       </w:r>
       <w:r>
         <w:t>interest in the above described property to the beneficiary designated above.</w:t>
@@ -1369,28 +2233,68 @@
         <w:t xml:space="preserve">Upon </w:t>
       </w:r>
       <w:r>
-        <w:t xml:space="preserve">{{my_or_our}} </w:t>
-      </w:r>
-      <w:r>
-        <w:t>{{death_or_deaths}}</w:t>
+        <w:t>{{</w:t>
+      </w:r>
+      <w:proofErr w:type="spellStart"/>
+      <w:r>
+        <w:t>my_or_our</w:t>
+      </w:r>
+      <w:proofErr w:type="spellEnd"/>
+      <w:r>
+        <w:t xml:space="preserve">}} </w:t>
+      </w:r>
+      <w:r>
+        <w:t>{{</w:t>
+      </w:r>
+      <w:proofErr w:type="spellStart"/>
+      <w:r>
+        <w:t>death_or_deaths</w:t>
+      </w:r>
+      <w:proofErr w:type="spellEnd"/>
+      <w:r>
+        <w:t>}}</w:t>
       </w:r>
       <w:r>
         <w:t xml:space="preserve">, </w:t>
       </w:r>
       <w:r>
-        <w:t>{{i_or_we}}</w:t>
+        <w:t>{{</w:t>
+      </w:r>
+      <w:proofErr w:type="spellStart"/>
+      <w:r>
+        <w:t>i_or_we</w:t>
+      </w:r>
+      <w:proofErr w:type="spellEnd"/>
+      <w:r>
+        <w:t>}}</w:t>
       </w:r>
       <w:r>
         <w:t xml:space="preserve"> transfer </w:t>
       </w:r>
       <w:r>
-        <w:t xml:space="preserve">{{my_or_our}} </w:t>
+        <w:t>{{</w:t>
+      </w:r>
+      <w:proofErr w:type="spellStart"/>
+      <w:r>
+        <w:t>my_or_our</w:t>
+      </w:r>
+      <w:proofErr w:type="spellEnd"/>
+      <w:r>
+        <w:t xml:space="preserve">}} </w:t>
       </w:r>
       <w:r>
         <w:t xml:space="preserve">interest in the above described property to the beneficiaries designated above as </w:t>
       </w:r>
       <w:r>
-        <w:t>{{tenancy_type}}</w:t>
+        <w:t>{{</w:t>
+      </w:r>
+      <w:proofErr w:type="spellStart"/>
+      <w:r>
+        <w:t>tenancy_type</w:t>
+      </w:r>
+      <w:proofErr w:type="spellEnd"/>
+      <w:r>
+        <w:t>}}</w:t>
       </w:r>
       <w:r>
         <w:t>.</w:t>
@@ -1747,22 +2651,70 @@
         </mc:AlternateContent>
       </w:r>
       <w:r>
-        <w:t xml:space="preserve">This instrument revokes any and all prior transfer on death instruments made by the above mentioned owner for the above mentioned residential real estate. Before </w:t>
-      </w:r>
-      <w:r>
-        <w:t>{{my_or_our}}</w:t>
+        <w:t xml:space="preserve">This instrument revokes </w:t>
+      </w:r>
+      <w:proofErr w:type="gramStart"/>
+      <w:r>
+        <w:t>any and all</w:t>
+      </w:r>
+      <w:proofErr w:type="gramEnd"/>
+      <w:r>
+        <w:t xml:space="preserve"> prior transfer on death instruments made by the </w:t>
+      </w:r>
+      <w:proofErr w:type="gramStart"/>
+      <w:r>
+        <w:t>above mentioned</w:t>
+      </w:r>
+      <w:proofErr w:type="gramEnd"/>
+      <w:r>
+        <w:t xml:space="preserve"> owner for the </w:t>
+      </w:r>
+      <w:proofErr w:type="gramStart"/>
+      <w:r>
+        <w:t>above mentioned</w:t>
+      </w:r>
+      <w:proofErr w:type="gramEnd"/>
+      <w:r>
+        <w:t xml:space="preserve"> real estate. Before </w:t>
+      </w:r>
+      <w:r>
+        <w:t>{{</w:t>
+      </w:r>
+      <w:proofErr w:type="spellStart"/>
+      <w:r>
+        <w:t>my_or_our</w:t>
+      </w:r>
+      <w:proofErr w:type="spellEnd"/>
+      <w:r>
+        <w:t>}}</w:t>
       </w:r>
       <w:r>
         <w:t xml:space="preserve"> </w:t>
       </w:r>
       <w:r>
-        <w:t>{{death_or_deaths}}</w:t>
+        <w:t>{{</w:t>
+      </w:r>
+      <w:proofErr w:type="spellStart"/>
+      <w:r>
+        <w:t>death_or_deaths</w:t>
+      </w:r>
+      <w:proofErr w:type="spellEnd"/>
+      <w:r>
+        <w:t>}}</w:t>
       </w:r>
       <w:r>
         <w:t xml:space="preserve">, </w:t>
       </w:r>
       <w:r>
-        <w:t>{{i_or_we}}</w:t>
+        <w:t>{{</w:t>
+      </w:r>
+      <w:proofErr w:type="spellStart"/>
+      <w:r>
+        <w:t>i_or_we</w:t>
+      </w:r>
+      <w:proofErr w:type="spellEnd"/>
+      <w:r>
+        <w:t>}}</w:t>
       </w:r>
       <w:r>
         <w:t xml:space="preserve"> have the right to revoke this instrument.</w:t>
@@ -1788,9 +2740,11 @@
       <w:r>
         <w:t>{{</w:t>
       </w:r>
+      <w:proofErr w:type="spellStart"/>
       <w:r>
         <w:t>owners_apostrophe</w:t>
       </w:r>
+      <w:proofErr w:type="spellEnd"/>
       <w:r>
         <w:t>}}</w:t>
       </w:r>
@@ -1798,17 +2752,53 @@
         <w:t xml:space="preserve"> </w:t>
       </w:r>
       <w:r>
-        <w:t>{{death_or_deaths}}</w:t>
-      </w:r>
-      <w:r>
-        <w:t xml:space="preserve"> in the public records in the office of the recorder of the county in which any part of the residential real estate is located.</w:t>
+        <w:t>{{</w:t>
+      </w:r>
+      <w:proofErr w:type="spellStart"/>
+      <w:r>
+        <w:t>death_or_deaths</w:t>
+      </w:r>
+      <w:proofErr w:type="spellEnd"/>
+      <w:r>
+        <w:t>}}</w:t>
+      </w:r>
+      <w:r>
+        <w:t xml:space="preserve"> in the public records in the office of the recorder of the county in which any part of the real estate is </w:t>
+      </w:r>
+      <w:proofErr w:type="gramStart"/>
+      <w:r>
+        <w:t>located.</w:t>
       </w:r>
       <w:r>
         <w:rPr>
           <w:sz w:val="20"/>
           <w:szCs w:val="20"/>
         </w:rPr>
-        <w:t>{% if joint_language == False %}</w:t>
+        <w:t>{</w:t>
+      </w:r>
+      <w:proofErr w:type="gramEnd"/>
+      <w:r>
+        <w:rPr>
+          <w:sz w:val="20"/>
+          <w:szCs w:val="20"/>
+        </w:rPr>
+        <w:t xml:space="preserve">% if </w:t>
+      </w:r>
+      <w:proofErr w:type="spellStart"/>
+      <w:r>
+        <w:rPr>
+          <w:sz w:val="20"/>
+          <w:szCs w:val="20"/>
+        </w:rPr>
+        <w:t>joint_language</w:t>
+      </w:r>
+      <w:proofErr w:type="spellEnd"/>
+      <w:r>
+        <w:rPr>
+          <w:sz w:val="20"/>
+          <w:szCs w:val="20"/>
+        </w:rPr>
+        <w:t xml:space="preserve"> == False %}</w:t>
       </w:r>
     </w:p>
     <w:tbl>
@@ -1920,11 +2910,33 @@
               </w:rPr>
               <w:t>.</w:t>
             </w:r>
-            <w:r>
-              <w:rPr>
-                <w:bCs/>
-              </w:rPr>
-              <w:t>name_full()</w:t>
+            <w:proofErr w:type="spellStart"/>
+            <w:r>
+              <w:rPr>
+                <w:bCs/>
+              </w:rPr>
+              <w:t>name_</w:t>
+            </w:r>
+            <w:proofErr w:type="gramStart"/>
+            <w:r>
+              <w:rPr>
+                <w:bCs/>
+              </w:rPr>
+              <w:t>full</w:t>
+            </w:r>
+            <w:proofErr w:type="spellEnd"/>
+            <w:r>
+              <w:rPr>
+                <w:bCs/>
+              </w:rPr>
+              <w:t>(</w:t>
+            </w:r>
+            <w:proofErr w:type="gramEnd"/>
+            <w:r>
+              <w:rPr>
+                <w:bCs/>
+              </w:rPr>
+              <w:t>)</w:t>
             </w:r>
             <w:r>
               <w:rPr>
@@ -1969,15 +2981,33 @@
       <w:r>
         <w:t xml:space="preserve">{% </w:t>
       </w:r>
+      <w:proofErr w:type="spellStart"/>
       <w:r>
         <w:t>el</w:t>
       </w:r>
       <w:r>
-        <w:t>if joint_language == True</w:t>
+        <w:t>if</w:t>
+      </w:r>
+      <w:proofErr w:type="spellEnd"/>
+      <w:r>
+        <w:t xml:space="preserve"> </w:t>
+      </w:r>
+      <w:proofErr w:type="spellStart"/>
+      <w:r>
+        <w:t>joint_language</w:t>
+      </w:r>
+      <w:proofErr w:type="spellEnd"/>
+      <w:r>
+        <w:t xml:space="preserve"> == </w:t>
+      </w:r>
+      <w:proofErr w:type="gramStart"/>
+      <w:r>
+        <w:t>True</w:t>
       </w:r>
       <w:r>
         <w:t xml:space="preserve"> %}</w:t>
       </w:r>
+      <w:proofErr w:type="gramEnd"/>
     </w:p>
     <w:p>
       <w:pPr>
@@ -2075,8 +3105,21 @@
             <w:r>
               <w:t>{{users[0].</w:t>
             </w:r>
-            <w:r>
-              <w:t>name_full()</w:t>
+            <w:proofErr w:type="spellStart"/>
+            <w:r>
+              <w:t>name_</w:t>
+            </w:r>
+            <w:proofErr w:type="gramStart"/>
+            <w:r>
+              <w:t>full</w:t>
+            </w:r>
+            <w:proofErr w:type="spellEnd"/>
+            <w:r>
+              <w:t>(</w:t>
+            </w:r>
+            <w:proofErr w:type="gramEnd"/>
+            <w:r>
+              <w:t>)</w:t>
             </w:r>
             <w:r>
               <w:t>}</w:t>
@@ -2231,13 +3274,41 @@
               <w:rPr>
                 <w:bCs/>
               </w:rPr>
-              <w:t>{{joint_owner.</w:t>
-            </w:r>
-            <w:r>
-              <w:rPr>
-                <w:bCs/>
-              </w:rPr>
-              <w:t>name_full()</w:t>
+              <w:t>{{</w:t>
+            </w:r>
+            <w:proofErr w:type="spellStart"/>
+            <w:r>
+              <w:rPr>
+                <w:bCs/>
+              </w:rPr>
+              <w:t>joint_owner.</w:t>
+            </w:r>
+            <w:r>
+              <w:rPr>
+                <w:bCs/>
+              </w:rPr>
+              <w:t>name_</w:t>
+            </w:r>
+            <w:proofErr w:type="gramStart"/>
+            <w:r>
+              <w:rPr>
+                <w:bCs/>
+              </w:rPr>
+              <w:t>full</w:t>
+            </w:r>
+            <w:proofErr w:type="spellEnd"/>
+            <w:r>
+              <w:rPr>
+                <w:bCs/>
+              </w:rPr>
+              <w:t>(</w:t>
+            </w:r>
+            <w:proofErr w:type="gramEnd"/>
+            <w:r>
+              <w:rPr>
+                <w:bCs/>
+              </w:rPr>
+              <w:t>)</w:t>
             </w:r>
             <w:r>
               <w:rPr>
@@ -2286,10 +3357,18 @@
         </w:rPr>
       </w:pPr>
       <w:r>
-        <w:t>{% endif %}</w:t>
-      </w:r>
-      <w:r>
-        <w:t xml:space="preserve">{% </w:t>
+        <w:t xml:space="preserve">{% endif </w:t>
+      </w:r>
+      <w:proofErr w:type="gramStart"/>
+      <w:r>
+        <w:t>%}</w:t>
+      </w:r>
+      <w:r>
+        <w:t>{</w:t>
+      </w:r>
+      <w:proofErr w:type="gramEnd"/>
+      <w:r>
+        <w:t xml:space="preserve">% </w:t>
       </w:r>
       <w:r>
         <w:rPr>
@@ -2320,6 +3399,7 @@
       <w:r>
         <w:t xml:space="preserve">{% if </w:t>
       </w:r>
+      <w:proofErr w:type="spellStart"/>
       <w:r>
         <w:t>first_witness</w:t>
       </w:r>
@@ -2329,6 +3409,7 @@
       <w:r>
         <w:t>known</w:t>
       </w:r>
+      <w:proofErr w:type="spellEnd"/>
       <w:r>
         <w:t xml:space="preserve"> </w:t>
       </w:r>
@@ -2368,16 +3449,24 @@
         </w:rPr>
         <w:t>.</w:t>
       </w:r>
+      <w:proofErr w:type="spellStart"/>
       <w:r>
         <w:rPr>
           <w:noProof/>
         </w:rPr>
-        <w:t>name_full()</w:t>
-      </w:r>
+        <w:t>name_full</w:t>
+      </w:r>
+      <w:proofErr w:type="spellEnd"/>
       <w:r>
         <w:rPr>
           <w:noProof/>
         </w:rPr>
+        <w:t>()</w:t>
+      </w:r>
+      <w:r>
+        <w:rPr>
+          <w:noProof/>
+        </w:rPr>
         <w:t>}}{% endif %}</w:t>
       </w:r>
       <w:r>
@@ -2389,8 +3478,13 @@
       <w:r>
         <w:t>users[0].</w:t>
       </w:r>
-      <w:r>
-        <w:t>name_full()</w:t>
+      <w:proofErr w:type="spellStart"/>
+      <w:r>
+        <w:t>name_full</w:t>
+      </w:r>
+      <w:proofErr w:type="spellEnd"/>
+      <w:r>
+        <w:t>()</w:t>
       </w:r>
       <w:r>
         <w:t>}}</w:t>
@@ -2398,8 +3492,13 @@
       <w:r>
         <w:t xml:space="preserve">{% if </w:t>
       </w:r>
-      <w:r>
-        <w:t xml:space="preserve">joint_language </w:t>
+      <w:proofErr w:type="spellStart"/>
+      <w:r>
+        <w:t>joint_language</w:t>
+      </w:r>
+      <w:proofErr w:type="spellEnd"/>
+      <w:r>
+        <w:t xml:space="preserve"> </w:t>
       </w:r>
       <w:r>
         <w:t>=</w:t>
@@ -2410,6 +3509,7 @@
       <w:r>
         <w:t>True %} and {{</w:t>
       </w:r>
+      <w:proofErr w:type="spellStart"/>
       <w:r>
         <w:t>joint_owner</w:t>
       </w:r>
@@ -2417,7 +3517,11 @@
         <w:t>.</w:t>
       </w:r>
       <w:r>
-        <w:t>name_full()</w:t>
+        <w:t>name_full</w:t>
+      </w:r>
+      <w:proofErr w:type="spellEnd"/>
+      <w:r>
+        <w:t>()</w:t>
       </w:r>
       <w:r>
         <w:t>}}</w:t>
@@ -2432,7 +3536,15 @@
         <w:t xml:space="preserve">the </w:t>
       </w:r>
       <w:r>
-        <w:t>{{owner_or_owners}}</w:t>
+        <w:t>{{</w:t>
+      </w:r>
+      <w:proofErr w:type="spellStart"/>
+      <w:r>
+        <w:t>owner_or_owners</w:t>
+      </w:r>
+      <w:proofErr w:type="spellEnd"/>
+      <w:r>
+        <w:t>}}</w:t>
       </w:r>
       <w:r>
         <w:t xml:space="preserve"> of the </w:t>
@@ -2453,13 +3565,37 @@
         <w:t xml:space="preserve">. This instrument was executed as a free and voluntary act by the </w:t>
       </w:r>
       <w:r>
-        <w:t>{{owner_or_owners}}</w:t>
-      </w:r>
-      <w:r>
-        <w:t xml:space="preserve">. At the time of the execution, I believe the </w:t>
-      </w:r>
-      <w:r>
-        <w:t>{{owner_or_owners}}</w:t>
+        <w:t>{{</w:t>
+      </w:r>
+      <w:proofErr w:type="spellStart"/>
+      <w:r>
+        <w:t>owner_or_</w:t>
+      </w:r>
+      <w:proofErr w:type="gramStart"/>
+      <w:r>
+        <w:t>owners</w:t>
+      </w:r>
+      <w:proofErr w:type="spellEnd"/>
+      <w:r>
+        <w:t>}}</w:t>
+      </w:r>
+      <w:r>
+        <w:t>.</w:t>
+      </w:r>
+      <w:proofErr w:type="gramEnd"/>
+      <w:r>
+        <w:t xml:space="preserve"> At the time of the execution, I believe the </w:t>
+      </w:r>
+      <w:r>
+        <w:t>{{</w:t>
+      </w:r>
+      <w:proofErr w:type="spellStart"/>
+      <w:r>
+        <w:t>owner_or_owners</w:t>
+      </w:r>
+      <w:proofErr w:type="spellEnd"/>
+      <w:r>
+        <w:t>}}</w:t>
       </w:r>
       <w:r>
         <w:t xml:space="preserve"> to be of sound mind and memory.</w:t>
@@ -2632,6 +3768,7 @@
             <w:r>
               <w:t xml:space="preserve">{% if </w:t>
             </w:r>
+            <w:proofErr w:type="spellStart"/>
             <w:r>
               <w:t>first_witness</w:t>
             </w:r>
@@ -2639,11 +3776,24 @@
               <w:t>_</w:t>
             </w:r>
             <w:r>
-              <w:t>known == True %}</w:t>
-            </w:r>
-            <w:r>
-              <w:t xml:space="preserve">{% if </w:t>
-            </w:r>
+              <w:t>known</w:t>
+            </w:r>
+            <w:proofErr w:type="spellEnd"/>
+            <w:r>
+              <w:t xml:space="preserve"> == True </w:t>
+            </w:r>
+            <w:proofErr w:type="gramStart"/>
+            <w:r>
+              <w:t>%}</w:t>
+            </w:r>
+            <w:r>
+              <w:t>{</w:t>
+            </w:r>
+            <w:proofErr w:type="gramEnd"/>
+            <w:r>
+              <w:t xml:space="preserve">% if </w:t>
+            </w:r>
+            <w:proofErr w:type="spellStart"/>
             <w:r>
               <w:t>first_witness</w:t>
             </w:r>
@@ -2651,16 +3801,44 @@
               <w:t>_address</w:t>
             </w:r>
             <w:r>
-              <w:t>_known == True %}</w:t>
+              <w:t>_known</w:t>
+            </w:r>
+            <w:proofErr w:type="spellEnd"/>
+            <w:r>
+              <w:t xml:space="preserve"> == True </w:t>
+            </w:r>
+            <w:proofErr w:type="gramStart"/>
+            <w:r>
+              <w:t>%}</w:t>
             </w:r>
             <w:r>
               <w:t>{{</w:t>
             </w:r>
             <w:r>
-              <w:t xml:space="preserve"> witnesses[0]</w:t>
-            </w:r>
-            <w:r>
-              <w:t>.address.line_one(</w:t>
+              <w:t xml:space="preserve"> witnesses</w:t>
+            </w:r>
+            <w:proofErr w:type="gramEnd"/>
+            <w:r>
+              <w:t>[0</w:t>
+            </w:r>
+            <w:proofErr w:type="gramStart"/>
+            <w:r>
+              <w:t>]</w:t>
+            </w:r>
+            <w:r>
+              <w:t>.</w:t>
+            </w:r>
+            <w:proofErr w:type="spellStart"/>
+            <w:r>
+              <w:t>address</w:t>
+            </w:r>
+            <w:proofErr w:type="gramEnd"/>
+            <w:r>
+              <w:t>.line_one</w:t>
+            </w:r>
+            <w:proofErr w:type="spellEnd"/>
+            <w:r>
+              <w:t>(</w:t>
             </w:r>
             <w:r>
               <w:rPr>
@@ -2669,13 +3847,29 @@
               <w:t>bare=True</w:t>
             </w:r>
             <w:r>
-              <w:t>)}}</w:t>
-            </w:r>
-            <w:r>
-              <w:t>{% endif %}</w:t>
-            </w:r>
-            <w:r>
-              <w:t xml:space="preserve"> {% endif %}</w:t>
+              <w:t>)</w:t>
+            </w:r>
+            <w:proofErr w:type="gramStart"/>
+            <w:r>
+              <w:t>}}</w:t>
+            </w:r>
+            <w:r>
+              <w:t>{</w:t>
+            </w:r>
+            <w:proofErr w:type="gramEnd"/>
+            <w:r>
+              <w:t xml:space="preserve">% </w:t>
+            </w:r>
+            <w:proofErr w:type="gramStart"/>
+            <w:r>
+              <w:t>endif %}</w:t>
+            </w:r>
+            <w:r>
+              <w:t xml:space="preserve"> {</w:t>
+            </w:r>
+            <w:proofErr w:type="gramEnd"/>
+            <w:r>
+              <w:t>% endif %}</w:t>
             </w:r>
           </w:p>
         </w:tc>
@@ -2711,6 +3905,7 @@
             <w:r>
               <w:t xml:space="preserve">{% if </w:t>
             </w:r>
+            <w:proofErr w:type="spellStart"/>
             <w:r>
               <w:t>first_witness</w:t>
             </w:r>
@@ -2718,25 +3913,55 @@
               <w:t>_</w:t>
             </w:r>
             <w:r>
-              <w:t>known == True %}</w:t>
+              <w:t>known</w:t>
+            </w:r>
+            <w:proofErr w:type="spellEnd"/>
+            <w:r>
+              <w:t xml:space="preserve"> == True </w:t>
+            </w:r>
+            <w:proofErr w:type="gramStart"/>
+            <w:r>
+              <w:t>%}</w:t>
             </w:r>
             <w:r>
               <w:t>{{</w:t>
             </w:r>
             <w:r>
-              <w:t xml:space="preserve"> witnesses[0]</w:t>
+              <w:t xml:space="preserve"> witnesses</w:t>
+            </w:r>
+            <w:proofErr w:type="gramEnd"/>
+            <w:r>
+              <w:t>[0]</w:t>
             </w:r>
             <w:r>
               <w:t>.</w:t>
             </w:r>
-            <w:r>
-              <w:t>name_full()</w:t>
-            </w:r>
+            <w:proofErr w:type="spellStart"/>
+            <w:r>
+              <w:t>name_</w:t>
+            </w:r>
+            <w:proofErr w:type="gramStart"/>
+            <w:r>
+              <w:t>full</w:t>
+            </w:r>
+            <w:proofErr w:type="spellEnd"/>
+            <w:r>
+              <w:t>(</w:t>
+            </w:r>
+            <w:proofErr w:type="gramEnd"/>
+            <w:r>
+              <w:t>)</w:t>
+            </w:r>
+            <w:proofErr w:type="gramStart"/>
             <w:r>
               <w:t>}}</w:t>
             </w:r>
             <w:r>
-              <w:t>{% endif %}</w:t>
+              <w:t>{</w:t>
+            </w:r>
+            <w:proofErr w:type="gramEnd"/>
+            <w:r>
+              <w:t>% endif %}</w:t>
             </w:r>
           </w:p>
         </w:tc>
@@ -2767,6 +3992,7 @@
             <w:r>
               <w:t xml:space="preserve">{% if </w:t>
             </w:r>
+            <w:proofErr w:type="spellStart"/>
             <w:r>
               <w:t>first_witness</w:t>
             </w:r>
@@ -2774,11 +4000,24 @@
               <w:t>_</w:t>
             </w:r>
             <w:r>
-              <w:t>known == True %}</w:t>
-            </w:r>
-            <w:r>
-              <w:t xml:space="preserve">{% if </w:t>
-            </w:r>
+              <w:t>known</w:t>
+            </w:r>
+            <w:proofErr w:type="spellEnd"/>
+            <w:r>
+              <w:t xml:space="preserve"> == True </w:t>
+            </w:r>
+            <w:proofErr w:type="gramStart"/>
+            <w:r>
+              <w:t>%}</w:t>
+            </w:r>
+            <w:r>
+              <w:t>{</w:t>
+            </w:r>
+            <w:proofErr w:type="gramEnd"/>
+            <w:r>
+              <w:t xml:space="preserve">% if </w:t>
+            </w:r>
+            <w:proofErr w:type="spellStart"/>
             <w:r>
               <w:t>first_witness</w:t>
             </w:r>
@@ -2786,20 +4025,65 @@
               <w:t>_address</w:t>
             </w:r>
             <w:r>
-              <w:t>_known == True %}</w:t>
+              <w:t>_known</w:t>
+            </w:r>
+            <w:proofErr w:type="spellEnd"/>
+            <w:r>
+              <w:t xml:space="preserve"> == True </w:t>
+            </w:r>
+            <w:proofErr w:type="gramStart"/>
+            <w:r>
+              <w:t>%}</w:t>
             </w:r>
             <w:r>
               <w:t>{{</w:t>
             </w:r>
             <w:r>
-              <w:t xml:space="preserve"> witnesses[0]</w:t>
-            </w:r>
-            <w:r>
-              <w:t>.address.line_two()}}</w:t>
-            </w:r>
-            <w:r>
-              <w:t xml:space="preserve">{% endif </w:t>
-            </w:r>
+              <w:t xml:space="preserve"> witnesses</w:t>
+            </w:r>
+            <w:proofErr w:type="gramEnd"/>
+            <w:r>
+              <w:t>[0</w:t>
+            </w:r>
+            <w:proofErr w:type="gramStart"/>
+            <w:r>
+              <w:t>]</w:t>
+            </w:r>
+            <w:r>
+              <w:t>.</w:t>
+            </w:r>
+            <w:proofErr w:type="spellStart"/>
+            <w:r>
+              <w:t>address</w:t>
+            </w:r>
+            <w:proofErr w:type="gramEnd"/>
+            <w:r>
+              <w:t>.line_</w:t>
+            </w:r>
+            <w:proofErr w:type="gramStart"/>
+            <w:r>
+              <w:t>two</w:t>
+            </w:r>
+            <w:proofErr w:type="spellEnd"/>
+            <w:r>
+              <w:t>(</w:t>
+            </w:r>
+            <w:proofErr w:type="gramEnd"/>
+            <w:r>
+              <w:t>)</w:t>
+            </w:r>
+            <w:proofErr w:type="gramStart"/>
+            <w:r>
+              <w:t>}}</w:t>
+            </w:r>
+            <w:r>
+              <w:t>{</w:t>
+            </w:r>
+            <w:proofErr w:type="gramEnd"/>
+            <w:r>
+              <w:t xml:space="preserve">% endif </w:t>
+            </w:r>
+            <w:proofErr w:type="gramStart"/>
             <w:r>
               <w:t>%</w:t>
             </w:r>
@@ -2807,7 +4091,11 @@
               <w:t>}</w:t>
             </w:r>
             <w:r>
-              <w:t>{% endif %}</w:t>
+              <w:t>{</w:t>
+            </w:r>
+            <w:proofErr w:type="gramEnd"/>
+            <w:r>
+              <w:t>% endif %}</w:t>
             </w:r>
           </w:p>
         </w:tc>
@@ -2823,10 +4111,18 @@
     </w:p>
     <w:p>
       <w:r>
-        <w:t>I, {% if second_witness_</w:t>
-      </w:r>
-      <w:r>
-        <w:t>known== False %}</w:t>
+        <w:t xml:space="preserve">I, {% if </w:t>
+      </w:r>
+      <w:proofErr w:type="spellStart"/>
+      <w:r>
+        <w:t>second_witness_</w:t>
+      </w:r>
+      <w:r>
+        <w:t>known</w:t>
+      </w:r>
+      <w:proofErr w:type="spellEnd"/>
+      <w:r>
+        <w:t>== False %}</w:t>
       </w:r>
       <w:r>
         <w:t>____________________</w:t>
@@ -2855,16 +4151,24 @@
         </w:rPr>
         <w:t>.</w:t>
       </w:r>
+      <w:proofErr w:type="spellStart"/>
       <w:r>
         <w:rPr>
           <w:noProof/>
         </w:rPr>
-        <w:t>name_full()</w:t>
-      </w:r>
+        <w:t>name_full</w:t>
+      </w:r>
+      <w:proofErr w:type="spellEnd"/>
       <w:r>
         <w:rPr>
           <w:noProof/>
         </w:rPr>
+        <w:t>()</w:t>
+      </w:r>
+      <w:r>
+        <w:rPr>
+          <w:noProof/>
+        </w:rPr>
         <w:t>}}{% endif %}</w:t>
       </w:r>
       <w:r>
@@ -2876,8 +4180,13 @@
       <w:r>
         <w:t>users[0].</w:t>
       </w:r>
-      <w:r>
-        <w:t>name_full()</w:t>
+      <w:proofErr w:type="spellStart"/>
+      <w:r>
+        <w:t>name_full</w:t>
+      </w:r>
+      <w:proofErr w:type="spellEnd"/>
+      <w:r>
+        <w:t>()</w:t>
       </w:r>
       <w:r>
         <w:t>}}</w:t>
@@ -2885,8 +4194,13 @@
       <w:r>
         <w:t xml:space="preserve">{% if </w:t>
       </w:r>
-      <w:r>
-        <w:t xml:space="preserve">joint_language </w:t>
+      <w:proofErr w:type="spellStart"/>
+      <w:r>
+        <w:t>joint_language</w:t>
+      </w:r>
+      <w:proofErr w:type="spellEnd"/>
+      <w:r>
+        <w:t xml:space="preserve"> </w:t>
       </w:r>
       <w:r>
         <w:t>=</w:t>
@@ -2897,6 +4211,7 @@
       <w:r>
         <w:t>True %} and {{</w:t>
       </w:r>
+      <w:proofErr w:type="spellStart"/>
       <w:r>
         <w:t>joint_owner</w:t>
       </w:r>
@@ -2904,7 +4219,11 @@
         <w:t>.</w:t>
       </w:r>
       <w:r>
-        <w:t>name_full()</w:t>
+        <w:t>name_full</w:t>
+      </w:r>
+      <w:proofErr w:type="spellEnd"/>
+      <w:r>
+        <w:t>()</w:t>
       </w:r>
       <w:r>
         <w:t xml:space="preserve">}}{% endif %}, </w:t>
@@ -2913,7 +4232,15 @@
         <w:t xml:space="preserve">the </w:t>
       </w:r>
       <w:r>
-        <w:t>{{owner_or_owners}}</w:t>
+        <w:t>{{</w:t>
+      </w:r>
+      <w:proofErr w:type="spellStart"/>
+      <w:r>
+        <w:t>owner_or_owners</w:t>
+      </w:r>
+      <w:proofErr w:type="spellEnd"/>
+      <w:r>
+        <w:t>}}</w:t>
       </w:r>
       <w:r>
         <w:t xml:space="preserve"> of the </w:t>
@@ -2925,7 +4252,31 @@
         <w:t xml:space="preserve">, </w:t>
       </w:r>
       <w:r>
-        <w:t>executed this Illinois Transfer on Death Instrument in my presence on _________________. This instrument was executed as a free and voluntary act by the {{owner_or_owners}}. At the time of the execution, I believe the {{owner_or_owners}} to be of sound mind and memory</w:t>
+        <w:t>executed this Illinois Transfer on Death Instrument in my presence on _________________. This instrument was executed as a free and voluntary act by the {{</w:t>
+      </w:r>
+      <w:proofErr w:type="spellStart"/>
+      <w:r>
+        <w:t>owner_or_</w:t>
+      </w:r>
+      <w:proofErr w:type="gramStart"/>
+      <w:r>
+        <w:t>owners</w:t>
+      </w:r>
+      <w:proofErr w:type="spellEnd"/>
+      <w:r>
+        <w:t>}}.</w:t>
+      </w:r>
+      <w:proofErr w:type="gramEnd"/>
+      <w:r>
+        <w:t xml:space="preserve"> At the time of the execution, I believe the {{</w:t>
+      </w:r>
+      <w:proofErr w:type="spellStart"/>
+      <w:r>
+        <w:t>owner_or_owners</w:t>
+      </w:r>
+      <w:proofErr w:type="spellEnd"/>
+      <w:r>
+        <w:t>}} to be of sound mind and memory</w:t>
       </w:r>
       <w:r>
         <w:t>.</w:t>
@@ -3087,14 +4438,31 @@
               <w:contextualSpacing/>
             </w:pPr>
             <w:r>
-              <w:t>{% if second</w:t>
+              <w:t xml:space="preserve">{% if </w:t>
+            </w:r>
+            <w:proofErr w:type="spellStart"/>
+            <w:r>
+              <w:t>second</w:t>
             </w:r>
             <w:r>
               <w:t>_witness_</w:t>
             </w:r>
             <w:r>
-              <w:t xml:space="preserve">known == True %}{% if </w:t>
-            </w:r>
+              <w:t>known</w:t>
+            </w:r>
+            <w:proofErr w:type="spellEnd"/>
+            <w:r>
+              <w:t xml:space="preserve"> == True </w:t>
+            </w:r>
+            <w:proofErr w:type="gramStart"/>
+            <w:r>
+              <w:t>%}{</w:t>
+            </w:r>
+            <w:proofErr w:type="gramEnd"/>
+            <w:r>
+              <w:t xml:space="preserve">% if </w:t>
+            </w:r>
+            <w:proofErr w:type="spellStart"/>
             <w:r>
               <w:t>second</w:t>
             </w:r>
@@ -3102,14 +4470,42 @@
               <w:t>_witness_address</w:t>
             </w:r>
             <w:r>
-              <w:t xml:space="preserve">_known == True %}{{ </w:t>
+              <w:t>_known</w:t>
+            </w:r>
+            <w:proofErr w:type="spellEnd"/>
+            <w:r>
+              <w:t xml:space="preserve"> == True </w:t>
+            </w:r>
+            <w:proofErr w:type="gramStart"/>
+            <w:r>
+              <w:t xml:space="preserve">%}{{ </w:t>
             </w:r>
             <w:r>
               <w:lastRenderedPageBreak/>
-              <w:t>witnesses[1]</w:t>
-            </w:r>
-            <w:r>
-              <w:t>.address.line_one(</w:t>
+              <w:t>witnesses</w:t>
+            </w:r>
+            <w:proofErr w:type="gramEnd"/>
+            <w:r>
+              <w:t>[1</w:t>
+            </w:r>
+            <w:proofErr w:type="gramStart"/>
+            <w:r>
+              <w:t>]</w:t>
+            </w:r>
+            <w:r>
+              <w:t>.</w:t>
+            </w:r>
+            <w:proofErr w:type="spellStart"/>
+            <w:r>
+              <w:t>address</w:t>
+            </w:r>
+            <w:proofErr w:type="gramEnd"/>
+            <w:r>
+              <w:t>.line_one</w:t>
+            </w:r>
+            <w:proofErr w:type="spellEnd"/>
+            <w:r>
+              <w:t>(</w:t>
             </w:r>
             <w:r>
               <w:rPr>
@@ -3118,7 +4514,15 @@
               <w:t>bare=True</w:t>
             </w:r>
             <w:r>
-              <w:t>)}}{% endif %} {% endif %}</w:t>
+              <w:t>)</w:t>
+            </w:r>
+            <w:proofErr w:type="gramStart"/>
+            <w:r>
+              <w:t>}}{</w:t>
+            </w:r>
+            <w:proofErr w:type="gramEnd"/>
+            <w:r>
+              <w:t>% endif %} {% endif %}</w:t>
             </w:r>
           </w:p>
         </w:tc>
@@ -3154,7 +4558,11 @@
               <w:contextualSpacing/>
             </w:pPr>
             <w:r>
-              <w:t>{% if second</w:t>
+              <w:t xml:space="preserve">{% if </w:t>
+            </w:r>
+            <w:proofErr w:type="spellStart"/>
+            <w:r>
+              <w:t>second</w:t>
             </w:r>
             <w:r>
               <w:t>_wi</w:t>
@@ -3163,19 +4571,49 @@
               <w:t>tness_</w:t>
             </w:r>
             <w:r>
-              <w:t xml:space="preserve">known == True %}{{ </w:t>
-            </w:r>
-            <w:r>
-              <w:t>witnesses[1]</w:t>
+              <w:t>known</w:t>
+            </w:r>
+            <w:proofErr w:type="spellEnd"/>
+            <w:r>
+              <w:t xml:space="preserve"> == True </w:t>
+            </w:r>
+            <w:proofErr w:type="gramStart"/>
+            <w:r>
+              <w:t xml:space="preserve">%}{{ </w:t>
+            </w:r>
+            <w:r>
+              <w:t>witnesses</w:t>
+            </w:r>
+            <w:proofErr w:type="gramEnd"/>
+            <w:r>
+              <w:t>[1]</w:t>
             </w:r>
             <w:r>
               <w:t>.</w:t>
             </w:r>
-            <w:r>
-              <w:t>name_full()</w:t>
-            </w:r>
-            <w:r>
-              <w:t>}}{% endif %}</w:t>
+            <w:proofErr w:type="spellStart"/>
+            <w:r>
+              <w:t>name_</w:t>
+            </w:r>
+            <w:proofErr w:type="gramStart"/>
+            <w:r>
+              <w:t>full</w:t>
+            </w:r>
+            <w:proofErr w:type="spellEnd"/>
+            <w:r>
+              <w:t>(</w:t>
+            </w:r>
+            <w:proofErr w:type="gramEnd"/>
+            <w:r>
+              <w:t>)</w:t>
+            </w:r>
+            <w:proofErr w:type="gramStart"/>
+            <w:r>
+              <w:t>}}{</w:t>
+            </w:r>
+            <w:proofErr w:type="gramEnd"/>
+            <w:r>
+              <w:t>% endif %}</w:t>
             </w:r>
           </w:p>
         </w:tc>
@@ -3204,28 +4642,97 @@
               <w:contextualSpacing/>
             </w:pPr>
             <w:r>
-              <w:t>{% if second</w:t>
+              <w:t xml:space="preserve">{% if </w:t>
+            </w:r>
+            <w:proofErr w:type="spellStart"/>
+            <w:r>
+              <w:t>second</w:t>
             </w:r>
             <w:r>
               <w:t>_witness_</w:t>
             </w:r>
             <w:r>
-              <w:t xml:space="preserve">known == True </w:t>
-            </w:r>
-            <w:r>
-              <w:t>%}{% if second</w:t>
+              <w:t>known</w:t>
+            </w:r>
+            <w:proofErr w:type="spellEnd"/>
+            <w:r>
+              <w:t xml:space="preserve"> == True </w:t>
+            </w:r>
+            <w:proofErr w:type="gramStart"/>
+            <w:r>
+              <w:t>%}{</w:t>
+            </w:r>
+            <w:proofErr w:type="gramEnd"/>
+            <w:r>
+              <w:t xml:space="preserve">% if </w:t>
+            </w:r>
+            <w:proofErr w:type="spellStart"/>
+            <w:r>
+              <w:t>second</w:t>
             </w:r>
             <w:r>
               <w:t>_witness_address</w:t>
             </w:r>
             <w:r>
-              <w:t xml:space="preserve">_known == True %}{{ </w:t>
-            </w:r>
-            <w:r>
-              <w:t>witnesses[1]</w:t>
-            </w:r>
-            <w:r>
-              <w:t>.address.line_two()}}{% endif %}{% endif %}</w:t>
+              <w:t>_known</w:t>
+            </w:r>
+            <w:proofErr w:type="spellEnd"/>
+            <w:r>
+              <w:t xml:space="preserve"> == True </w:t>
+            </w:r>
+            <w:proofErr w:type="gramStart"/>
+            <w:r>
+              <w:t xml:space="preserve">%}{{ </w:t>
+            </w:r>
+            <w:r>
+              <w:t>witnesses</w:t>
+            </w:r>
+            <w:proofErr w:type="gramEnd"/>
+            <w:r>
+              <w:t>[1</w:t>
+            </w:r>
+            <w:proofErr w:type="gramStart"/>
+            <w:r>
+              <w:t>]</w:t>
+            </w:r>
+            <w:r>
+              <w:t>.</w:t>
+            </w:r>
+            <w:proofErr w:type="spellStart"/>
+            <w:r>
+              <w:t>address</w:t>
+            </w:r>
+            <w:proofErr w:type="gramEnd"/>
+            <w:r>
+              <w:t>.line_</w:t>
+            </w:r>
+            <w:proofErr w:type="gramStart"/>
+            <w:r>
+              <w:t>two</w:t>
+            </w:r>
+            <w:proofErr w:type="spellEnd"/>
+            <w:r>
+              <w:t>(</w:t>
+            </w:r>
+            <w:proofErr w:type="gramEnd"/>
+            <w:r>
+              <w:t>)</w:t>
+            </w:r>
+            <w:proofErr w:type="gramStart"/>
+            <w:r>
+              <w:t>}}{</w:t>
+            </w:r>
+            <w:proofErr w:type="gramEnd"/>
+            <w:r>
+              <w:t xml:space="preserve">% endif </w:t>
+            </w:r>
+            <w:proofErr w:type="gramStart"/>
+            <w:r>
+              <w:t>%}{</w:t>
+            </w:r>
+            <w:proofErr w:type="gramEnd"/>
+            <w:r>
+              <w:t>% endif %}</w:t>
             </w:r>
           </w:p>
         </w:tc>
@@ -3295,16 +4802,24 @@
         </w:rPr>
         <w:t>users[0].</w:t>
       </w:r>
+      <w:proofErr w:type="spellStart"/>
       <w:r>
         <w:rPr>
           <w:bCs/>
         </w:rPr>
-        <w:t>name_full()</w:t>
-      </w:r>
+        <w:t>name_full</w:t>
+      </w:r>
+      <w:proofErr w:type="spellEnd"/>
       <w:r>
         <w:rPr>
           <w:bCs/>
         </w:rPr>
+        <w:t>()</w:t>
+      </w:r>
+      <w:r>
+        <w:rPr>
+          <w:bCs/>
+        </w:rPr>
         <w:t>}}</w:t>
       </w:r>
       <w:r>
@@ -3316,8 +4831,13 @@
       <w:r>
         <w:t xml:space="preserve">% if </w:t>
       </w:r>
-      <w:r>
-        <w:t>joint_language =</w:t>
+      <w:proofErr w:type="spellStart"/>
+      <w:r>
+        <w:t>joint_language</w:t>
+      </w:r>
+      <w:proofErr w:type="spellEnd"/>
+      <w:r>
+        <w:t xml:space="preserve"> =</w:t>
       </w:r>
       <w:r>
         <w:t>=</w:t>
@@ -3328,6 +4848,7 @@
       <w:r>
         <w:t>True %} and {{</w:t>
       </w:r>
+      <w:proofErr w:type="spellStart"/>
       <w:r>
         <w:t>joint_owner</w:t>
       </w:r>
@@ -3335,7 +4856,11 @@
         <w:t>.</w:t>
       </w:r>
       <w:r>
-        <w:t>name_full()</w:t>
+        <w:t>name_full</w:t>
+      </w:r>
+      <w:proofErr w:type="spellEnd"/>
+      <w:r>
+        <w:t>()</w:t>
       </w:r>
       <w:r>
         <w:t>}}{% endif %}</w:t>
@@ -3347,7 +4872,15 @@
         <w:t xml:space="preserve"> known to me to be the same </w:t>
       </w:r>
       <w:r>
-        <w:t>{{person_or_persons}}</w:t>
+        <w:t>{{</w:t>
+      </w:r>
+      <w:proofErr w:type="spellStart"/>
+      <w:r>
+        <w:t>person_or_persons</w:t>
+      </w:r>
+      <w:proofErr w:type="spellEnd"/>
+      <w:r>
+        <w:t>}}</w:t>
       </w:r>
       <w:r>
         <w:t xml:space="preserve"> whose </w:t>
@@ -3355,9 +4888,11 @@
       <w:r>
         <w:t>{{</w:t>
       </w:r>
+      <w:proofErr w:type="spellStart"/>
       <w:r>
         <w:t>name_is_or_names_are</w:t>
       </w:r>
+      <w:proofErr w:type="spellEnd"/>
       <w:r>
         <w:t>}}</w:t>
       </w:r>
@@ -3365,19 +4900,32 @@
         <w:t xml:space="preserve"> subscribed as the </w:t>
       </w:r>
       <w:r>
-        <w:t>{{owner_or_owners}}</w:t>
-      </w:r>
-      <w:r>
-        <w:t xml:space="preserve"> of the residential real estate, appea</w:t>
+        <w:t>{{</w:t>
+      </w:r>
+      <w:proofErr w:type="spellStart"/>
+      <w:r>
+        <w:t>owner_or_owners</w:t>
+      </w:r>
+      <w:proofErr w:type="spellEnd"/>
+      <w:r>
+        <w:t>}}</w:t>
+      </w:r>
+      <w:r>
+        <w:t xml:space="preserve"> of the real estate, appea</w:t>
       </w:r>
       <w:r>
         <w:t xml:space="preserve">red before me and the witnesses {% if </w:t>
       </w:r>
+      <w:proofErr w:type="spellStart"/>
       <w:r>
         <w:t>second_witness_</w:t>
       </w:r>
       <w:r>
-        <w:t xml:space="preserve">known == True </w:t>
+        <w:t>known</w:t>
+      </w:r>
+      <w:proofErr w:type="spellEnd"/>
+      <w:r>
+        <w:t xml:space="preserve"> == True </w:t>
       </w:r>
       <w:r>
         <w:t>%}{{</w:t>
@@ -3391,8 +4939,13 @@
       <w:r>
         <w:t>.</w:t>
       </w:r>
-      <w:r>
-        <w:t>name_full()</w:t>
+      <w:proofErr w:type="spellStart"/>
+      <w:r>
+        <w:t>name_full</w:t>
+      </w:r>
+      <w:proofErr w:type="spellEnd"/>
+      <w:r>
+        <w:t>()</w:t>
       </w:r>
       <w:r>
         <w:t xml:space="preserve">}} and </w:t>
@@ -3409,8 +4962,13 @@
       <w:r>
         <w:t>.</w:t>
       </w:r>
-      <w:r>
-        <w:t>name_full()</w:t>
+      <w:proofErr w:type="spellStart"/>
+      <w:r>
+        <w:t>name_full</w:t>
+      </w:r>
+      <w:proofErr w:type="spellEnd"/>
+      <w:r>
+        <w:t>()</w:t>
       </w:r>
       <w:r>
         <w:t xml:space="preserve">}}{% else %} </w:t>
@@ -3424,8 +4982,13 @@
       <w:r>
         <w:t>.</w:t>
       </w:r>
-      <w:r>
-        <w:t>name_full()</w:t>
+      <w:proofErr w:type="spellStart"/>
+      <w:r>
+        <w:t>name_full</w:t>
+      </w:r>
+      <w:proofErr w:type="spellEnd"/>
+      <w:r>
+        <w:t>()</w:t>
       </w:r>
       <w:r>
         <w:t>}}</w:t>
@@ -3440,7 +5003,15 @@
         <w:t xml:space="preserve">in person and acknowledged signing the instrument as the free and voluntary act of the </w:t>
       </w:r>
       <w:r>
-        <w:t>{{owner_or_owners}}</w:t>
+        <w:t>{{</w:t>
+      </w:r>
+      <w:proofErr w:type="spellStart"/>
+      <w:r>
+        <w:t>owner_or_owners</w:t>
+      </w:r>
+      <w:proofErr w:type="spellEnd"/>
+      <w:r>
+        <w:t>}}</w:t>
       </w:r>
       <w:r>
         <w:t xml:space="preserve"> who was acting of sound mind and memory for the uses and purposes therein set forth. </w:t>
@@ -3492,8 +5063,13 @@
       <w:r>
         <w:t>users[0].</w:t>
       </w:r>
-      <w:r>
-        <w:t>name_full()</w:t>
+      <w:proofErr w:type="spellStart"/>
+      <w:r>
+        <w:t>name_full</w:t>
+      </w:r>
+      <w:proofErr w:type="spellEnd"/>
+      <w:r>
+        <w:t>()</w:t>
       </w:r>
       <w:r>
         <w:t>}}</w:t>
@@ -3501,8 +5077,13 @@
       <w:r>
         <w:t xml:space="preserve">{% if </w:t>
       </w:r>
-      <w:r>
-        <w:t>joint_language =</w:t>
+      <w:proofErr w:type="spellStart"/>
+      <w:r>
+        <w:t>joint_language</w:t>
+      </w:r>
+      <w:proofErr w:type="spellEnd"/>
+      <w:r>
+        <w:t xml:space="preserve"> =</w:t>
       </w:r>
       <w:r>
         <w:t>=</w:t>
@@ -3511,10 +5092,18 @@
         <w:t xml:space="preserve"> </w:t>
       </w:r>
       <w:r>
-        <w:t>True %} and {{joint_owner.</w:t>
-      </w:r>
-      <w:r>
-        <w:t>name_full()</w:t>
+        <w:t>True %} and {{</w:t>
+      </w:r>
+      <w:proofErr w:type="spellStart"/>
+      <w:r>
+        <w:t>joint_owner.</w:t>
+      </w:r>
+      <w:r>
+        <w:t>name_full</w:t>
+      </w:r>
+      <w:proofErr w:type="spellEnd"/>
+      <w:r>
+        <w:t>()</w:t>
       </w:r>
       <w:r>
         <w:t xml:space="preserve">}}{% endif %}, </w:t>
@@ -3523,7 +5112,15 @@
         <w:t xml:space="preserve">the </w:t>
       </w:r>
       <w:r>
-        <w:t>{{owner_or_owners}}</w:t>
+        <w:t>{{</w:t>
+      </w:r>
+      <w:proofErr w:type="spellStart"/>
+      <w:r>
+        <w:t>owner_or_owners</w:t>
+      </w:r>
+      <w:proofErr w:type="spellEnd"/>
+      <w:r>
+        <w:t>}}</w:t>
       </w:r>
       <w:r>
         <w:t xml:space="preserve"> of the </w:t>
@@ -3553,7 +5150,31 @@
         <w:t xml:space="preserve">instrument was executed as a </w:t>
       </w:r>
       <w:r>
-        <w:t>free and voluntary act by the {{owner_or_owners}}. At the time of the execution, I believe the {{owner_or_owners}} to be of sound mind</w:t>
+        <w:t>free and voluntary act by the {{</w:t>
+      </w:r>
+      <w:proofErr w:type="spellStart"/>
+      <w:r>
+        <w:t>owner_or_</w:t>
+      </w:r>
+      <w:proofErr w:type="gramStart"/>
+      <w:r>
+        <w:t>owners</w:t>
+      </w:r>
+      <w:proofErr w:type="spellEnd"/>
+      <w:r>
+        <w:t>}}.</w:t>
+      </w:r>
+      <w:proofErr w:type="gramEnd"/>
+      <w:r>
+        <w:t xml:space="preserve"> At the time of the execution, I believe the {{</w:t>
+      </w:r>
+      <w:proofErr w:type="spellStart"/>
+      <w:r>
+        <w:t>owner_or_owners</w:t>
+      </w:r>
+      <w:proofErr w:type="spellEnd"/>
+      <w:r>
+        <w:t>}} to be of sound mind</w:t>
       </w:r>
       <w:r>
         <w:t xml:space="preserve"> and memory.</w:t>
@@ -3781,8 +5402,13 @@
       <w:r>
         <w:t>users[0].</w:t>
       </w:r>
-      <w:r>
-        <w:t>name_full()</w:t>
+      <w:proofErr w:type="spellStart"/>
+      <w:r>
+        <w:t>name_full</w:t>
+      </w:r>
+      <w:proofErr w:type="spellEnd"/>
+      <w:r>
+        <w:t>()</w:t>
       </w:r>
       <w:r>
         <w:t>}}</w:t>
@@ -3790,8 +5416,13 @@
       <w:r>
         <w:t xml:space="preserve">{% if </w:t>
       </w:r>
-      <w:r>
-        <w:t>joint_language =</w:t>
+      <w:proofErr w:type="spellStart"/>
+      <w:r>
+        <w:t>joint_language</w:t>
+      </w:r>
+      <w:proofErr w:type="spellEnd"/>
+      <w:r>
+        <w:t xml:space="preserve"> =</w:t>
       </w:r>
       <w:r>
         <w:t>=</w:t>
@@ -3800,10 +5431,18 @@
         <w:t xml:space="preserve"> </w:t>
       </w:r>
       <w:r>
-        <w:t>True %} and {{joint_owner.</w:t>
-      </w:r>
-      <w:r>
-        <w:t>name_full()</w:t>
+        <w:t>True %} and {{</w:t>
+      </w:r>
+      <w:proofErr w:type="spellStart"/>
+      <w:r>
+        <w:t>joint_owner.</w:t>
+      </w:r>
+      <w:r>
+        <w:t>name_full</w:t>
+      </w:r>
+      <w:proofErr w:type="spellEnd"/>
+      <w:r>
+        <w:t>()</w:t>
       </w:r>
       <w:r>
         <w:t xml:space="preserve">}}{% endif %}, </w:t>
@@ -3812,7 +5451,15 @@
         <w:t xml:space="preserve">the </w:t>
       </w:r>
       <w:r>
-        <w:t>{{owner_or_owners}}</w:t>
+        <w:t>{{</w:t>
+      </w:r>
+      <w:proofErr w:type="spellStart"/>
+      <w:r>
+        <w:t>owner_or_owners</w:t>
+      </w:r>
+      <w:proofErr w:type="spellEnd"/>
+      <w:r>
+        <w:t>}}</w:t>
       </w:r>
       <w:r>
         <w:t xml:space="preserve"> of the </w:t>
@@ -3842,7 +5489,31 @@
         <w:t xml:space="preserve">instrument was executed as a </w:t>
       </w:r>
       <w:r>
-        <w:t>free and voluntary act by the {{owner_or_owners}}. At the time of the execution, I believe the {{owner_or_owners}} to be of sound mind</w:t>
+        <w:t>free and voluntary act by the {{</w:t>
+      </w:r>
+      <w:proofErr w:type="spellStart"/>
+      <w:r>
+        <w:t>owner_or_</w:t>
+      </w:r>
+      <w:proofErr w:type="gramStart"/>
+      <w:r>
+        <w:t>owners</w:t>
+      </w:r>
+      <w:proofErr w:type="spellEnd"/>
+      <w:r>
+        <w:t>}}.</w:t>
+      </w:r>
+      <w:proofErr w:type="gramEnd"/>
+      <w:r>
+        <w:t xml:space="preserve"> At the time of the execution, I believe the {{</w:t>
+      </w:r>
+      <w:proofErr w:type="spellStart"/>
+      <w:r>
+        <w:t>owner_or_owners</w:t>
+      </w:r>
+      <w:proofErr w:type="spellEnd"/>
+      <w:r>
+        <w:t>}} to be of sound mind</w:t>
       </w:r>
       <w:r>
         <w:t xml:space="preserve"> and memory.</w:t>
@@ -4107,23 +5778,36 @@
         </w:rPr>
         <w:t>{{users[0].</w:t>
       </w:r>
+      <w:proofErr w:type="spellStart"/>
       <w:r>
         <w:rPr>
           <w:bCs/>
         </w:rPr>
-        <w:t>name_full()</w:t>
-      </w:r>
+        <w:t>name_full</w:t>
+      </w:r>
+      <w:proofErr w:type="spellEnd"/>
       <w:r>
         <w:rPr>
           <w:bCs/>
         </w:rPr>
+        <w:t>()</w:t>
+      </w:r>
+      <w:r>
+        <w:rPr>
+          <w:bCs/>
+        </w:rPr>
         <w:t>}}{</w:t>
       </w:r>
       <w:r>
         <w:t xml:space="preserve">% if </w:t>
       </w:r>
-      <w:r>
-        <w:t xml:space="preserve">joint_language </w:t>
+      <w:proofErr w:type="spellStart"/>
+      <w:r>
+        <w:t>joint_language</w:t>
+      </w:r>
+      <w:proofErr w:type="spellEnd"/>
+      <w:r>
+        <w:t xml:space="preserve"> </w:t>
       </w:r>
       <w:r>
         <w:t>=</w:t>
@@ -4134,6 +5818,7 @@
       <w:r>
         <w:t>True %} and {{</w:t>
       </w:r>
+      <w:proofErr w:type="spellStart"/>
       <w:r>
         <w:t>joint_owner</w:t>
       </w:r>
@@ -4141,7 +5826,11 @@
         <w:t>.</w:t>
       </w:r>
       <w:r>
-        <w:t>name_full()</w:t>
+        <w:t>name_full</w:t>
+      </w:r>
+      <w:proofErr w:type="spellEnd"/>
+      <w:r>
+        <w:t>()</w:t>
       </w:r>
       <w:r>
         <w:t>}}{% endif %}</w:t>
@@ -4150,26 +5839,52 @@
         <w:t>,</w:t>
       </w:r>
       <w:r>
-        <w:t xml:space="preserve"> known to me to be the same {{person_or_persons}} whose {{</w:t>
-      </w:r>
+        <w:t xml:space="preserve"> known to me to be the same {{</w:t>
+      </w:r>
+      <w:proofErr w:type="spellStart"/>
+      <w:r>
+        <w:t>person_or_persons</w:t>
+      </w:r>
+      <w:proofErr w:type="spellEnd"/>
+      <w:r>
+        <w:t>}} whose {{</w:t>
+      </w:r>
+      <w:proofErr w:type="spellStart"/>
       <w:r>
         <w:t>name_is_or_names_are</w:t>
       </w:r>
-      <w:r>
-        <w:t>}} subscribed as the {{owner_or_owners}} of the residential</w:t>
-      </w:r>
-      <w:r>
-        <w:t xml:space="preserve"> real estate, appeared before me and the witnesses and </w:t>
-      </w:r>
-      <w:r>
-        <w:t>in person and acknowledged signing the instrument as the free and voluntary act of the {{owner_or_owners}} who was acting</w:t>
-      </w:r>
-      <w:r>
-        <w:t xml:space="preserve"> </w:t>
+      <w:proofErr w:type="spellEnd"/>
+      <w:r>
+        <w:t>}} subscribed as the {{</w:t>
+      </w:r>
+      <w:proofErr w:type="spellStart"/>
+      <w:r>
+        <w:t>owner_or_owners</w:t>
+      </w:r>
+      <w:proofErr w:type="spellEnd"/>
+      <w:r>
+        <w:t xml:space="preserve">}} of the </w:t>
+      </w:r>
+      <w:r>
+        <w:t xml:space="preserve">real estate, appeared before me and the witnesses and </w:t>
+      </w:r>
+      <w:r>
+        <w:t>in person and acknowledged signing the instrument as the free and voluntary act of the {{</w:t>
+      </w:r>
+      <w:proofErr w:type="spellStart"/>
+      <w:r>
+        <w:t>owner_or_owners</w:t>
+      </w:r>
+      <w:proofErr w:type="spellEnd"/>
+      <w:r>
+        <w:t>}} who was acting</w:t>
+      </w:r>
+      <w:r>
+        <w:t xml:space="preserve"> of sound mind </w:t>
       </w:r>
       <w:r>
         <w:lastRenderedPageBreak/>
-        <w:t xml:space="preserve">of sound mind and memory for the uses and purposes therein set forth. </w:t>
+        <w:t xml:space="preserve">and memory for the uses and purposes therein set forth. </w:t>
       </w:r>
       <w:r>
         <w:t>Signed and sworn to before me this ____ day of _________________, _______.</w:t>
@@ -4198,7 +5913,11 @@
         <w:keepNext/>
       </w:pPr>
       <w:r>
-        <w:t>{% endif %}</w:t>
+        <w:t xml:space="preserve">{% endif </w:t>
+      </w:r>
+      <w:proofErr w:type="gramStart"/>
+      <w:r>
+        <w:t>%}</w:t>
       </w:r>
       <w:r>
         <w:rPr>
@@ -4206,15 +5925,16 @@
           <w:bCs/>
           <w:u w:val="single"/>
         </w:rPr>
-        <w:t>________________________________________</w:t>
-      </w:r>
+        <w:t>_</w:t>
+      </w:r>
+      <w:proofErr w:type="gramEnd"/>
       <w:r>
         <w:rPr>
           <w:b/>
           <w:bCs/>
           <w:u w:val="single"/>
         </w:rPr>
-        <w:t>__________________</w:t>
+        <w:t>_______________________________________</w:t>
       </w:r>
       <w:r>
         <w:rPr>
@@ -4222,6 +5942,14 @@
           <w:bCs/>
           <w:u w:val="single"/>
         </w:rPr>
+        <w:t>__________________</w:t>
+      </w:r>
+      <w:r>
+        <w:rPr>
+          <w:b/>
+          <w:bCs/>
+          <w:u w:val="single"/>
+        </w:rPr>
         <w:t>________________________________</w:t>
       </w:r>
     </w:p>
@@ -4263,21 +5991,23 @@
         </w:rPr>
         <w:t>users[0].</w:t>
       </w:r>
+      <w:proofErr w:type="spellStart"/>
       <w:r>
         <w:rPr>
           <w:bCs/>
           <w:sz w:val="20"/>
           <w:szCs w:val="20"/>
         </w:rPr>
-        <w:t>name_full()</w:t>
-      </w:r>
+        <w:t>name_full</w:t>
+      </w:r>
+      <w:proofErr w:type="spellEnd"/>
       <w:r>
         <w:rPr>
           <w:bCs/>
           <w:sz w:val="20"/>
           <w:szCs w:val="20"/>
         </w:rPr>
-        <w:t>}</w:t>
+        <w:t>()</w:t>
       </w:r>
       <w:r>
         <w:rPr>
@@ -4289,25 +6019,25 @@
       </w:r>
       <w:r>
         <w:rPr>
-          <w:sz w:val="20"/>
-          <w:szCs w:val="20"/>
-        </w:rPr>
-        <w:t>,</w:t>
-      </w:r>
-      <w:r>
-        <w:rPr>
-          <w:sz w:val="20"/>
-          <w:szCs w:val="20"/>
-        </w:rPr>
-        <w:t xml:space="preserve"> </w:t>
-      </w:r>
-      <w:r>
-        <w:rPr>
           <w:bCs/>
           <w:sz w:val="20"/>
           <w:szCs w:val="20"/>
         </w:rPr>
-        <w:t>{{</w:t>
+        <w:t>}</w:t>
+      </w:r>
+      <w:r>
+        <w:rPr>
+          <w:sz w:val="20"/>
+          <w:szCs w:val="20"/>
+        </w:rPr>
+        <w:t>,</w:t>
+      </w:r>
+      <w:r>
+        <w:rPr>
+          <w:sz w:val="20"/>
+          <w:szCs w:val="20"/>
+        </w:rPr>
+        <w:t xml:space="preserve"> </w:t>
       </w:r>
       <w:r>
         <w:rPr>
@@ -4315,7 +6045,7 @@
           <w:sz w:val="20"/>
           <w:szCs w:val="20"/>
         </w:rPr>
-        <w:t>users[0].</w:t>
+        <w:t>{{</w:t>
       </w:r>
       <w:r>
         <w:rPr>
@@ -4323,23 +6053,25 @@
           <w:sz w:val="20"/>
           <w:szCs w:val="20"/>
         </w:rPr>
-        <w:t>address.on_one_line</w:t>
-      </w:r>
+        <w:t>users[0].</w:t>
+      </w:r>
+      <w:proofErr w:type="spellStart"/>
       <w:r>
         <w:rPr>
           <w:bCs/>
           <w:sz w:val="20"/>
           <w:szCs w:val="20"/>
         </w:rPr>
-        <w:t>(</w:t>
-      </w:r>
+        <w:t>address.on_one_line</w:t>
+      </w:r>
+      <w:proofErr w:type="spellEnd"/>
       <w:r>
         <w:rPr>
           <w:bCs/>
           <w:sz w:val="20"/>
           <w:szCs w:val="20"/>
         </w:rPr>
-        <w:t>bare=True</w:t>
+        <w:t>(</w:t>
       </w:r>
       <w:r>
         <w:rPr>
@@ -4347,106 +6079,7 @@
           <w:sz w:val="20"/>
           <w:szCs w:val="20"/>
         </w:rPr>
-        <w:t>)}}</w:t>
-      </w:r>
-      <w:r>
-        <w:rPr>
-          <w:sz w:val="20"/>
-          <w:szCs w:val="20"/>
-        </w:rPr>
-        <w:t xml:space="preserve">{% if </w:t>
-      </w:r>
-      <w:r>
-        <w:rPr>
-          <w:sz w:val="20"/>
-          <w:szCs w:val="20"/>
-        </w:rPr>
-        <w:t>users[0].</w:t>
-      </w:r>
-      <w:r>
-        <w:rPr>
-          <w:sz w:val="20"/>
-          <w:szCs w:val="20"/>
-        </w:rPr>
-        <w:t>include_phone == True %}, {{phone_number_formatted(</w:t>
-      </w:r>
-      <w:r>
-        <w:rPr>
-          <w:sz w:val="20"/>
-          <w:szCs w:val="20"/>
-        </w:rPr>
-        <w:t>users[0].</w:t>
-      </w:r>
-      <w:r>
-        <w:rPr>
-          <w:sz w:val="20"/>
-          <w:szCs w:val="20"/>
-        </w:rPr>
-        <w:t xml:space="preserve">phone_number)}}{% endif %}{% if </w:t>
-      </w:r>
-      <w:r>
-        <w:rPr>
-          <w:sz w:val="20"/>
-          <w:szCs w:val="20"/>
-        </w:rPr>
-        <w:t>users[0].</w:t>
-      </w:r>
-      <w:r>
-        <w:rPr>
-          <w:sz w:val="20"/>
-          <w:szCs w:val="20"/>
-        </w:rPr>
-        <w:t xml:space="preserve">include_email </w:t>
-      </w:r>
-      <w:r>
-        <w:rPr>
-          <w:sz w:val="20"/>
-          <w:szCs w:val="20"/>
-        </w:rPr>
-        <w:t xml:space="preserve">== True </w:t>
-      </w:r>
-      <w:r>
-        <w:rPr>
-          <w:sz w:val="20"/>
-          <w:szCs w:val="20"/>
-        </w:rPr>
-        <w:t>%}, {{</w:t>
-      </w:r>
-      <w:r>
-        <w:rPr>
-          <w:sz w:val="20"/>
-          <w:szCs w:val="20"/>
-        </w:rPr>
-        <w:t>users[0].</w:t>
-      </w:r>
-      <w:r>
-        <w:rPr>
-          <w:sz w:val="20"/>
-          <w:szCs w:val="20"/>
-        </w:rPr>
-        <w:t>email</w:t>
-      </w:r>
-      <w:r>
-        <w:rPr>
-          <w:sz w:val="20"/>
-          <w:szCs w:val="20"/>
-        </w:rPr>
-        <w:t>}}{% endif %}</w:t>
-      </w:r>
-    </w:p>
-    <w:p>
-      <w:pPr>
-        <w:rPr>
-          <w:sz w:val="20"/>
-          <w:szCs w:val="20"/>
-        </w:rPr>
-      </w:pPr>
-      <w:r>
-        <w:rPr>
-          <w:sz w:val="20"/>
-          <w:szCs w:val="20"/>
-        </w:rPr>
-        <w:t>{% if joint_language == True %}</w:t>
+        <w:t>bare=True</w:t>
       </w:r>
       <w:r>
         <w:rPr>
@@ -4454,7 +6087,165 @@
           <w:sz w:val="20"/>
           <w:szCs w:val="20"/>
         </w:rPr>
-        <w:t>{{</w:t>
+        <w:t>)}}</w:t>
+      </w:r>
+      <w:r>
+        <w:rPr>
+          <w:sz w:val="20"/>
+          <w:szCs w:val="20"/>
+        </w:rPr>
+        <w:t xml:space="preserve">{% if </w:t>
+      </w:r>
+      <w:r>
+        <w:rPr>
+          <w:sz w:val="20"/>
+          <w:szCs w:val="20"/>
+        </w:rPr>
+        <w:t>users[0].</w:t>
+      </w:r>
+      <w:proofErr w:type="spellStart"/>
+      <w:r>
+        <w:rPr>
+          <w:sz w:val="20"/>
+          <w:szCs w:val="20"/>
+        </w:rPr>
+        <w:t>include_phone</w:t>
+      </w:r>
+      <w:proofErr w:type="spellEnd"/>
+      <w:r>
+        <w:rPr>
+          <w:sz w:val="20"/>
+          <w:szCs w:val="20"/>
+        </w:rPr>
+        <w:t xml:space="preserve"> == True %}, {{</w:t>
+      </w:r>
+      <w:proofErr w:type="spellStart"/>
+      <w:r>
+        <w:rPr>
+          <w:sz w:val="20"/>
+          <w:szCs w:val="20"/>
+        </w:rPr>
+        <w:t>phone_number_formatted</w:t>
+      </w:r>
+      <w:proofErr w:type="spellEnd"/>
+      <w:r>
+        <w:rPr>
+          <w:sz w:val="20"/>
+          <w:szCs w:val="20"/>
+        </w:rPr>
+        <w:t>(</w:t>
+      </w:r>
+      <w:r>
+        <w:rPr>
+          <w:sz w:val="20"/>
+          <w:szCs w:val="20"/>
+        </w:rPr>
+        <w:t>users[0].</w:t>
+      </w:r>
+      <w:proofErr w:type="spellStart"/>
+      <w:r>
+        <w:rPr>
+          <w:sz w:val="20"/>
+          <w:szCs w:val="20"/>
+        </w:rPr>
+        <w:t>phone_number</w:t>
+      </w:r>
+      <w:proofErr w:type="spellEnd"/>
+      <w:r>
+        <w:rPr>
+          <w:sz w:val="20"/>
+          <w:szCs w:val="20"/>
+        </w:rPr>
+        <w:t xml:space="preserve">)}}{% endif %}{% if </w:t>
+      </w:r>
+      <w:r>
+        <w:rPr>
+          <w:sz w:val="20"/>
+          <w:szCs w:val="20"/>
+        </w:rPr>
+        <w:t>users[0].</w:t>
+      </w:r>
+      <w:proofErr w:type="spellStart"/>
+      <w:r>
+        <w:rPr>
+          <w:sz w:val="20"/>
+          <w:szCs w:val="20"/>
+        </w:rPr>
+        <w:t>include_email</w:t>
+      </w:r>
+      <w:proofErr w:type="spellEnd"/>
+      <w:r>
+        <w:rPr>
+          <w:sz w:val="20"/>
+          <w:szCs w:val="20"/>
+        </w:rPr>
+        <w:t xml:space="preserve"> </w:t>
+      </w:r>
+      <w:r>
+        <w:rPr>
+          <w:sz w:val="20"/>
+          <w:szCs w:val="20"/>
+        </w:rPr>
+        <w:t xml:space="preserve">== True </w:t>
+      </w:r>
+      <w:r>
+        <w:rPr>
+          <w:sz w:val="20"/>
+          <w:szCs w:val="20"/>
+        </w:rPr>
+        <w:t>%}, {{</w:t>
+      </w:r>
+      <w:r>
+        <w:rPr>
+          <w:sz w:val="20"/>
+          <w:szCs w:val="20"/>
+        </w:rPr>
+        <w:t>users[0].</w:t>
+      </w:r>
+      <w:r>
+        <w:rPr>
+          <w:sz w:val="20"/>
+          <w:szCs w:val="20"/>
+        </w:rPr>
+        <w:t>email</w:t>
+      </w:r>
+      <w:r>
+        <w:rPr>
+          <w:sz w:val="20"/>
+          <w:szCs w:val="20"/>
+        </w:rPr>
+        <w:t>}}{% endif %}</w:t>
+      </w:r>
+    </w:p>
+    <w:p>
+      <w:pPr>
+        <w:rPr>
+          <w:sz w:val="20"/>
+          <w:szCs w:val="20"/>
+        </w:rPr>
+      </w:pPr>
+      <w:r>
+        <w:rPr>
+          <w:sz w:val="20"/>
+          <w:szCs w:val="20"/>
+        </w:rPr>
+        <w:t xml:space="preserve">{% if </w:t>
+      </w:r>
+      <w:proofErr w:type="spellStart"/>
+      <w:r>
+        <w:rPr>
+          <w:sz w:val="20"/>
+          <w:szCs w:val="20"/>
+        </w:rPr>
+        <w:t>joint_language</w:t>
+      </w:r>
+      <w:proofErr w:type="spellEnd"/>
+      <w:r>
+        <w:rPr>
+          <w:sz w:val="20"/>
+          <w:szCs w:val="20"/>
+        </w:rPr>
+        <w:t xml:space="preserve"> == True %}</w:t>
       </w:r>
       <w:r>
         <w:rPr>
@@ -4462,15 +6253,16 @@
           <w:sz w:val="20"/>
           <w:szCs w:val="20"/>
         </w:rPr>
-        <w:t>joint_owner</w:t>
-      </w:r>
+        <w:t>{{</w:t>
+      </w:r>
+      <w:proofErr w:type="spellStart"/>
       <w:r>
         <w:rPr>
           <w:bCs/>
           <w:sz w:val="20"/>
           <w:szCs w:val="20"/>
         </w:rPr>
-        <w:t>.</w:t>
+        <w:t>joint_owner</w:t>
       </w:r>
       <w:r>
         <w:rPr>
@@ -4478,7 +6270,7 @@
           <w:sz w:val="20"/>
           <w:szCs w:val="20"/>
         </w:rPr>
-        <w:t>name_full()</w:t>
+        <w:t>.</w:t>
       </w:r>
       <w:r>
         <w:rPr>
@@ -4486,22 +6278,16 @@
           <w:sz w:val="20"/>
           <w:szCs w:val="20"/>
         </w:rPr>
-        <w:t>}}</w:t>
-      </w:r>
+        <w:t>name_full</w:t>
+      </w:r>
+      <w:proofErr w:type="spellEnd"/>
       <w:r>
         <w:rPr>
           <w:bCs/>
           <w:sz w:val="20"/>
           <w:szCs w:val="20"/>
         </w:rPr>
-        <w:t>,</w:t>
-      </w:r>
-      <w:r>
-        <w:rPr>
-          <w:sz w:val="20"/>
-          <w:szCs w:val="20"/>
-        </w:rPr>
-        <w:t xml:space="preserve"> </w:t>
+        <w:t>()</w:t>
       </w:r>
       <w:r>
         <w:rPr>
@@ -4509,7 +6295,7 @@
           <w:sz w:val="20"/>
           <w:szCs w:val="20"/>
         </w:rPr>
-        <w:t>{{</w:t>
+        <w:t>}}</w:t>
       </w:r>
       <w:r>
         <w:rPr>
@@ -4517,7 +6303,14 @@
           <w:sz w:val="20"/>
           <w:szCs w:val="20"/>
         </w:rPr>
-        <w:t>joint_owner</w:t>
+        <w:t>,</w:t>
+      </w:r>
+      <w:r>
+        <w:rPr>
+          <w:sz w:val="20"/>
+          <w:szCs w:val="20"/>
+        </w:rPr>
+        <w:t xml:space="preserve"> </w:t>
       </w:r>
       <w:r>
         <w:rPr>
@@ -4525,70 +6318,148 @@
           <w:sz w:val="20"/>
           <w:szCs w:val="20"/>
         </w:rPr>
-        <w:t>.address.on_one_line(bare=True)}}</w:t>
-      </w:r>
-      <w:r>
-        <w:rPr>
+        <w:t>{{</w:t>
+      </w:r>
+      <w:proofErr w:type="spellStart"/>
+      <w:r>
+        <w:rPr>
+          <w:bCs/>
           <w:sz w:val="20"/>
           <w:szCs w:val="20"/>
         </w:rPr>
-        <w:t xml:space="preserve">{% if </w:t>
-      </w:r>
-      <w:r>
-        <w:rPr>
+        <w:t>joint_owner</w:t>
+      </w:r>
+      <w:r>
+        <w:rPr>
+          <w:bCs/>
           <w:sz w:val="20"/>
           <w:szCs w:val="20"/>
         </w:rPr>
-        <w:t>joint_owner</w:t>
-      </w:r>
-      <w:r>
-        <w:rPr>
+        <w:t>.address.on_one_line</w:t>
+      </w:r>
+      <w:proofErr w:type="spellEnd"/>
+      <w:r>
+        <w:rPr>
+          <w:bCs/>
           <w:sz w:val="20"/>
           <w:szCs w:val="20"/>
         </w:rPr>
-        <w:t>.include_phone == True %}, {{phone_number_formatted(</w:t>
+        <w:t>(bare=True)}}</w:t>
       </w:r>
       <w:r>
         <w:rPr>
           <w:sz w:val="20"/>
           <w:szCs w:val="20"/>
         </w:rPr>
-        <w:t>joint_owner</w:t>
-      </w:r>
+        <w:t xml:space="preserve">{% if </w:t>
+      </w:r>
+      <w:proofErr w:type="spellStart"/>
       <w:r>
         <w:rPr>
           <w:sz w:val="20"/>
           <w:szCs w:val="20"/>
         </w:rPr>
-        <w:t xml:space="preserve">.phone_number)}}{% endif %}{% if </w:t>
+        <w:t>joint_owner</w:t>
       </w:r>
       <w:r>
         <w:rPr>
           <w:sz w:val="20"/>
           <w:szCs w:val="20"/>
         </w:rPr>
-        <w:t>joint_owner</w:t>
-      </w:r>
+        <w:t>.include_phone</w:t>
+      </w:r>
+      <w:proofErr w:type="spellEnd"/>
       <w:r>
         <w:rPr>
           <w:sz w:val="20"/>
           <w:szCs w:val="20"/>
         </w:rPr>
-        <w:t>.include_email == True %}, {{</w:t>
-      </w:r>
+        <w:t xml:space="preserve"> == True %}, {{</w:t>
+      </w:r>
+      <w:proofErr w:type="spellStart"/>
       <w:r>
         <w:rPr>
           <w:sz w:val="20"/>
           <w:szCs w:val="20"/>
         </w:rPr>
-        <w:t>joint_owner</w:t>
-      </w:r>
+        <w:t>phone_number_formatted</w:t>
+      </w:r>
+      <w:proofErr w:type="spellEnd"/>
       <w:r>
         <w:rPr>
           <w:sz w:val="20"/>
           <w:szCs w:val="20"/>
         </w:rPr>
-        <w:t>.email}}{% endif %}{% endif %}</w:t>
+        <w:t>(</w:t>
+      </w:r>
+      <w:proofErr w:type="spellStart"/>
+      <w:r>
+        <w:rPr>
+          <w:sz w:val="20"/>
+          <w:szCs w:val="20"/>
+        </w:rPr>
+        <w:t>joint_owner</w:t>
+      </w:r>
+      <w:r>
+        <w:rPr>
+          <w:sz w:val="20"/>
+          <w:szCs w:val="20"/>
+        </w:rPr>
+        <w:t>.phone_number</w:t>
+      </w:r>
+      <w:proofErr w:type="spellEnd"/>
+      <w:r>
+        <w:rPr>
+          <w:sz w:val="20"/>
+          <w:szCs w:val="20"/>
+        </w:rPr>
+        <w:t xml:space="preserve">)}}{% endif %}{% if </w:t>
+      </w:r>
+      <w:proofErr w:type="spellStart"/>
+      <w:r>
+        <w:rPr>
+          <w:sz w:val="20"/>
+          <w:szCs w:val="20"/>
+        </w:rPr>
+        <w:t>joint_owner</w:t>
+      </w:r>
+      <w:r>
+        <w:rPr>
+          <w:sz w:val="20"/>
+          <w:szCs w:val="20"/>
+        </w:rPr>
+        <w:t>.include_email</w:t>
+      </w:r>
+      <w:proofErr w:type="spellEnd"/>
+      <w:r>
+        <w:rPr>
+          <w:sz w:val="20"/>
+          <w:szCs w:val="20"/>
+        </w:rPr>
+        <w:t xml:space="preserve"> == True %}, {{</w:t>
+      </w:r>
+      <w:proofErr w:type="spellStart"/>
+      <w:r>
+        <w:rPr>
+          <w:sz w:val="20"/>
+          <w:szCs w:val="20"/>
+        </w:rPr>
+        <w:t>joint_owner</w:t>
+      </w:r>
+      <w:r>
+        <w:rPr>
+          <w:sz w:val="20"/>
+          <w:szCs w:val="20"/>
+        </w:rPr>
+        <w:t>.email</w:t>
+      </w:r>
+      <w:proofErr w:type="spellEnd"/>
+      <w:r>
+        <w:rPr>
+          <w:sz w:val="20"/>
+          <w:szCs w:val="20"/>
+        </w:rPr>
+        <w:t>}}{% endif %}{% endif %}</w:t>
       </w:r>
     </w:p>
     <w:p>
@@ -5167,16 +7038,24 @@
         </w:rPr>
         <w:t>users[0].</w:t>
       </w:r>
+      <w:proofErr w:type="spellStart"/>
       <w:r>
         <w:rPr>
           <w:bCs/>
         </w:rPr>
-        <w:t>name_full()</w:t>
-      </w:r>
+        <w:t>name_full</w:t>
+      </w:r>
+      <w:proofErr w:type="spellEnd"/>
       <w:r>
         <w:rPr>
           <w:bCs/>
         </w:rPr>
+        <w:t>()</w:t>
+      </w:r>
+      <w:r>
+        <w:rPr>
+          <w:bCs/>
+        </w:rPr>
         <w:t>}} ({{</w:t>
       </w:r>
       <w:r>
@@ -5185,11 +7064,19 @@
         </w:rPr>
         <w:t>users[0].</w:t>
       </w:r>
+      <w:proofErr w:type="spellStart"/>
       <w:r>
         <w:rPr>
           <w:bCs/>
         </w:rPr>
-        <w:t>marital_status}}</w:t>
+        <w:t>marital_status</w:t>
+      </w:r>
+      <w:proofErr w:type="spellEnd"/>
+      <w:r>
+        <w:rPr>
+          <w:bCs/>
+        </w:rPr>
+        <w:t>}}</w:t>
       </w:r>
       <w:r>
         <w:rPr>
@@ -5214,8 +7101,17 @@
         <w:t>,</w:t>
       </w:r>
       <w:r>
-        <w:t>{% if joint_language == True %} and {{</w:t>
-      </w:r>
+        <w:t xml:space="preserve">{% if </w:t>
+      </w:r>
+      <w:proofErr w:type="spellStart"/>
+      <w:r>
+        <w:t>joint_language</w:t>
+      </w:r>
+      <w:proofErr w:type="spellEnd"/>
+      <w:r>
+        <w:t xml:space="preserve"> == True %} and {{</w:t>
+      </w:r>
+      <w:proofErr w:type="spellStart"/>
       <w:r>
         <w:t>joint_owner</w:t>
       </w:r>
@@ -5223,7 +7119,11 @@
         <w:t>.</w:t>
       </w:r>
       <w:r>
-        <w:t>name_full()</w:t>
+        <w:t>name_full</w:t>
+      </w:r>
+      <w:proofErr w:type="spellEnd"/>
+      <w:r>
+        <w:t>()</w:t>
       </w:r>
       <w:r>
         <w:t>}</w:t>
@@ -5237,12 +7137,14 @@
       <w:r>
         <w:t>({{</w:t>
       </w:r>
+      <w:proofErr w:type="spellStart"/>
       <w:r>
         <w:t>joint_owner</w:t>
       </w:r>
       <w:r>
         <w:t>.marital_status</w:t>
       </w:r>
+      <w:proofErr w:type="spellEnd"/>
       <w:r>
         <w:rPr>
           <w:bCs/>
@@ -5275,7 +7177,15 @@
         <w:t xml:space="preserve"> owning</w:t>
       </w:r>
       <w:r>
-        <w:t>{% if other_owners_check != “sole</w:t>
+        <w:t xml:space="preserve">{% if </w:t>
+      </w:r>
+      <w:proofErr w:type="spellStart"/>
+      <w:r>
+        <w:t>other_owners_check</w:t>
+      </w:r>
+      <w:proofErr w:type="spellEnd"/>
+      <w:r>
+        <w:t xml:space="preserve"> != “sole</w:t>
       </w:r>
       <w:r>
         <w:t>”</w:t>
@@ -5283,9 +7193,11 @@
       <w:r>
         <w:t xml:space="preserve"> %}{% if </w:t>
       </w:r>
+      <w:proofErr w:type="spellStart"/>
       <w:r>
         <w:t>shared_owners_type</w:t>
       </w:r>
+      <w:proofErr w:type="spellEnd"/>
       <w:r>
         <w:t xml:space="preserve"> == “</w:t>
       </w:r>
@@ -5298,9 +7210,11 @@
       <w:r>
         <w:t>{{</w:t>
       </w:r>
+      <w:proofErr w:type="spellStart"/>
       <w:r>
         <w:t>user_common_share</w:t>
       </w:r>
+      <w:proofErr w:type="spellEnd"/>
       <w:r>
         <w:t>}}</w:t>
       </w:r>
@@ -5314,7 +7228,7 @@
         <w:t>share of the{% endif %}{% endif %}</w:t>
       </w:r>
       <w:r>
-        <w:t xml:space="preserve"> residential real estate legally described below:</w:t>
+        <w:t xml:space="preserve"> real estate legally described below:</w:t>
       </w:r>
     </w:p>
     <w:p>
@@ -5327,29 +7241,66 @@
     </w:p>
     <w:p>
       <w:r>
-        <w:t>{{todi_property.description}}</w:t>
+        <w:t>{{</w:t>
+      </w:r>
+      <w:proofErr w:type="spellStart"/>
+      <w:r>
+        <w:t>todi_</w:t>
+      </w:r>
+      <w:proofErr w:type="gramStart"/>
+      <w:r>
+        <w:t>property.description</w:t>
+      </w:r>
+      <w:proofErr w:type="spellEnd"/>
+      <w:proofErr w:type="gramEnd"/>
+      <w:r>
+        <w:t>}}</w:t>
       </w:r>
     </w:p>
     <w:p/>
     <w:p>
       <w:r>
-        <w:t xml:space="preserve">That the street address of the residential real estate is </w:t>
-      </w:r>
-      <w:r>
-        <w:t>{{todi_property</w:t>
-      </w:r>
-      <w:r>
-        <w:t>.on_one_line(</w:t>
+        <w:t xml:space="preserve">That the street address of the real estate is </w:t>
+      </w:r>
+      <w:r>
+        <w:t>{{</w:t>
+      </w:r>
+      <w:proofErr w:type="spellStart"/>
+      <w:r>
+        <w:t>todi_</w:t>
+      </w:r>
+      <w:proofErr w:type="gramStart"/>
+      <w:r>
+        <w:t>property</w:t>
+      </w:r>
+      <w:r>
+        <w:t>.on</w:t>
+      </w:r>
+      <w:proofErr w:type="gramEnd"/>
+      <w:r>
+        <w:t>_one_line</w:t>
+      </w:r>
+      <w:proofErr w:type="spellEnd"/>
+      <w:r>
+        <w:t>(</w:t>
       </w:r>
       <w:r>
         <w:rPr>
           <w:bCs/>
         </w:rPr>
-        <w:t>bare=True</w:t>
+        <w:t>bare=</w:t>
+      </w:r>
+      <w:proofErr w:type="gramStart"/>
+      <w:r>
+        <w:rPr>
+          <w:bCs/>
+        </w:rPr>
+        <w:t>True</w:t>
       </w:r>
       <w:r>
         <w:t>)}}</w:t>
       </w:r>
+      <w:proofErr w:type="gramEnd"/>
       <w:r>
         <w:t xml:space="preserve"> and the property i</w:t>
       </w:r>
@@ -5360,7 +7311,15 @@
         <w:t xml:space="preserve"> number is </w:t>
       </w:r>
       <w:r>
-        <w:t>{{todi_property.pin}}</w:t>
+        <w:t>{{</w:t>
+      </w:r>
+      <w:proofErr w:type="spellStart"/>
+      <w:r>
+        <w:t>todi_property.pin</w:t>
+      </w:r>
+      <w:proofErr w:type="spellEnd"/>
+      <w:r>
+        <w:t>}}</w:t>
       </w:r>
       <w:r>
         <w:t>.</w:t>
@@ -5481,12 +7440,19 @@
             <w:r>
               <w:t>{{</w:t>
             </w:r>
-            <w:r>
-              <w:t>todi_property.</w:t>
+            <w:proofErr w:type="spellStart"/>
+            <w:r>
+              <w:t>todi_</w:t>
+            </w:r>
+            <w:proofErr w:type="gramStart"/>
+            <w:r>
+              <w:t>property.</w:t>
             </w:r>
             <w:r>
               <w:t>county</w:t>
             </w:r>
+            <w:proofErr w:type="spellEnd"/>
+            <w:proofErr w:type="gramEnd"/>
             <w:r>
               <w:t xml:space="preserve"> </w:t>
             </w:r>
@@ -5543,7 +7509,23 @@
                 <w:b/>
                 <w:spacing w:val="-4"/>
               </w:rPr>
-              <w:t>Beneficiary Name,  Relationship to Owner</w:t>
+              <w:t xml:space="preserve">Beneficiary </w:t>
+            </w:r>
+            <w:proofErr w:type="gramStart"/>
+            <w:r>
+              <w:rPr>
+                <w:b/>
+                <w:spacing w:val="-4"/>
+              </w:rPr>
+              <w:t>Name,  Relationship</w:t>
+            </w:r>
+            <w:proofErr w:type="gramEnd"/>
+            <w:r>
+              <w:rPr>
+                <w:b/>
+                <w:spacing w:val="-4"/>
+              </w:rPr>
+              <w:t xml:space="preserve"> to Owner</w:t>
             </w:r>
           </w:p>
         </w:tc>
@@ -5593,8 +7575,13 @@
     </w:tbl>
     <w:p>
       <w:r>
-        <w:t>{% for person in beneficiaries %}</w:t>
-      </w:r>
+        <w:t xml:space="preserve">{% for person in </w:t>
+      </w:r>
+      <w:proofErr w:type="gramStart"/>
+      <w:r>
+        <w:t>beneficiaries %}</w:t>
+      </w:r>
+      <w:proofErr w:type="gramEnd"/>
     </w:p>
     <w:tbl>
       <w:tblPr>
@@ -5717,26 +7704,55 @@
     </w:tbl>
     <w:p>
       <w:r>
-        <w:t>{% endfor %}</w:t>
+        <w:t xml:space="preserve">{% </w:t>
+      </w:r>
+      <w:proofErr w:type="spellStart"/>
+      <w:r>
+        <w:t>endfor</w:t>
+      </w:r>
+      <w:proofErr w:type="spellEnd"/>
+      <w:r>
+        <w:t xml:space="preserve"> %}</w:t>
       </w:r>
       <w:r>
         <w:br w:type="page"/>
       </w:r>
       <w:r>
         <w:lastRenderedPageBreak/>
-        <w:t>In witness whereof, the undersigned beneficiaries hereby accept the transfer of residential real estate under the transfer on death instrument this _______ day of ___________, ______.</w:t>
-      </w:r>
-      <w:r>
-        <w:t>{% for person in beneficiaries %}</w:t>
-      </w:r>
-      <w:r>
-        <w:t xml:space="preserve">{% if </w:t>
+        <w:t>In witness whereof, the undersigned beneficiaries hereby accept the transfer of real estate under the transfer on death instrument this _______ day of ___________, _____</w:t>
+      </w:r>
+      <w:proofErr w:type="gramStart"/>
+      <w:r>
+        <w:t>_.</w:t>
+      </w:r>
+      <w:r>
+        <w:t>{</w:t>
+      </w:r>
+      <w:proofErr w:type="gramEnd"/>
+      <w:r>
+        <w:t xml:space="preserve">% for person in beneficiaries </w:t>
+      </w:r>
+      <w:proofErr w:type="gramStart"/>
+      <w:r>
+        <w:t>%}</w:t>
+      </w:r>
+      <w:r>
+        <w:t>{</w:t>
+      </w:r>
+      <w:proofErr w:type="gramEnd"/>
+      <w:r>
+        <w:t xml:space="preserve">% if </w:t>
       </w:r>
       <w:r>
         <w:t>(</w:t>
       </w:r>
-      <w:r>
-        <w:t>loop.index0</w:t>
+      <w:proofErr w:type="gramStart"/>
+      <w:r>
+        <w:t>loop.index</w:t>
+      </w:r>
+      <w:proofErr w:type="gramEnd"/>
+      <w:r>
+        <w:t>0</w:t>
       </w:r>
       <w:r>
         <w:t xml:space="preserve"> % 2</w:t>
@@ -5923,8 +7939,26 @@
     </w:tbl>
     <w:p>
       <w:r>
-        <w:t>{% endif %}{% endfor %}</w:t>
-      </w:r>
+        <w:t xml:space="preserve">{% endif </w:t>
+      </w:r>
+      <w:proofErr w:type="gramStart"/>
+      <w:r>
+        <w:t>%}{</w:t>
+      </w:r>
+      <w:proofErr w:type="gramEnd"/>
+      <w:r>
+        <w:t xml:space="preserve">% </w:t>
+      </w:r>
+      <w:proofErr w:type="spellStart"/>
+      <w:proofErr w:type="gramStart"/>
+      <w:r>
+        <w:t>endfor</w:t>
+      </w:r>
+      <w:proofErr w:type="spellEnd"/>
+      <w:r>
+        <w:t xml:space="preserve"> %}</w:t>
+      </w:r>
+      <w:proofErr w:type="gramEnd"/>
     </w:p>
     <w:p>
       <w:r>

</xml_diff>